<commit_message>
Update CV: work phone number, current service, thesis title
Replace the cell number with the work number. Rebuild Service from the
AY26 workload report, split into discipline / department and university /
outreach, with the DEI and curriculum committees closed at 2024. Add
workshop steering and organizing roles. Add Jackson Page-Roth's thesis title.

Co-Authored-By: Claude Sonnet 5.5 <noreply@anthropic.com>
</commit_message>
<xml_diff>
--- a/cv.docx
+++ b/cv.docx
@@ -69,7 +69,7 @@
           <w:szCs w:val="24"/>
           <w:lang w:val="fr-FR"/>
         </w:rPr>
-        <w:t xml:space="preserve">Tel: +1-617-800-3630</w:t>
+        <w:t xml:space="preserve">Tel: +1-865-974-3718</w:t>
       </w:r>
     </w:p>
     <w:p>
@@ -9278,7 +9278,23 @@
                 <w:sz w:val="24"/>
                 <w:szCs w:val="24"/>
               </w:rPr>
-              <w:t xml:space="preserve">Advisor and master’s Committee Chair, Jackson Page-Roth, Microbiology Graduate Student, University of Tennessee.</w:t>
+              <w:t xml:space="preserve">Advisor and master’s Committee Chair, Jackson Page-Roth, Microbiology Graduate Student, University of Tennessee. Master’s thesis: </w:t>
+            </w:r>
+            <w:r>
+              <w:rPr>
+                <w:i/>
+                <w:iCs/>
+                <w:sz w:val="24"/>
+                <w:szCs w:val="24"/>
+              </w:rPr>
+              <w:t xml:space="preserve">Jekyll and Hyde: Modeling bacterial pathogenicity modulation during algal blooms</w:t>
+            </w:r>
+            <w:r>
+              <w:rPr>
+                <w:sz w:val="24"/>
+                <w:szCs w:val="24"/>
+              </w:rPr>
+              <w:t xml:space="preserve">.</w:t>
             </w:r>
           </w:p>
         </w:tc>
@@ -9831,6 +9847,37 @@
         <w:rPr>
           <w:bCs/>
           <w:i/>
+          <w:sz w:val="24"/>
+          <w:szCs w:val="24"/>
+        </w:rPr>
+      </w:pPr>
+    </w:p>
+    <w:p>
+      <w:pPr>
+        <w:keepNext/>
+        <w:rPr>
+          <w:i/>
+          <w:iCs/>
+          <w:sz w:val="24"/>
+          <w:szCs w:val="24"/>
+        </w:rPr>
+      </w:pPr>
+      <w:r>
+        <w:rPr>
+          <w:i/>
+          <w:iCs/>
+          <w:sz w:val="24"/>
+          <w:szCs w:val="24"/>
+        </w:rPr>
+        <w:t xml:space="preserve">Service to the Discipline</w:t>
+      </w:r>
+    </w:p>
+    <w:p>
+      <w:pPr>
+        <w:keepNext/>
+        <w:rPr>
+          <w:b/>
+          <w:bCs/>
           <w:sz w:val="24"/>
           <w:szCs w:val="24"/>
         </w:rPr>
@@ -10229,7 +10276,7 @@
       <w:tr>
         <w:trPr>
           <w:cantSplit/>
-          <w:trHeight w:val="728"/>
+          <w:trHeight w:val="431"/>
         </w:trPr>
         <w:tc>
           <w:tcPr>
@@ -10247,7 +10294,7 @@
                 <w:sz w:val="24"/>
                 <w:szCs w:val="24"/>
               </w:rPr>
-              <w:t>2020-present</w:t>
+              <w:t xml:space="preserve">2025-2027</w:t>
             </w:r>
           </w:p>
         </w:tc>
@@ -10265,11 +10312,181 @@
             </w:pPr>
             <w:r>
               <w:rPr>
+                <w:sz w:val="24"/>
+                <w:szCs w:val="24"/>
+              </w:rPr>
+              <w:t xml:space="preserve">Steering Committee member and organizer, Ocean Carbon and Biogeochemistry (OCB) workshop: “From single cells to ecosystems: quantifying the role of marine viruses in carbon transport models”</w:t>
+            </w:r>
+          </w:p>
+        </w:tc>
+      </w:tr>
+      <w:tr>
+        <w:trPr>
+          <w:cantSplit/>
+          <w:trHeight w:val="431"/>
+        </w:trPr>
+        <w:tc>
+          <w:tcPr>
+            <w:tcW w:w="1800" w:type="dxa"/>
+          </w:tcPr>
+          <w:p>
+            <w:pPr>
+              <w:rPr>
+                <w:sz w:val="24"/>
+                <w:szCs w:val="24"/>
+              </w:rPr>
+            </w:pPr>
+            <w:r>
+              <w:rPr>
+                <w:sz w:val="24"/>
+                <w:szCs w:val="24"/>
+              </w:rPr>
+              <w:t xml:space="preserve">2025-present</w:t>
+            </w:r>
+          </w:p>
+        </w:tc>
+        <w:tc>
+          <w:tcPr>
+            <w:tcW w:w="7335" w:type="dxa"/>
+          </w:tcPr>
+          <w:p>
+            <w:pPr>
+              <w:rPr>
                 <w:bCs/>
                 <w:sz w:val="24"/>
                 <w:szCs w:val="24"/>
               </w:rPr>
-              <w:t>University of Tennessee, Department of Microbiology, Diversity, Equity, and Inclusivity Committee member</w:t>
+            </w:pPr>
+            <w:r>
+              <w:rPr>
+                <w:sz w:val="24"/>
+                <w:szCs w:val="24"/>
+              </w:rPr>
+              <w:t xml:space="preserve">Co-leader, Community of Scholars on Microbial Interactions and Communities</w:t>
+            </w:r>
+          </w:p>
+        </w:tc>
+      </w:tr>
+      <w:tr>
+        <w:trPr>
+          <w:cantSplit/>
+          <w:trHeight w:val="431"/>
+        </w:trPr>
+        <w:tc>
+          <w:tcPr>
+            <w:tcW w:w="1800" w:type="dxa"/>
+          </w:tcPr>
+          <w:p>
+            <w:pPr>
+              <w:rPr>
+                <w:sz w:val="24"/>
+                <w:szCs w:val="24"/>
+              </w:rPr>
+            </w:pPr>
+            <w:r>
+              <w:rPr>
+                <w:sz w:val="24"/>
+                <w:szCs w:val="24"/>
+              </w:rPr>
+              <w:t xml:space="preserve">2023-2025</w:t>
+            </w:r>
+          </w:p>
+        </w:tc>
+        <w:tc>
+          <w:tcPr>
+            <w:tcW w:w="7335" w:type="dxa"/>
+          </w:tcPr>
+          <w:p>
+            <w:pPr>
+              <w:rPr>
+                <w:bCs/>
+                <w:sz w:val="24"/>
+                <w:szCs w:val="24"/>
+              </w:rPr>
+            </w:pPr>
+            <w:r>
+              <w:rPr>
+                <w:sz w:val="24"/>
+                <w:szCs w:val="24"/>
+              </w:rPr>
+              <w:t xml:space="preserve">Steering Committee member, 7</w:t>
+            </w:r>
+            <w:r>
+              <w:rPr>
+                <w:sz w:val="24"/>
+                <w:szCs w:val="24"/>
+                <w:vertAlign w:val="superscript"/>
+              </w:rPr>
+              <w:t xml:space="preserve">th</w:t>
+            </w:r>
+            <w:r>
+              <w:rPr>
+                <w:sz w:val="24"/>
+                <w:szCs w:val="24"/>
+              </w:rPr>
+              <w:t xml:space="preserve"> Workshop on Trait-Based Approaches to Ocean Life</w:t>
+            </w:r>
+          </w:p>
+        </w:tc>
+      </w:tr>
+      <w:tr>
+        <w:trPr>
+          <w:cantSplit/>
+          <w:trHeight w:val="431"/>
+        </w:trPr>
+        <w:tc>
+          <w:tcPr>
+            <w:tcW w:w="1800" w:type="dxa"/>
+          </w:tcPr>
+          <w:p>
+            <w:pPr>
+              <w:rPr>
+                <w:sz w:val="24"/>
+                <w:szCs w:val="24"/>
+              </w:rPr>
+            </w:pPr>
+            <w:r>
+              <w:rPr>
+                <w:sz w:val="24"/>
+                <w:szCs w:val="24"/>
+              </w:rPr>
+              <w:t xml:space="preserve">2022-2023</w:t>
+            </w:r>
+          </w:p>
+        </w:tc>
+        <w:tc>
+          <w:tcPr>
+            <w:tcW w:w="7335" w:type="dxa"/>
+          </w:tcPr>
+          <w:p>
+            <w:pPr>
+              <w:rPr>
+                <w:bCs/>
+                <w:sz w:val="24"/>
+                <w:szCs w:val="24"/>
+              </w:rPr>
+            </w:pPr>
+            <w:r>
+              <w:rPr>
+                <w:sz w:val="24"/>
+                <w:szCs w:val="24"/>
+              </w:rPr>
+              <w:t xml:space="preserve">Steering Committee member, 6</w:t>
+            </w:r>
+            <w:r>
+              <w:rPr>
+                <w:sz w:val="24"/>
+                <w:szCs w:val="24"/>
+                <w:vertAlign w:val="superscript"/>
+              </w:rPr>
+              <w:t xml:space="preserve">th</w:t>
+            </w:r>
+            <w:r>
+              <w:rPr>
+                <w:sz w:val="24"/>
+                <w:szCs w:val="24"/>
+              </w:rPr>
+              <w:t xml:space="preserve"> Workshop on Trait-Based Approaches to Ocean Life</w:t>
             </w:r>
           </w:p>
         </w:tc>
@@ -10295,7 +10512,7 @@
                 <w:sz w:val="24"/>
                 <w:szCs w:val="24"/>
               </w:rPr>
-              <w:t>2020-present</w:t>
+              <w:t>2022</w:t>
             </w:r>
           </w:p>
         </w:tc>
@@ -10317,7 +10534,552 @@
                 <w:sz w:val="24"/>
                 <w:szCs w:val="24"/>
               </w:rPr>
-              <w:t>University of Tennessee, Department of Microbiology, member of the Committee for Curriculum and Undergraduate Affairs</w:t>
+              <w:t>Lead organizer, 5</w:t>
+            </w:r>
+            <w:r>
+              <w:rPr>
+                <w:bCs/>
+                <w:sz w:val="24"/>
+                <w:szCs w:val="24"/>
+                <w:vertAlign w:val="superscript"/>
+              </w:rPr>
+              <w:t>th</w:t>
+            </w:r>
+            <w:r>
+              <w:rPr>
+                <w:bCs/>
+                <w:sz w:val="24"/>
+                <w:szCs w:val="24"/>
+              </w:rPr>
+              <w:t xml:space="preserve"> Workshop on Trait-Based Approaches to Ocean Life, Knoxville, Tennessee</w:t>
+            </w:r>
+          </w:p>
+        </w:tc>
+      </w:tr>
+      <w:tr>
+        <w:trPr>
+          <w:cantSplit/>
+          <w:trHeight w:val="512"/>
+        </w:trPr>
+        <w:tc>
+          <w:tcPr>
+            <w:tcW w:w="1800" w:type="dxa"/>
+          </w:tcPr>
+          <w:p>
+            <w:pPr>
+              <w:rPr>
+                <w:sz w:val="24"/>
+                <w:szCs w:val="24"/>
+              </w:rPr>
+            </w:pPr>
+            <w:r>
+              <w:rPr>
+                <w:sz w:val="24"/>
+                <w:szCs w:val="24"/>
+              </w:rPr>
+              <w:t>2021</w:t>
+            </w:r>
+          </w:p>
+        </w:tc>
+        <w:tc>
+          <w:tcPr>
+            <w:tcW w:w="7335" w:type="dxa"/>
+          </w:tcPr>
+          <w:p>
+            <w:pPr>
+              <w:rPr>
+                <w:bCs/>
+                <w:sz w:val="24"/>
+                <w:szCs w:val="24"/>
+              </w:rPr>
+            </w:pPr>
+            <w:r>
+              <w:rPr>
+                <w:bCs/>
+                <w:sz w:val="24"/>
+                <w:szCs w:val="24"/>
+              </w:rPr>
+              <w:t>NSF Panelist, Biological Oceanography Postdoctoral Fellowship program</w:t>
+            </w:r>
+          </w:p>
+        </w:tc>
+      </w:tr>
+      <w:tr>
+        <w:trPr>
+          <w:cantSplit/>
+          <w:trHeight w:val="431"/>
+        </w:trPr>
+        <w:tc>
+          <w:tcPr>
+            <w:tcW w:w="1800" w:type="dxa"/>
+          </w:tcPr>
+          <w:p>
+            <w:pPr>
+              <w:rPr>
+                <w:sz w:val="24"/>
+                <w:szCs w:val="24"/>
+              </w:rPr>
+            </w:pPr>
+            <w:r>
+              <w:rPr>
+                <w:sz w:val="24"/>
+                <w:szCs w:val="24"/>
+              </w:rPr>
+              <w:t>2017</w:t>
+            </w:r>
+          </w:p>
+        </w:tc>
+        <w:tc>
+          <w:tcPr>
+            <w:tcW w:w="7335" w:type="dxa"/>
+          </w:tcPr>
+          <w:p>
+            <w:pPr>
+              <w:rPr>
+                <w:bCs/>
+                <w:sz w:val="24"/>
+                <w:szCs w:val="24"/>
+              </w:rPr>
+            </w:pPr>
+            <w:r>
+              <w:rPr>
+                <w:bCs/>
+                <w:sz w:val="24"/>
+                <w:szCs w:val="24"/>
+              </w:rPr>
+              <w:t>NASA panelist, EXPORTS program</w:t>
+            </w:r>
+          </w:p>
+        </w:tc>
+      </w:tr>
+    </w:tbl>
+    <w:p>
+      <w:pPr>
+        <w:rPr>
+          <w:b/>
+          <w:bCs/>
+          <w:sz w:val="24"/>
+          <w:szCs w:val="24"/>
+        </w:rPr>
+      </w:pPr>
+    </w:p>
+    <w:p>
+      <w:pPr>
+        <w:keepNext/>
+        <w:rPr>
+          <w:i/>
+          <w:iCs/>
+          <w:sz w:val="24"/>
+          <w:szCs w:val="24"/>
+        </w:rPr>
+      </w:pPr>
+      <w:r>
+        <w:rPr>
+          <w:i/>
+          <w:iCs/>
+          <w:sz w:val="24"/>
+          <w:szCs w:val="24"/>
+        </w:rPr>
+        <w:t xml:space="preserve">Service to the Department and University</w:t>
+      </w:r>
+    </w:p>
+    <w:p>
+      <w:pPr>
+        <w:keepNext/>
+        <w:rPr>
+          <w:b/>
+          <w:bCs/>
+          <w:sz w:val="24"/>
+          <w:szCs w:val="24"/>
+        </w:rPr>
+      </w:pPr>
+    </w:p>
+    <w:tbl>
+      <w:tblPr>
+        <w:tblW w:w="9135" w:type="dxa"/>
+        <w:tblInd w:w="108" w:type="dxa"/>
+        <w:tblCellMar>
+          <w:top w:w="28" w:type="dxa"/>
+          <w:bottom w:w="28" w:type="dxa"/>
+        </w:tblCellMar>
+        <w:tblLook w:val="04A0" w:firstRow="1" w:lastRow="0" w:firstColumn="1" w:lastColumn="0" w:noHBand="0" w:noVBand="1"/>
+      </w:tblPr>
+      <w:tblGrid>
+        <w:gridCol w:w="1800"/>
+        <w:gridCol w:w="7335"/>
+      </w:tblGrid>
+      <w:tr>
+        <w:trPr>
+          <w:cantSplit/>
+          <w:trHeight w:val="431"/>
+        </w:trPr>
+        <w:tc>
+          <w:tcPr>
+            <w:tcW w:w="1800" w:type="dxa"/>
+          </w:tcPr>
+          <w:p>
+            <w:pPr>
+              <w:rPr>
+                <w:sz w:val="24"/>
+                <w:szCs w:val="24"/>
+              </w:rPr>
+            </w:pPr>
+            <w:r>
+              <w:rPr>
+                <w:sz w:val="24"/>
+                <w:szCs w:val="24"/>
+              </w:rPr>
+              <w:t xml:space="preserve">2026-present</w:t>
+            </w:r>
+          </w:p>
+        </w:tc>
+        <w:tc>
+          <w:tcPr>
+            <w:tcW w:w="7335" w:type="dxa"/>
+          </w:tcPr>
+          <w:p>
+            <w:pPr>
+              <w:rPr>
+                <w:bCs/>
+                <w:sz w:val="24"/>
+                <w:szCs w:val="24"/>
+              </w:rPr>
+            </w:pPr>
+            <w:r>
+              <w:rPr>
+                <w:sz w:val="24"/>
+                <w:szCs w:val="24"/>
+              </w:rPr>
+              <w:t xml:space="preserve">University of Tennessee, Department of Microbiology, Faculty Mentoring Committee for Zach Burcham, committee member</w:t>
+            </w:r>
+          </w:p>
+        </w:tc>
+      </w:tr>
+      <w:tr>
+        <w:trPr>
+          <w:cantSplit/>
+          <w:trHeight w:val="431"/>
+        </w:trPr>
+        <w:tc>
+          <w:tcPr>
+            <w:tcW w:w="1800" w:type="dxa"/>
+          </w:tcPr>
+          <w:p>
+            <w:pPr>
+              <w:rPr>
+                <w:sz w:val="24"/>
+                <w:szCs w:val="24"/>
+              </w:rPr>
+            </w:pPr>
+            <w:r>
+              <w:rPr>
+                <w:sz w:val="24"/>
+                <w:szCs w:val="24"/>
+              </w:rPr>
+              <w:t xml:space="preserve">2025-present</w:t>
+            </w:r>
+          </w:p>
+        </w:tc>
+        <w:tc>
+          <w:tcPr>
+            <w:tcW w:w="7335" w:type="dxa"/>
+          </w:tcPr>
+          <w:p>
+            <w:pPr>
+              <w:rPr>
+                <w:bCs/>
+                <w:sz w:val="24"/>
+                <w:szCs w:val="24"/>
+              </w:rPr>
+            </w:pPr>
+            <w:r>
+              <w:rPr>
+                <w:sz w:val="24"/>
+                <w:szCs w:val="24"/>
+              </w:rPr>
+              <w:t xml:space="preserve">University of Tennessee, Department of Microbiology, Tenure Mentoring Committee for Jenny Heppert, committee member</w:t>
+            </w:r>
+          </w:p>
+        </w:tc>
+      </w:tr>
+      <w:tr>
+        <w:trPr>
+          <w:cantSplit/>
+          <w:trHeight w:val="431"/>
+        </w:trPr>
+        <w:tc>
+          <w:tcPr>
+            <w:tcW w:w="1800" w:type="dxa"/>
+          </w:tcPr>
+          <w:p>
+            <w:pPr>
+              <w:rPr>
+                <w:sz w:val="24"/>
+                <w:szCs w:val="24"/>
+              </w:rPr>
+            </w:pPr>
+            <w:r>
+              <w:rPr>
+                <w:sz w:val="24"/>
+                <w:szCs w:val="24"/>
+              </w:rPr>
+              <w:t xml:space="preserve">2025-present</w:t>
+            </w:r>
+          </w:p>
+        </w:tc>
+        <w:tc>
+          <w:tcPr>
+            <w:tcW w:w="7335" w:type="dxa"/>
+          </w:tcPr>
+          <w:p>
+            <w:pPr>
+              <w:rPr>
+                <w:bCs/>
+                <w:sz w:val="24"/>
+                <w:szCs w:val="24"/>
+              </w:rPr>
+            </w:pPr>
+            <w:r>
+              <w:rPr>
+                <w:sz w:val="24"/>
+                <w:szCs w:val="24"/>
+              </w:rPr>
+              <w:t xml:space="preserve">University of Tennessee, Department of Microbiology, Peer Teaching Committee for Sara Classen, committee member</w:t>
+            </w:r>
+          </w:p>
+        </w:tc>
+      </w:tr>
+      <w:tr>
+        <w:trPr>
+          <w:cantSplit/>
+          <w:trHeight w:val="431"/>
+        </w:trPr>
+        <w:tc>
+          <w:tcPr>
+            <w:tcW w:w="1800" w:type="dxa"/>
+          </w:tcPr>
+          <w:p>
+            <w:pPr>
+              <w:rPr>
+                <w:sz w:val="24"/>
+                <w:szCs w:val="24"/>
+              </w:rPr>
+            </w:pPr>
+            <w:r>
+              <w:rPr>
+                <w:sz w:val="24"/>
+                <w:szCs w:val="24"/>
+              </w:rPr>
+              <w:t xml:space="preserve">2024-present</w:t>
+            </w:r>
+          </w:p>
+        </w:tc>
+        <w:tc>
+          <w:tcPr>
+            <w:tcW w:w="7335" w:type="dxa"/>
+          </w:tcPr>
+          <w:p>
+            <w:pPr>
+              <w:rPr>
+                <w:bCs/>
+                <w:sz w:val="24"/>
+                <w:szCs w:val="24"/>
+              </w:rPr>
+            </w:pPr>
+            <w:r>
+              <w:rPr>
+                <w:sz w:val="24"/>
+                <w:szCs w:val="24"/>
+              </w:rPr>
+              <w:t xml:space="preserve">University of Tennessee, Department of Microbiology, SACSCOC assessment reporting for the Graduate Program, author</w:t>
+            </w:r>
+          </w:p>
+        </w:tc>
+      </w:tr>
+      <w:tr>
+        <w:trPr>
+          <w:cantSplit/>
+          <w:trHeight w:val="431"/>
+        </w:trPr>
+        <w:tc>
+          <w:tcPr>
+            <w:tcW w:w="1800" w:type="dxa"/>
+          </w:tcPr>
+          <w:p>
+            <w:pPr>
+              <w:rPr>
+                <w:sz w:val="24"/>
+                <w:szCs w:val="24"/>
+              </w:rPr>
+            </w:pPr>
+            <w:r>
+              <w:rPr>
+                <w:sz w:val="24"/>
+                <w:szCs w:val="24"/>
+              </w:rPr>
+              <w:t xml:space="preserve">2024-2025</w:t>
+            </w:r>
+          </w:p>
+        </w:tc>
+        <w:tc>
+          <w:tcPr>
+            <w:tcW w:w="7335" w:type="dxa"/>
+          </w:tcPr>
+          <w:p>
+            <w:pPr>
+              <w:rPr>
+                <w:bCs/>
+                <w:sz w:val="24"/>
+                <w:szCs w:val="24"/>
+              </w:rPr>
+            </w:pPr>
+            <w:r>
+              <w:rPr>
+                <w:sz w:val="24"/>
+                <w:szCs w:val="24"/>
+              </w:rPr>
+              <w:t xml:space="preserve">University of Tennessee, Department of Microbiology, Faculty Search Committee chair, Quantitative Microbe-Plant-Environment Interactions Assistant Professor search</w:t>
+            </w:r>
+          </w:p>
+        </w:tc>
+      </w:tr>
+      <w:tr>
+        <w:trPr>
+          <w:cantSplit/>
+          <w:trHeight w:val="431"/>
+        </w:trPr>
+        <w:tc>
+          <w:tcPr>
+            <w:tcW w:w="1800" w:type="dxa"/>
+          </w:tcPr>
+          <w:p>
+            <w:pPr>
+              <w:rPr>
+                <w:sz w:val="24"/>
+                <w:szCs w:val="24"/>
+              </w:rPr>
+            </w:pPr>
+            <w:r>
+              <w:rPr>
+                <w:sz w:val="24"/>
+                <w:szCs w:val="24"/>
+              </w:rPr>
+              <w:t xml:space="preserve">2024-2025</w:t>
+            </w:r>
+          </w:p>
+        </w:tc>
+        <w:tc>
+          <w:tcPr>
+            <w:tcW w:w="7335" w:type="dxa"/>
+          </w:tcPr>
+          <w:p>
+            <w:pPr>
+              <w:rPr>
+                <w:bCs/>
+                <w:sz w:val="24"/>
+                <w:szCs w:val="24"/>
+              </w:rPr>
+            </w:pPr>
+            <w:r>
+              <w:rPr>
+                <w:sz w:val="24"/>
+                <w:szCs w:val="24"/>
+              </w:rPr>
+              <w:t xml:space="preserve">University of Tennessee, Department of Microbiology, Faculty Search Committee member, Microbe-Animal Assistant Professor search</w:t>
+            </w:r>
+          </w:p>
+        </w:tc>
+      </w:tr>
+      <w:tr>
+        <w:trPr>
+          <w:cantSplit/>
+          <w:trHeight w:val="431"/>
+        </w:trPr>
+        <w:tc>
+          <w:tcPr>
+            <w:tcW w:w="1800" w:type="dxa"/>
+          </w:tcPr>
+          <w:p>
+            <w:pPr>
+              <w:rPr>
+                <w:sz w:val="24"/>
+                <w:szCs w:val="24"/>
+              </w:rPr>
+            </w:pPr>
+            <w:r>
+              <w:rPr>
+                <w:sz w:val="24"/>
+                <w:szCs w:val="24"/>
+              </w:rPr>
+              <w:t xml:space="preserve">2023-2024</w:t>
+            </w:r>
+          </w:p>
+        </w:tc>
+        <w:tc>
+          <w:tcPr>
+            <w:tcW w:w="7335" w:type="dxa"/>
+          </w:tcPr>
+          <w:p>
+            <w:pPr>
+              <w:rPr>
+                <w:bCs/>
+                <w:sz w:val="24"/>
+                <w:szCs w:val="24"/>
+              </w:rPr>
+            </w:pPr>
+            <w:r>
+              <w:rPr>
+                <w:sz w:val="24"/>
+                <w:szCs w:val="24"/>
+              </w:rPr>
+              <w:t xml:space="preserve">University of Tennessee, Division of Biology, Task force on beginning math courses for biology majors, member (reviewed math course content and considered new courses)</w:t>
+            </w:r>
+          </w:p>
+        </w:tc>
+      </w:tr>
+      <w:tr>
+        <w:trPr>
+          <w:cantSplit/>
+          <w:trHeight w:val="431"/>
+        </w:trPr>
+        <w:tc>
+          <w:tcPr>
+            <w:tcW w:w="1800" w:type="dxa"/>
+          </w:tcPr>
+          <w:p>
+            <w:pPr>
+              <w:rPr>
+                <w:sz w:val="24"/>
+                <w:szCs w:val="24"/>
+              </w:rPr>
+            </w:pPr>
+            <w:r>
+              <w:rPr>
+                <w:sz w:val="24"/>
+                <w:szCs w:val="24"/>
+              </w:rPr>
+              <w:t xml:space="preserve">2023-2024</w:t>
+            </w:r>
+          </w:p>
+        </w:tc>
+        <w:tc>
+          <w:tcPr>
+            <w:tcW w:w="7335" w:type="dxa"/>
+          </w:tcPr>
+          <w:p>
+            <w:pPr>
+              <w:rPr>
+                <w:bCs/>
+                <w:sz w:val="24"/>
+                <w:szCs w:val="24"/>
+              </w:rPr>
+            </w:pPr>
+            <w:r>
+              <w:rPr>
+                <w:sz w:val="24"/>
+                <w:szCs w:val="24"/>
+              </w:rPr>
+              <w:t xml:space="preserve">University of Tennessee, Department of Microbiology, Faculty Search Committee member, Plant-Microbe Associate/Full Professor search</w:t>
             </w:r>
           </w:p>
         </w:tc>
@@ -10343,7 +11105,7 @@
                 <w:sz w:val="24"/>
                 <w:szCs w:val="24"/>
               </w:rPr>
-              <w:t>2022</w:t>
+              <w:t xml:space="preserve">2020-2024</w:t>
             </w:r>
           </w:p>
         </w:tc>
@@ -10365,24 +11127,7 @@
                 <w:sz w:val="24"/>
                 <w:szCs w:val="24"/>
               </w:rPr>
-              <w:t>Lead organizer, 5</w:t>
-            </w:r>
-            <w:r>
-              <w:rPr>
-                <w:bCs/>
-                <w:sz w:val="24"/>
-                <w:szCs w:val="24"/>
-                <w:vertAlign w:val="superscript"/>
-              </w:rPr>
-              <w:t>th</w:t>
-            </w:r>
-            <w:r>
-              <w:rPr>
-                <w:bCs/>
-                <w:sz w:val="24"/>
-                <w:szCs w:val="24"/>
-              </w:rPr>
-              <w:t xml:space="preserve"> Workshop on Trait-Based Approaches to Ocean Life, Knoxville, Tennessee</w:t>
+              <w:t>University of Tennessee, Department of Microbiology, Diversity, Equity, and Inclusivity Committee member</w:t>
             </w:r>
           </w:p>
         </w:tc>
@@ -10390,7 +11135,7 @@
       <w:tr>
         <w:trPr>
           <w:cantSplit/>
-          <w:trHeight w:val="683"/>
+          <w:trHeight w:val="728"/>
         </w:trPr>
         <w:tc>
           <w:tcPr>
@@ -10408,7 +11153,7 @@
                 <w:sz w:val="24"/>
                 <w:szCs w:val="24"/>
               </w:rPr>
-              <w:t>2021-2022</w:t>
+              <w:t xml:space="preserve">2020-2024</w:t>
             </w:r>
           </w:p>
         </w:tc>
@@ -10430,55 +11175,7 @@
                 <w:sz w:val="24"/>
                 <w:szCs w:val="24"/>
               </w:rPr>
-              <w:t>Choice Health Network (LGBTQ+ community outreach and public health non-profit) Community Impact Committee Member</w:t>
-            </w:r>
-          </w:p>
-        </w:tc>
-      </w:tr>
-      <w:tr>
-        <w:trPr>
-          <w:cantSplit/>
-          <w:trHeight w:val="512"/>
-        </w:trPr>
-        <w:tc>
-          <w:tcPr>
-            <w:tcW w:w="1800" w:type="dxa"/>
-          </w:tcPr>
-          <w:p>
-            <w:pPr>
-              <w:rPr>
-                <w:sz w:val="24"/>
-                <w:szCs w:val="24"/>
-              </w:rPr>
-            </w:pPr>
-            <w:r>
-              <w:rPr>
-                <w:sz w:val="24"/>
-                <w:szCs w:val="24"/>
-              </w:rPr>
-              <w:t>2021</w:t>
-            </w:r>
-          </w:p>
-        </w:tc>
-        <w:tc>
-          <w:tcPr>
-            <w:tcW w:w="7335" w:type="dxa"/>
-          </w:tcPr>
-          <w:p>
-            <w:pPr>
-              <w:rPr>
-                <w:bCs/>
-                <w:sz w:val="24"/>
-                <w:szCs w:val="24"/>
-              </w:rPr>
-            </w:pPr>
-            <w:r>
-              <w:rPr>
-                <w:bCs/>
-                <w:sz w:val="24"/>
-                <w:szCs w:val="24"/>
-              </w:rPr>
-              <w:t>NSF Panelist, Biological Oceanography Postdoctoral Fellowship program</w:t>
+              <w:t>University of Tennessee, Department of Microbiology, member of the Committee for Curriculum and Undergraduate Affairs</w:t>
             </w:r>
           </w:p>
         </w:tc>
@@ -10531,6 +11228,110 @@
           </w:p>
         </w:tc>
       </w:tr>
+    </w:tbl>
+    <w:p>
+      <w:pPr>
+        <w:rPr>
+          <w:b/>
+          <w:bCs/>
+          <w:sz w:val="24"/>
+          <w:szCs w:val="24"/>
+        </w:rPr>
+      </w:pPr>
+    </w:p>
+    <w:p>
+      <w:pPr>
+        <w:keepNext/>
+        <w:rPr>
+          <w:i/>
+          <w:iCs/>
+          <w:sz w:val="24"/>
+          <w:szCs w:val="24"/>
+        </w:rPr>
+      </w:pPr>
+      <w:r>
+        <w:rPr>
+          <w:i/>
+          <w:iCs/>
+          <w:sz w:val="24"/>
+          <w:szCs w:val="24"/>
+        </w:rPr>
+        <w:t xml:space="preserve">Outreach and Community Engagement</w:t>
+      </w:r>
+    </w:p>
+    <w:p>
+      <w:pPr>
+        <w:keepNext/>
+        <w:rPr>
+          <w:b/>
+          <w:bCs/>
+          <w:sz w:val="24"/>
+          <w:szCs w:val="24"/>
+        </w:rPr>
+      </w:pPr>
+    </w:p>
+    <w:tbl>
+      <w:tblPr>
+        <w:tblW w:w="9135" w:type="dxa"/>
+        <w:tblInd w:w="108" w:type="dxa"/>
+        <w:tblCellMar>
+          <w:top w:w="28" w:type="dxa"/>
+          <w:bottom w:w="28" w:type="dxa"/>
+        </w:tblCellMar>
+        <w:tblLook w:val="04A0" w:firstRow="1" w:lastRow="0" w:firstColumn="1" w:lastColumn="0" w:noHBand="0" w:noVBand="1"/>
+      </w:tblPr>
+      <w:tblGrid>
+        <w:gridCol w:w="1800"/>
+        <w:gridCol w:w="7335"/>
+      </w:tblGrid>
+      <w:tr>
+        <w:trPr>
+          <w:cantSplit/>
+          <w:trHeight w:val="683"/>
+        </w:trPr>
+        <w:tc>
+          <w:tcPr>
+            <w:tcW w:w="1800" w:type="dxa"/>
+          </w:tcPr>
+          <w:p>
+            <w:pPr>
+              <w:rPr>
+                <w:sz w:val="24"/>
+                <w:szCs w:val="24"/>
+              </w:rPr>
+            </w:pPr>
+            <w:r>
+              <w:rPr>
+                <w:sz w:val="24"/>
+                <w:szCs w:val="24"/>
+              </w:rPr>
+              <w:t>2021-2022</w:t>
+            </w:r>
+          </w:p>
+        </w:tc>
+        <w:tc>
+          <w:tcPr>
+            <w:tcW w:w="7335" w:type="dxa"/>
+          </w:tcPr>
+          <w:p>
+            <w:pPr>
+              <w:rPr>
+                <w:bCs/>
+                <w:sz w:val="24"/>
+                <w:szCs w:val="24"/>
+              </w:rPr>
+            </w:pPr>
+            <w:r>
+              <w:rPr>
+                <w:bCs/>
+                <w:sz w:val="24"/>
+                <w:szCs w:val="24"/>
+              </w:rPr>
+              <w:t>Choice Health Network (LGBTQ+ community outreach and public health non-profit) Community Impact Committee Member</w:t>
+            </w:r>
+          </w:p>
+        </w:tc>
+      </w:tr>
       <w:tr>
         <w:trPr>
           <w:cantSplit/>
@@ -10575,54 +11376,6 @@
                 <w:szCs w:val="24"/>
               </w:rPr>
               <w:t>Annual Volunteer, Girl Scouts of Greater New York STEM programming events</w:t>
-            </w:r>
-          </w:p>
-        </w:tc>
-      </w:tr>
-      <w:tr>
-        <w:trPr>
-          <w:cantSplit/>
-          <w:trHeight w:val="431"/>
-        </w:trPr>
-        <w:tc>
-          <w:tcPr>
-            <w:tcW w:w="1800" w:type="dxa"/>
-          </w:tcPr>
-          <w:p>
-            <w:pPr>
-              <w:rPr>
-                <w:sz w:val="24"/>
-                <w:szCs w:val="24"/>
-              </w:rPr>
-            </w:pPr>
-            <w:r>
-              <w:rPr>
-                <w:sz w:val="24"/>
-                <w:szCs w:val="24"/>
-              </w:rPr>
-              <w:t>2017</w:t>
-            </w:r>
-          </w:p>
-        </w:tc>
-        <w:tc>
-          <w:tcPr>
-            <w:tcW w:w="7335" w:type="dxa"/>
-          </w:tcPr>
-          <w:p>
-            <w:pPr>
-              <w:rPr>
-                <w:bCs/>
-                <w:sz w:val="24"/>
-                <w:szCs w:val="24"/>
-              </w:rPr>
-            </w:pPr>
-            <w:r>
-              <w:rPr>
-                <w:bCs/>
-                <w:sz w:val="24"/>
-                <w:szCs w:val="24"/>
-              </w:rPr>
-              <w:t>NASA panelist, EXPORTS program</w:t>
             </w:r>
           </w:p>
         </w:tc>

</xml_diff>

<commit_message>
Add preprints, 2026 course, and update committee count from AY26 report
Co-Authored-By: Claude Sonnet 5.5 <noreply@anthropic.com>
</commit_message>
<xml_diff>
--- a/cv.docx
+++ b/cv.docx
@@ -3278,6 +3278,180 @@
           <w:szCs w:val="24"/>
         </w:rPr>
         <w:t xml:space="preserve">, 58(5), 1802-1818.</w:t>
+      </w:r>
+    </w:p>
+    <w:p>
+      <w:pPr>
+        <w:pStyle w:val="ListParagraph"/>
+        <w:autoSpaceDE w:val="0"/>
+        <w:autoSpaceDN w:val="0"/>
+        <w:rPr>
+          <w:color w:val="000000"/>
+          <w:sz w:val="24"/>
+          <w:szCs w:val="24"/>
+        </w:rPr>
+      </w:pPr>
+    </w:p>
+    <w:p>
+      <w:pPr>
+        <w:keepNext/>
+        <w:rPr>
+          <w:b/>
+          <w:bCs/>
+          <w:sz w:val="24"/>
+          <w:szCs w:val="24"/>
+        </w:rPr>
+      </w:pPr>
+      <w:r>
+        <w:rPr>
+          <w:b/>
+          <w:bCs/>
+          <w:sz w:val="24"/>
+          <w:szCs w:val="24"/>
+        </w:rPr>
+        <w:t xml:space="preserve">Preprints</w:t>
+      </w:r>
+    </w:p>
+    <w:p>
+      <w:pPr>
+        <w:keepNext/>
+        <w:rPr>
+          <w:b/>
+          <w:bCs/>
+          <w:sz w:val="24"/>
+          <w:szCs w:val="24"/>
+        </w:rPr>
+      </w:pPr>
+    </w:p>
+    <w:p>
+      <w:pPr>
+        <w:pStyle w:val="ListParagraph"/>
+        <w:numPr>
+          <w:ilvl w:val="0"/>
+          <w:numId w:val="6"/>
+        </w:numPr>
+        <w:autoSpaceDE w:val="0"/>
+        <w:autoSpaceDN w:val="0"/>
+        <w:rPr>
+          <w:color w:val="000000"/>
+          <w:sz w:val="24"/>
+          <w:szCs w:val="24"/>
+        </w:rPr>
+      </w:pPr>
+      <w:r>
+        <w:rPr>
+          <w:b/>
+          <w:bCs/>
+          <w:sz w:val="24"/>
+          <w:szCs w:val="24"/>
+        </w:rPr>
+        <w:t xml:space="preserve">Talmy, D., Carr, E.</w:t>
+      </w:r>
+      <w:r>
+        <w:rPr>
+          <w:sz w:val="24"/>
+          <w:szCs w:val="24"/>
+        </w:rPr>
+        <w:t xml:space="preserve">, Frémont, P., Demory, D., Follett, C.L., Jahn, O., Muratore, D., Beckett, S.J., Lindell, D., Weitz, J.S., Dutkiewicz, S. (2026). Implicit representation of viruses fails to capture impacts of virus-induced mortality in global marine ecosystem models. </w:t>
+      </w:r>
+      <w:r>
+        <w:rPr>
+          <w:i/>
+          <w:iCs/>
+          <w:sz w:val="24"/>
+          <w:szCs w:val="24"/>
+        </w:rPr>
+        <w:t xml:space="preserve">bioRxiv</w:t>
+      </w:r>
+      <w:r>
+        <w:rPr>
+          <w:sz w:val="24"/>
+          <w:szCs w:val="24"/>
+        </w:rPr>
+        <w:t xml:space="preserve">. https://doi.org/10.64898/2026.07.21.739416</w:t>
+      </w:r>
+    </w:p>
+    <w:p>
+      <w:pPr>
+        <w:pStyle w:val="ListParagraph"/>
+        <w:autoSpaceDE w:val="0"/>
+        <w:autoSpaceDN w:val="0"/>
+        <w:rPr>
+          <w:color w:val="000000"/>
+          <w:sz w:val="24"/>
+          <w:szCs w:val="24"/>
+        </w:rPr>
+      </w:pPr>
+    </w:p>
+    <w:p>
+      <w:pPr>
+        <w:pStyle w:val="ListParagraph"/>
+        <w:numPr>
+          <w:ilvl w:val="0"/>
+          <w:numId w:val="6"/>
+        </w:numPr>
+        <w:autoSpaceDE w:val="0"/>
+        <w:autoSpaceDN w:val="0"/>
+        <w:rPr>
+          <w:color w:val="000000"/>
+          <w:sz w:val="24"/>
+          <w:szCs w:val="24"/>
+        </w:rPr>
+      </w:pPr>
+      <w:r>
+        <w:rPr>
+          <w:sz w:val="24"/>
+          <w:szCs w:val="24"/>
+        </w:rPr>
+        <w:t xml:space="preserve">Frémont, P., Beckett, S.J., Muratore, D., Demory, D., </w:t>
+      </w:r>
+      <w:r>
+        <w:rPr>
+          <w:b/>
+          <w:bCs/>
+          <w:sz w:val="24"/>
+          <w:szCs w:val="24"/>
+        </w:rPr>
+        <w:t xml:space="preserve">Carr, E.</w:t>
+      </w:r>
+      <w:r>
+        <w:rPr>
+          <w:sz w:val="24"/>
+          <w:szCs w:val="24"/>
+        </w:rPr>
+        <w:t xml:space="preserve">, Jahn, O., Follett, C.L., </w:t>
+      </w:r>
+      <w:r>
+        <w:rPr>
+          <w:b/>
+          <w:bCs/>
+          <w:sz w:val="24"/>
+          <w:szCs w:val="24"/>
+        </w:rPr>
+        <w:t xml:space="preserve">Talmy, D.</w:t>
+      </w:r>
+      <w:r>
+        <w:rPr>
+          <w:sz w:val="24"/>
+          <w:szCs w:val="24"/>
+        </w:rPr>
+        <w:t xml:space="preserve">, Lindell, D., Weitz, J.S., Dutkiewicz, S. (2026). Viral impacts on plankton standing stocks, primary productivity, and biogeochemistry in a model ocean. </w:t>
+      </w:r>
+      <w:r>
+        <w:rPr>
+          <w:i/>
+          <w:iCs/>
+          <w:sz w:val="24"/>
+          <w:szCs w:val="24"/>
+        </w:rPr>
+        <w:t xml:space="preserve">bioRxiv</w:t>
+      </w:r>
+      <w:r>
+        <w:rPr>
+          <w:sz w:val="24"/>
+          <w:szCs w:val="24"/>
+        </w:rPr>
+        <w:t xml:space="preserve">. https://doi.org/10.64898/2026.05.27.728272</w:t>
       </w:r>
     </w:p>
     <w:p>
@@ -8278,6 +8452,52 @@
                 <w:sz w:val="24"/>
                 <w:szCs w:val="24"/>
               </w:rPr>
+              <w:t xml:space="preserve">2026</w:t>
+            </w:r>
+          </w:p>
+        </w:tc>
+        <w:tc>
+          <w:tcPr>
+            <w:tcW w:w="7797" w:type="dxa"/>
+          </w:tcPr>
+          <w:p>
+            <w:pPr>
+              <w:rPr>
+                <w:sz w:val="24"/>
+                <w:szCs w:val="24"/>
+              </w:rPr>
+            </w:pPr>
+            <w:r>
+              <w:rPr>
+                <w:sz w:val="24"/>
+                <w:szCs w:val="24"/>
+              </w:rPr>
+              <w:t xml:space="preserve">Instructor, Reproducible Data Analysis (9 undergraduate and 5 graduate students), University of Tennessee, Knoxville.</w:t>
+            </w:r>
+          </w:p>
+        </w:tc>
+      </w:tr>
+      <w:tr>
+        <w:trPr>
+          <w:cantSplit/>
+          <w:trHeight w:val="639"/>
+        </w:trPr>
+        <w:tc>
+          <w:tcPr>
+            <w:tcW w:w="1559" w:type="dxa"/>
+          </w:tcPr>
+          <w:p>
+            <w:pPr>
+              <w:rPr>
+                <w:sz w:val="24"/>
+                <w:szCs w:val="24"/>
+              </w:rPr>
+            </w:pPr>
+            <w:r>
+              <w:rPr>
+                <w:sz w:val="24"/>
+                <w:szCs w:val="24"/>
+              </w:rPr>
               <w:t>2024-2025</w:t>
             </w:r>
           </w:p>
@@ -9402,7 +9622,7 @@
                 <w:sz w:val="24"/>
                 <w:szCs w:val="24"/>
               </w:rPr>
-              <w:t>Doctoral Committee member for 6 graduate students in the Department of Microbiology and the Department of Ecology and Evolutionary Biology, University of Tennessee.</w:t>
+              <w:t xml:space="preserve">Doctoral Committee member for 8 graduate students in the Department of Microbiology and the Department of Ecology and Evolutionary Biology, University of Tennessee.</w:t>
             </w:r>
           </w:p>
         </w:tc>

</xml_diff>

<commit_message>
Remove student evaluations note from teaching entry
Co-Authored-By: Claude Sonnet 5.5 <noreply@anthropic.com>
</commit_message>
<xml_diff>
--- a/cv.docx
+++ b/cv.docx
@@ -8702,23 +8702,7 @@
                 <w:sz w:val="24"/>
                 <w:szCs w:val="24"/>
               </w:rPr>
-              <w:t xml:space="preserve">Lecturer, General Microbiology (100 undergraduate students), University of Tennessee, Knoxville. </w:t>
-            </w:r>
-            <w:r>
-              <w:rPr>
-                <w:i/>
-                <w:iCs/>
-                <w:sz w:val="24"/>
-                <w:szCs w:val="24"/>
-              </w:rPr>
-              <w:t>Student evaluations consistently 4-5/5 for two semesters in which I was the sole instructor</w:t>
-            </w:r>
-            <w:r>
-              <w:rPr>
-                <w:sz w:val="24"/>
-                <w:szCs w:val="24"/>
-              </w:rPr>
-              <w:t>.</w:t>
+              <w:t xml:space="preserve">Lecturer, General Microbiology (100 undergraduate students), University of Tennessee, Knoxville.</w:t>
             </w:r>
           </w:p>
         </w:tc>

</xml_diff>

<commit_message>
Trim outreach section to the two most recent entries
Co-Authored-By: Claude Sonnet 5.5 <noreply@anthropic.com>
</commit_message>
<xml_diff>
--- a/cv.docx
+++ b/cv.docx
@@ -11580,308 +11580,6 @@
                 <w:szCs w:val="24"/>
               </w:rPr>
               <w:t>Annual Volunteer, Girl Scouts of Greater New York STEM programming events</w:t>
-            </w:r>
-          </w:p>
-        </w:tc>
-      </w:tr>
-      <w:tr>
-        <w:trPr>
-          <w:cantSplit/>
-          <w:trHeight w:val="665"/>
-        </w:trPr>
-        <w:tc>
-          <w:tcPr>
-            <w:tcW w:w="1800" w:type="dxa"/>
-          </w:tcPr>
-          <w:p>
-            <w:pPr>
-              <w:rPr>
-                <w:sz w:val="24"/>
-                <w:szCs w:val="24"/>
-              </w:rPr>
-            </w:pPr>
-            <w:r>
-              <w:rPr>
-                <w:sz w:val="24"/>
-                <w:szCs w:val="24"/>
-              </w:rPr>
-              <w:t>2016</w:t>
-            </w:r>
-          </w:p>
-        </w:tc>
-        <w:tc>
-          <w:tcPr>
-            <w:tcW w:w="7335" w:type="dxa"/>
-          </w:tcPr>
-          <w:p>
-            <w:pPr>
-              <w:rPr>
-                <w:sz w:val="24"/>
-                <w:szCs w:val="24"/>
-              </w:rPr>
-            </w:pPr>
-            <w:r>
-              <w:rPr>
-                <w:sz w:val="24"/>
-                <w:szCs w:val="24"/>
-              </w:rPr>
-              <w:t>Demonstrator, The 6</w:t>
-            </w:r>
-            <w:r>
-              <w:rPr>
-                <w:sz w:val="24"/>
-                <w:szCs w:val="24"/>
-                <w:vertAlign w:val="superscript"/>
-              </w:rPr>
-              <w:t>th</w:t>
-            </w:r>
-            <w:r>
-              <w:rPr>
-                <w:sz w:val="24"/>
-                <w:szCs w:val="24"/>
-              </w:rPr>
-              <w:t xml:space="preserve"> Annual John Carlson Lecture, New England Aquarium</w:t>
-            </w:r>
-          </w:p>
-        </w:tc>
-      </w:tr>
-      <w:tr>
-        <w:trPr>
-          <w:cantSplit/>
-          <w:trHeight w:val="395"/>
-        </w:trPr>
-        <w:tc>
-          <w:tcPr>
-            <w:tcW w:w="1800" w:type="dxa"/>
-          </w:tcPr>
-          <w:p>
-            <w:pPr>
-              <w:rPr>
-                <w:sz w:val="24"/>
-                <w:szCs w:val="24"/>
-              </w:rPr>
-            </w:pPr>
-            <w:r>
-              <w:rPr>
-                <w:sz w:val="24"/>
-                <w:szCs w:val="24"/>
-              </w:rPr>
-              <w:t>2016</w:t>
-            </w:r>
-          </w:p>
-        </w:tc>
-        <w:tc>
-          <w:tcPr>
-            <w:tcW w:w="7335" w:type="dxa"/>
-          </w:tcPr>
-          <w:p>
-            <w:pPr>
-              <w:rPr>
-                <w:sz w:val="24"/>
-                <w:szCs w:val="24"/>
-              </w:rPr>
-            </w:pPr>
-            <w:r>
-              <w:rPr>
-                <w:sz w:val="24"/>
-                <w:szCs w:val="24"/>
-              </w:rPr>
-              <w:t>Demonstrator, Oceans Alive! Display for MIT Open House</w:t>
-            </w:r>
-          </w:p>
-        </w:tc>
-      </w:tr>
-      <w:tr>
-        <w:trPr>
-          <w:cantSplit/>
-          <w:trHeight w:val="1232"/>
-        </w:trPr>
-        <w:tc>
-          <w:tcPr>
-            <w:tcW w:w="1800" w:type="dxa"/>
-          </w:tcPr>
-          <w:p>
-            <w:pPr>
-              <w:rPr>
-                <w:sz w:val="24"/>
-                <w:szCs w:val="24"/>
-              </w:rPr>
-            </w:pPr>
-            <w:r>
-              <w:rPr>
-                <w:sz w:val="24"/>
-                <w:szCs w:val="24"/>
-              </w:rPr>
-              <w:t>2015-2016</w:t>
-            </w:r>
-          </w:p>
-        </w:tc>
-        <w:tc>
-          <w:tcPr>
-            <w:tcW w:w="7335" w:type="dxa"/>
-          </w:tcPr>
-          <w:p>
-            <w:pPr>
-              <w:rPr>
-                <w:bCs/>
-                <w:sz w:val="24"/>
-                <w:szCs w:val="24"/>
-              </w:rPr>
-            </w:pPr>
-            <w:r>
-              <w:rPr>
-                <w:bCs/>
-                <w:sz w:val="24"/>
-                <w:szCs w:val="24"/>
-              </w:rPr>
-              <w:t>Interviewee for outreach movie for high school students to learn about scientific modeling, collaboration between Tilapia Film (Los Angeles) and scientists in the Department of Marine and Coastal Sciences at Rutgers University</w:t>
-            </w:r>
-          </w:p>
-        </w:tc>
-      </w:tr>
-      <w:tr>
-        <w:trPr>
-          <w:cantSplit/>
-          <w:trHeight w:val="422"/>
-        </w:trPr>
-        <w:tc>
-          <w:tcPr>
-            <w:tcW w:w="1800" w:type="dxa"/>
-          </w:tcPr>
-          <w:p>
-            <w:pPr>
-              <w:rPr>
-                <w:sz w:val="24"/>
-                <w:szCs w:val="24"/>
-              </w:rPr>
-            </w:pPr>
-            <w:r>
-              <w:rPr>
-                <w:sz w:val="24"/>
-                <w:szCs w:val="24"/>
-              </w:rPr>
-              <w:lastRenderedPageBreak/>
-              <w:t>2014</w:t>
-            </w:r>
-          </w:p>
-        </w:tc>
-        <w:tc>
-          <w:tcPr>
-            <w:tcW w:w="7335" w:type="dxa"/>
-          </w:tcPr>
-          <w:p>
-            <w:pPr>
-              <w:rPr>
-                <w:sz w:val="24"/>
-                <w:szCs w:val="24"/>
-              </w:rPr>
-            </w:pPr>
-            <w:r>
-              <w:rPr>
-                <w:sz w:val="24"/>
-                <w:szCs w:val="24"/>
-              </w:rPr>
-              <w:t>Demonstrator, Nautical Night at the MIT Museum</w:t>
-            </w:r>
-          </w:p>
-        </w:tc>
-      </w:tr>
-      <w:tr>
-        <w:trPr>
-          <w:cantSplit/>
-          <w:trHeight w:val="692"/>
-        </w:trPr>
-        <w:tc>
-          <w:tcPr>
-            <w:tcW w:w="1800" w:type="dxa"/>
-          </w:tcPr>
-          <w:p>
-            <w:pPr>
-              <w:rPr>
-                <w:sz w:val="24"/>
-                <w:szCs w:val="24"/>
-              </w:rPr>
-            </w:pPr>
-            <w:r>
-              <w:rPr>
-                <w:sz w:val="24"/>
-                <w:szCs w:val="24"/>
-              </w:rPr>
-              <w:t>2011-2012</w:t>
-            </w:r>
-          </w:p>
-        </w:tc>
-        <w:tc>
-          <w:tcPr>
-            <w:tcW w:w="7335" w:type="dxa"/>
-          </w:tcPr>
-          <w:p>
-            <w:pPr>
-              <w:rPr>
-                <w:sz w:val="24"/>
-                <w:szCs w:val="24"/>
-              </w:rPr>
-            </w:pPr>
-            <w:r>
-              <w:rPr>
-                <w:sz w:val="24"/>
-                <w:szCs w:val="24"/>
-              </w:rPr>
-              <w:t>STEMNET (Science, Technology and Engineering Network) Ambassador (various locations)</w:t>
-            </w:r>
-          </w:p>
-        </w:tc>
-      </w:tr>
-      <w:tr>
-        <w:trPr>
-          <w:cantSplit/>
-          <w:trHeight w:val="233"/>
-        </w:trPr>
-        <w:tc>
-          <w:tcPr>
-            <w:tcW w:w="1800" w:type="dxa"/>
-          </w:tcPr>
-          <w:p>
-            <w:pPr>
-              <w:rPr>
-                <w:sz w:val="24"/>
-                <w:szCs w:val="24"/>
-              </w:rPr>
-            </w:pPr>
-            <w:r>
-              <w:rPr>
-                <w:sz w:val="24"/>
-                <w:szCs w:val="24"/>
-              </w:rPr>
-              <w:t>2011</w:t>
-            </w:r>
-          </w:p>
-        </w:tc>
-        <w:tc>
-          <w:tcPr>
-            <w:tcW w:w="7335" w:type="dxa"/>
-          </w:tcPr>
-          <w:p>
-            <w:pPr>
-              <w:rPr>
-                <w:sz w:val="24"/>
-                <w:szCs w:val="24"/>
-              </w:rPr>
-            </w:pPr>
-            <w:r>
-              <w:rPr>
-                <w:bCs/>
-                <w:sz w:val="24"/>
-                <w:szCs w:val="24"/>
-              </w:rPr>
-              <w:t>Researcher in Residence, R</w:t>
-            </w:r>
-            <w:r>
-              <w:rPr>
-                <w:sz w:val="24"/>
-                <w:szCs w:val="24"/>
-              </w:rPr>
-              <w:t>idgeway School (now Plympton Academy), Plympton, UK</w:t>
             </w:r>
           </w:p>
         </w:tc>

</xml_diff>

<commit_message>
Add ASM KY/TN Branch Meeting talk (April 11, 2026) to oral presentations
Co-Authored-By: Claude Sonnet 5.5 <noreply@anthropic.com>
</commit_message>
<xml_diff>
--- a/cv.docx
+++ b/cv.docx
@@ -5392,6 +5392,76 @@
     <w:p>
       <w:pPr>
         <w:keepNext/>
+        <w:rPr>
+          <w:sz w:val="24"/>
+          <w:szCs w:val="24"/>
+        </w:rPr>
+      </w:pPr>
+    </w:p>
+    <w:p>
+      <w:pPr>
+        <w:rPr>
+          <w:sz w:val="24"/>
+          <w:szCs w:val="24"/>
+        </w:rPr>
+      </w:pPr>
+      <w:r>
+        <w:rPr>
+          <w:sz w:val="24"/>
+          <w:szCs w:val="24"/>
+        </w:rPr>
+        <w:t xml:space="preserve">Hambrick, K.M., </w:t>
+      </w:r>
+      <w:r>
+        <w:rPr>
+          <w:b/>
+          <w:bCs/>
+          <w:sz w:val="24"/>
+          <w:szCs w:val="24"/>
+        </w:rPr>
+        <w:t xml:space="preserve">Talmy, D.</w:t>
+      </w:r>
+      <w:r>
+        <w:rPr>
+          <w:sz w:val="24"/>
+          <w:szCs w:val="24"/>
+        </w:rPr>
+        <w:t xml:space="preserve">, Wilhelm, S.W., Zinser, E.R. Temperature histories of host and phage influences infection of </w:t>
+      </w:r>
+      <w:r>
+        <w:rPr>
+          <w:i/>
+          <w:iCs/>
+          <w:sz w:val="24"/>
+          <w:szCs w:val="24"/>
+        </w:rPr>
+        <w:t xml:space="preserve">Microcystis aeruginosa</w:t>
+      </w:r>
+      <w:r>
+        <w:rPr>
+          <w:sz w:val="24"/>
+          <w:szCs w:val="24"/>
+        </w:rPr>
+        <w:t xml:space="preserve">. ASM KY/TN Branch Meeting, Knoxville, TN, April 11</w:t>
+      </w:r>
+      <w:r>
+        <w:rPr>
+          <w:sz w:val="24"/>
+          <w:szCs w:val="24"/>
+          <w:vertAlign w:val="superscript"/>
+        </w:rPr>
+        <w:t xml:space="preserve">th</w:t>
+      </w:r>
+      <w:r>
+        <w:rPr>
+          <w:sz w:val="24"/>
+          <w:szCs w:val="24"/>
+        </w:rPr>
+        <w:t xml:space="preserve">, 2026.</w:t>
+      </w:r>
+    </w:p>
+    <w:p>
+      <w:pPr>
         <w:rPr>
           <w:sz w:val="24"/>
           <w:szCs w:val="24"/>

</xml_diff>

<commit_message>
Even out row spacing in all CV tables
Remove per-row minimum heights and cell-margin overrides, drop stray blank
paragraphs inside cells, and apply one uniform cell margin to every table.

Co-Authored-By: Claude Sonnet 5.5 <noreply@anthropic.com>
</commit_message>
<xml_diff>
--- a/cv.docx
+++ b/cv.docx
@@ -148,8 +148,8 @@
         <w:tblW w:w="9231" w:type="dxa"/>
         <w:tblInd w:w="108" w:type="dxa"/>
         <w:tblCellMar>
-          <w:top w:w="28" w:type="dxa"/>
-          <w:bottom w:w="28" w:type="dxa"/>
+          <w:top w:w="130" w:type="dxa"/>
+          <w:bottom w:w="130" w:type="dxa"/>
         </w:tblCellMar>
         <w:tblLook w:val="04A0" w:firstRow="1" w:lastRow="0" w:firstColumn="1" w:lastColumn="0" w:noHBand="0" w:noVBand="1"/>
       </w:tblPr>
@@ -160,7 +160,6 @@
       <w:tr>
         <w:trPr>
           <w:cantSplit/>
-          <w:trHeight w:val="440"/>
         </w:trPr>
         <w:tc>
           <w:tcPr>
@@ -180,14 +179,6 @@
               </w:rPr>
               <w:t xml:space="preserve">2009-2013</w:t>
             </w:r>
-          </w:p>
-          <w:p>
-            <w:pPr>
-              <w:rPr>
-                <w:sz w:val="24"/>
-                <w:szCs w:val="24"/>
-              </w:rPr>
-            </w:pPr>
           </w:p>
         </w:tc>
         <w:tc>
@@ -227,26 +218,11 @@
               <w:t>School of Biological Sciences, University of Essex</w:t>
             </w:r>
           </w:p>
-          <w:p>
-            <w:pPr>
-              <w:rPr>
-                <w:sz w:val="24"/>
-                <w:szCs w:val="24"/>
-              </w:rPr>
-            </w:pPr>
-          </w:p>
         </w:tc>
       </w:tr>
       <w:tr>
-        <w:tblPrEx>
-          <w:tblCellMar>
-            <w:top w:w="0" w:type="dxa"/>
-            <w:bottom w:w="0" w:type="dxa"/>
-          </w:tblCellMar>
-        </w:tblPrEx>
         <w:trPr>
           <w:cantSplit/>
-          <w:trHeight w:val="224"/>
         </w:trPr>
         <w:tc>
           <w:tcPr>
@@ -267,14 +243,6 @@
               <w:t>2008-2009</w:t>
             </w:r>
           </w:p>
-          <w:p>
-            <w:pPr>
-              <w:rPr>
-                <w:sz w:val="24"/>
-                <w:szCs w:val="24"/>
-              </w:rPr>
-            </w:pPr>
-          </w:p>
         </w:tc>
         <w:tc>
           <w:tcPr>
@@ -311,27 +279,12 @@
               </w:rPr>
               <w:t>Departments of Biology and Mathematics, University of York</w:t>
             </w:r>
-          </w:p>
-          <w:p>
-            <w:pPr>
-              <w:rPr>
-                <w:sz w:val="24"/>
-                <w:szCs w:val="24"/>
-              </w:rPr>
-            </w:pPr>
           </w:p>
         </w:tc>
       </w:tr>
       <w:tr>
-        <w:tblPrEx>
-          <w:tblCellMar>
-            <w:top w:w="0" w:type="dxa"/>
-            <w:bottom w:w="0" w:type="dxa"/>
-          </w:tblCellMar>
-        </w:tblPrEx>
         <w:trPr>
           <w:cantSplit/>
-          <w:trHeight w:val="693"/>
         </w:trPr>
         <w:tc>
           <w:tcPr>
@@ -428,8 +381,8 @@
         <w:tblW w:w="9231" w:type="dxa"/>
         <w:tblInd w:w="108" w:type="dxa"/>
         <w:tblCellMar>
-          <w:top w:w="28" w:type="dxa"/>
-          <w:bottom w:w="28" w:type="dxa"/>
+          <w:top w:w="130" w:type="dxa"/>
+          <w:bottom w:w="130" w:type="dxa"/>
         </w:tblCellMar>
         <w:tblLook w:val="04A0" w:firstRow="1" w:lastRow="0" w:firstColumn="1" w:lastColumn="0" w:noHBand="0" w:noVBand="1"/>
       </w:tblPr>
@@ -440,7 +393,6 @@
       <w:tr>
         <w:trPr>
           <w:cantSplit/>
-          <w:trHeight w:val="935"/>
         </w:trPr>
         <w:tc>
           <w:tcPr>
@@ -505,7 +457,6 @@
       <w:tr>
         <w:trPr>
           <w:cantSplit/>
-          <w:trHeight w:val="656"/>
         </w:trPr>
         <w:tc>
           <w:tcPr>
@@ -570,7 +521,6 @@
       <w:tr>
         <w:trPr>
           <w:cantSplit/>
-          <w:trHeight w:val="935"/>
         </w:trPr>
         <w:tc>
           <w:tcPr>
@@ -635,7 +585,6 @@
       <w:tr>
         <w:trPr>
           <w:cantSplit/>
-          <w:trHeight w:val="656"/>
         </w:trPr>
         <w:tc>
           <w:tcPr>
@@ -700,7 +649,6 @@
       <w:tr>
         <w:trPr>
           <w:cantSplit/>
-          <w:trHeight w:val="935"/>
         </w:trPr>
         <w:tc>
           <w:tcPr>
@@ -720,22 +668,6 @@
               </w:rPr>
               <w:t>2016-2018</w:t>
             </w:r>
-          </w:p>
-          <w:p>
-            <w:pPr>
-              <w:rPr>
-                <w:sz w:val="24"/>
-                <w:szCs w:val="24"/>
-              </w:rPr>
-            </w:pPr>
-          </w:p>
-          <w:p>
-            <w:pPr>
-              <w:rPr>
-                <w:sz w:val="24"/>
-                <w:szCs w:val="24"/>
-              </w:rPr>
-            </w:pPr>
           </w:p>
         </w:tc>
         <w:tc>
@@ -777,15 +709,8 @@
         </w:tc>
       </w:tr>
       <w:tr>
-        <w:tblPrEx>
-          <w:tblCellMar>
-            <w:top w:w="0" w:type="dxa"/>
-            <w:bottom w:w="0" w:type="dxa"/>
-          </w:tblCellMar>
-        </w:tblPrEx>
         <w:trPr>
           <w:cantSplit/>
-          <w:trHeight w:val="972"/>
         </w:trPr>
         <w:tc>
           <w:tcPr>
@@ -805,14 +730,6 @@
               </w:rPr>
               <w:t>2013-2016</w:t>
             </w:r>
-          </w:p>
-          <w:p>
-            <w:pPr>
-              <w:rPr>
-                <w:sz w:val="24"/>
-                <w:szCs w:val="24"/>
-              </w:rPr>
-            </w:pPr>
           </w:p>
         </w:tc>
         <w:tc>
@@ -854,15 +771,8 @@
         </w:tc>
       </w:tr>
       <w:tr>
-        <w:tblPrEx>
-          <w:tblCellMar>
-            <w:top w:w="0" w:type="dxa"/>
-            <w:bottom w:w="0" w:type="dxa"/>
-          </w:tblCellMar>
-        </w:tblPrEx>
         <w:trPr>
           <w:cantSplit/>
-          <w:trHeight w:val="79"/>
         </w:trPr>
         <w:tc>
           <w:tcPr>
@@ -3566,8 +3476,8 @@
         <w:tblW w:w="8811" w:type="dxa"/>
         <w:tblInd w:w="108" w:type="dxa"/>
         <w:tblCellMar>
-          <w:top w:w="28" w:type="dxa"/>
-          <w:bottom w:w="28" w:type="dxa"/>
+          <w:top w:w="130" w:type="dxa"/>
+          <w:bottom w:w="130" w:type="dxa"/>
         </w:tblCellMar>
         <w:tblLook w:val="04A0" w:firstRow="1" w:lastRow="0" w:firstColumn="1" w:lastColumn="0" w:noHBand="0" w:noVBand="1"/>
       </w:tblPr>
@@ -3579,7 +3489,6 @@
       <w:tr>
         <w:trPr>
           <w:cantSplit/>
-          <w:trHeight w:val="1205"/>
         </w:trPr>
         <w:tc>
           <w:tcPr>
@@ -3645,7 +3554,6 @@
       <w:tr>
         <w:trPr>
           <w:cantSplit/>
-          <w:trHeight w:val="1601"/>
         </w:trPr>
         <w:tc>
           <w:tcPr>
@@ -3765,7 +3673,6 @@
       <w:tr>
         <w:trPr>
           <w:cantSplit/>
-          <w:trHeight w:val="1205"/>
         </w:trPr>
         <w:tc>
           <w:tcPr>
@@ -3869,7 +3776,6 @@
       <w:tr>
         <w:trPr>
           <w:cantSplit/>
-          <w:trHeight w:val="1241"/>
         </w:trPr>
         <w:tc>
           <w:tcPr>
@@ -3936,7 +3842,6 @@
       <w:tr>
         <w:trPr>
           <w:cantSplit/>
-          <w:trHeight w:val="1205"/>
         </w:trPr>
         <w:tc>
           <w:tcPr>
@@ -4003,7 +3908,6 @@
       <w:tr>
         <w:trPr>
           <w:cantSplit/>
-          <w:trHeight w:val="944"/>
         </w:trPr>
         <w:tc>
           <w:tcPr>
@@ -4055,7 +3959,6 @@
       <w:tr>
         <w:trPr>
           <w:cantSplit/>
-          <w:trHeight w:val="1223"/>
         </w:trPr>
         <w:tc>
           <w:tcPr>
@@ -4122,7 +4025,6 @@
       <w:tr>
         <w:trPr>
           <w:cantSplit/>
-          <w:trHeight w:val="1484"/>
         </w:trPr>
         <w:tc>
           <w:tcPr>
@@ -4189,7 +4091,6 @@
       <w:tr>
         <w:trPr>
           <w:cantSplit/>
-          <w:trHeight w:val="1466"/>
         </w:trPr>
         <w:tc>
           <w:tcPr>
@@ -4252,7 +4153,6 @@
       <w:tr>
         <w:trPr>
           <w:cantSplit/>
-          <w:trHeight w:val="359"/>
         </w:trPr>
         <w:tc>
           <w:tcPr>
@@ -4299,7 +4199,6 @@
       <w:tr>
         <w:trPr>
           <w:cantSplit/>
-          <w:trHeight w:val="386"/>
         </w:trPr>
         <w:tc>
           <w:tcPr>
@@ -4345,17 +4244,10 @@
         </w:tc>
       </w:tr>
       <w:tr>
-        <w:tblPrEx>
-          <w:tblCellMar>
-            <w:top w:w="0" w:type="dxa"/>
-            <w:bottom w:w="0" w:type="dxa"/>
-          </w:tblCellMar>
-        </w:tblPrEx>
         <w:trPr>
           <w:cantSplit/>
           <w:gridAfter w:val="1"/>
           <w:wAfter w:w="2317" w:type="dxa"/>
-          <w:trHeight w:val="269"/>
         </w:trPr>
         <w:tc>
           <w:tcPr>
@@ -7326,6 +7218,10 @@
           <w:insideH w:val="single" w:sz="4" w:space="0" w:color="auto"/>
           <w:insideV w:val="single" w:sz="4" w:space="0" w:color="auto"/>
         </w:tblBorders>
+        <w:tblCellMar>
+          <w:top w:w="130" w:type="dxa"/>
+          <w:bottom w:w="130" w:type="dxa"/>
+        </w:tblCellMar>
         <w:tblLook w:val="04A0" w:firstRow="1" w:lastRow="0" w:firstColumn="1" w:lastColumn="0" w:noHBand="0" w:noVBand="1"/>
       </w:tblPr>
       <w:tblGrid>
@@ -7335,7 +7231,6 @@
       <w:tr>
         <w:trPr>
           <w:cantSplit/>
-          <w:trHeight w:val="729"/>
         </w:trPr>
         <w:tc>
           <w:tcPr>
@@ -7393,7 +7288,6 @@
       <w:tr>
         <w:trPr>
           <w:cantSplit/>
-          <w:trHeight w:val="729"/>
         </w:trPr>
         <w:tc>
           <w:tcPr>
@@ -7451,7 +7345,6 @@
       <w:tr>
         <w:trPr>
           <w:cantSplit/>
-          <w:trHeight w:val="729"/>
         </w:trPr>
         <w:tc>
           <w:tcPr>
@@ -7509,7 +7402,6 @@
       <w:tr>
         <w:trPr>
           <w:cantSplit/>
-          <w:trHeight w:val="450"/>
         </w:trPr>
         <w:tc>
           <w:tcPr>
@@ -7570,7 +7462,6 @@
       <w:tr>
         <w:trPr>
           <w:cantSplit/>
-          <w:trHeight w:val="720"/>
         </w:trPr>
         <w:tc>
           <w:tcPr>
@@ -7643,7 +7534,6 @@
       <w:tr>
         <w:trPr>
           <w:cantSplit/>
-          <w:trHeight w:val="720"/>
         </w:trPr>
         <w:tc>
           <w:tcPr>
@@ -7701,7 +7591,6 @@
       <w:tr>
         <w:trPr>
           <w:cantSplit/>
-          <w:trHeight w:val="720"/>
         </w:trPr>
         <w:tc>
           <w:tcPr>
@@ -7774,7 +7663,6 @@
       <w:tr>
         <w:trPr>
           <w:cantSplit/>
-          <w:trHeight w:val="450"/>
         </w:trPr>
         <w:tc>
           <w:tcPr>
@@ -7848,7 +7736,6 @@
       <w:tr>
         <w:trPr>
           <w:cantSplit/>
-          <w:trHeight w:val="450"/>
         </w:trPr>
         <w:tc>
           <w:tcPr>
@@ -7921,7 +7808,6 @@
       <w:tr>
         <w:trPr>
           <w:cantSplit/>
-          <w:trHeight w:val="720"/>
         </w:trPr>
         <w:tc>
           <w:tcPr>
@@ -7994,7 +7880,6 @@
       <w:tr>
         <w:trPr>
           <w:cantSplit/>
-          <w:trHeight w:val="720"/>
         </w:trPr>
         <w:tc>
           <w:tcPr>
@@ -8052,7 +7937,6 @@
       <w:tr>
         <w:trPr>
           <w:cantSplit/>
-          <w:trHeight w:val="720"/>
         </w:trPr>
         <w:tc>
           <w:tcPr>
@@ -8110,7 +7994,6 @@
       <w:tr>
         <w:trPr>
           <w:cantSplit/>
-          <w:trHeight w:val="990"/>
         </w:trPr>
         <w:tc>
           <w:tcPr>
@@ -8168,7 +8051,6 @@
       <w:tr>
         <w:trPr>
           <w:cantSplit/>
-          <w:trHeight w:val="720"/>
         </w:trPr>
         <w:tc>
           <w:tcPr>
@@ -8226,7 +8108,6 @@
       <w:tr>
         <w:trPr>
           <w:cantSplit/>
-          <w:trHeight w:val="630"/>
         </w:trPr>
         <w:tc>
           <w:tcPr>
@@ -8282,19 +8163,8 @@
         </w:tc>
       </w:tr>
       <w:tr>
-        <w:tblPrEx>
-          <w:tblBorders>
-            <w:top w:val="none" w:sz="0" w:space="0" w:color="auto"/>
-            <w:left w:val="none" w:sz="0" w:space="0" w:color="auto"/>
-            <w:bottom w:val="none" w:sz="0" w:space="0" w:color="auto"/>
-            <w:right w:val="none" w:sz="0" w:space="0" w:color="auto"/>
-            <w:insideH w:val="none" w:sz="0" w:space="0" w:color="auto"/>
-            <w:insideV w:val="none" w:sz="0" w:space="0" w:color="auto"/>
-          </w:tblBorders>
-        </w:tblPrEx>
         <w:trPr>
           <w:cantSplit/>
-          <w:trHeight w:val="720"/>
         </w:trPr>
         <w:tc>
           <w:tcPr>
@@ -8338,19 +8208,8 @@
         </w:tc>
       </w:tr>
       <w:tr>
-        <w:tblPrEx>
-          <w:tblBorders>
-            <w:top w:val="none" w:sz="0" w:space="0" w:color="auto"/>
-            <w:left w:val="none" w:sz="0" w:space="0" w:color="auto"/>
-            <w:bottom w:val="none" w:sz="0" w:space="0" w:color="auto"/>
-            <w:right w:val="none" w:sz="0" w:space="0" w:color="auto"/>
-            <w:insideH w:val="none" w:sz="0" w:space="0" w:color="auto"/>
-            <w:insideV w:val="none" w:sz="0" w:space="0" w:color="auto"/>
-          </w:tblBorders>
-        </w:tblPrEx>
         <w:trPr>
           <w:cantSplit/>
-          <w:trHeight w:val="387"/>
         </w:trPr>
         <w:tc>
           <w:tcPr>
@@ -8394,19 +8253,8 @@
         </w:tc>
       </w:tr>
       <w:tr>
-        <w:tblPrEx>
-          <w:tblBorders>
-            <w:top w:val="none" w:sz="0" w:space="0" w:color="auto"/>
-            <w:left w:val="none" w:sz="0" w:space="0" w:color="auto"/>
-            <w:bottom w:val="none" w:sz="0" w:space="0" w:color="auto"/>
-            <w:right w:val="none" w:sz="0" w:space="0" w:color="auto"/>
-            <w:insideH w:val="none" w:sz="0" w:space="0" w:color="auto"/>
-            <w:insideV w:val="none" w:sz="0" w:space="0" w:color="auto"/>
-          </w:tblBorders>
-        </w:tblPrEx>
         <w:trPr>
           <w:cantSplit/>
-          <w:trHeight w:val="585"/>
         </w:trPr>
         <w:tc>
           <w:tcPr>
@@ -8495,6 +8343,10 @@
       <w:tblPr>
         <w:tblW w:w="9356" w:type="dxa"/>
         <w:tblInd w:w="108" w:type="dxa"/>
+        <w:tblCellMar>
+          <w:top w:w="130" w:type="dxa"/>
+          <w:bottom w:w="130" w:type="dxa"/>
+        </w:tblCellMar>
         <w:tblLook w:val="04A0" w:firstRow="1" w:lastRow="0" w:firstColumn="1" w:lastColumn="0" w:noHBand="0" w:noVBand="1"/>
       </w:tblPr>
       <w:tblGrid>
@@ -8504,7 +8356,6 @@
       <w:tr>
         <w:trPr>
           <w:cantSplit/>
-          <w:trHeight w:val="639"/>
         </w:trPr>
         <w:tc>
           <w:tcPr>
@@ -8550,7 +8401,6 @@
       <w:tr>
         <w:trPr>
           <w:cantSplit/>
-          <w:trHeight w:val="639"/>
         </w:trPr>
         <w:tc>
           <w:tcPr>
@@ -8596,7 +8446,6 @@
       <w:tr>
         <w:trPr>
           <w:cantSplit/>
-          <w:trHeight w:val="720"/>
         </w:trPr>
         <w:tc>
           <w:tcPr>
@@ -8642,7 +8491,6 @@
       <w:tr>
         <w:trPr>
           <w:cantSplit/>
-          <w:trHeight w:val="639"/>
         </w:trPr>
         <w:tc>
           <w:tcPr>
@@ -8688,7 +8536,6 @@
       <w:tr>
         <w:trPr>
           <w:cantSplit/>
-          <w:trHeight w:val="666"/>
         </w:trPr>
         <w:tc>
           <w:tcPr>
@@ -8734,7 +8581,6 @@
       <w:tr>
         <w:trPr>
           <w:cantSplit/>
-          <w:trHeight w:val="954"/>
         </w:trPr>
         <w:tc>
           <w:tcPr>
@@ -8780,7 +8626,6 @@
       <w:tr>
         <w:trPr>
           <w:cantSplit/>
-          <w:trHeight w:val="711"/>
         </w:trPr>
         <w:tc>
           <w:tcPr>
@@ -8826,7 +8671,6 @@
       <w:tr>
         <w:trPr>
           <w:cantSplit/>
-          <w:trHeight w:val="630"/>
         </w:trPr>
         <w:tc>
           <w:tcPr>
@@ -8872,7 +8716,6 @@
       <w:tr>
         <w:trPr>
           <w:cantSplit/>
-          <w:trHeight w:val="639"/>
         </w:trPr>
         <w:tc>
           <w:tcPr>
@@ -8918,7 +8761,6 @@
       <w:tr>
         <w:trPr>
           <w:cantSplit/>
-          <w:trHeight w:val="657"/>
         </w:trPr>
         <w:tc>
           <w:tcPr>
@@ -8965,7 +8807,6 @@
       <w:tr>
         <w:trPr>
           <w:cantSplit/>
-          <w:trHeight w:val="366"/>
         </w:trPr>
         <w:tc>
           <w:tcPr>
@@ -9085,6 +8926,10 @@
       <w:tblPr>
         <w:tblW w:w="9356" w:type="dxa"/>
         <w:tblInd w:w="108" w:type="dxa"/>
+        <w:tblCellMar>
+          <w:top w:w="130" w:type="dxa"/>
+          <w:bottom w:w="130" w:type="dxa"/>
+        </w:tblCellMar>
         <w:tblLook w:val="04A0" w:firstRow="1" w:lastRow="0" w:firstColumn="1" w:lastColumn="0" w:noHBand="0" w:noVBand="1"/>
       </w:tblPr>
       <w:tblGrid>
@@ -9094,7 +8939,6 @@
       <w:tr>
         <w:trPr>
           <w:cantSplit/>
-          <w:trHeight w:val="684"/>
         </w:trPr>
         <w:tc>
           <w:tcPr>
@@ -9140,7 +8984,6 @@
       <w:tr>
         <w:trPr>
           <w:cantSplit/>
-          <w:trHeight w:val="684"/>
         </w:trPr>
         <w:tc>
           <w:tcPr>
@@ -9186,7 +9029,6 @@
       <w:tr>
         <w:trPr>
           <w:cantSplit/>
-          <w:trHeight w:val="684"/>
         </w:trPr>
         <w:tc>
           <w:tcPr>
@@ -9232,7 +9074,6 @@
       <w:tr>
         <w:trPr>
           <w:cantSplit/>
-          <w:trHeight w:val="684"/>
         </w:trPr>
         <w:tc>
           <w:tcPr>
@@ -9278,7 +9119,6 @@
       <w:tr>
         <w:trPr>
           <w:cantSplit/>
-          <w:trHeight w:val="801"/>
         </w:trPr>
         <w:tc>
           <w:tcPr>
@@ -9324,7 +9164,6 @@
       <w:tr>
         <w:trPr>
           <w:cantSplit/>
-          <w:trHeight w:val="729"/>
         </w:trPr>
         <w:tc>
           <w:tcPr>
@@ -9370,7 +9209,6 @@
       <w:tr>
         <w:trPr>
           <w:cantSplit/>
-          <w:trHeight w:val="459"/>
         </w:trPr>
         <w:tc>
           <w:tcPr>
@@ -9416,7 +9254,6 @@
       <w:tr>
         <w:trPr>
           <w:cantSplit/>
-          <w:trHeight w:val="585"/>
         </w:trPr>
         <w:tc>
           <w:tcPr>
@@ -9505,6 +9342,10 @@
       <w:tblPr>
         <w:tblW w:w="9356" w:type="dxa"/>
         <w:tblInd w:w="108" w:type="dxa"/>
+        <w:tblCellMar>
+          <w:top w:w="130" w:type="dxa"/>
+          <w:bottom w:w="130" w:type="dxa"/>
+        </w:tblCellMar>
         <w:tblLook w:val="04A0" w:firstRow="1" w:lastRow="0" w:firstColumn="1" w:lastColumn="0" w:noHBand="0" w:noVBand="1"/>
       </w:tblPr>
       <w:tblGrid>
@@ -9514,7 +9355,6 @@
       <w:tr>
         <w:trPr>
           <w:cantSplit/>
-          <w:trHeight w:val="558"/>
         </w:trPr>
         <w:tc>
           <w:tcPr>
@@ -9576,7 +9416,6 @@
       <w:tr>
         <w:trPr>
           <w:cantSplit/>
-          <w:trHeight w:val="999"/>
         </w:trPr>
         <w:tc>
           <w:tcPr>
@@ -9638,7 +9477,6 @@
       <w:tr>
         <w:trPr>
           <w:cantSplit/>
-          <w:trHeight w:val="981"/>
         </w:trPr>
         <w:tc>
           <w:tcPr>
@@ -9684,7 +9522,6 @@
       <w:tr>
         <w:trPr>
           <w:cantSplit/>
-          <w:trHeight w:val="999"/>
         </w:trPr>
         <w:tc>
           <w:tcPr>
@@ -9746,7 +9583,6 @@
       <w:tr>
         <w:trPr>
           <w:cantSplit/>
-          <w:trHeight w:val="558"/>
         </w:trPr>
         <w:tc>
           <w:tcPr>
@@ -9851,6 +9687,10 @@
       <w:tblPr>
         <w:tblW w:w="9356" w:type="dxa"/>
         <w:tblInd w:w="108" w:type="dxa"/>
+        <w:tblCellMar>
+          <w:top w:w="130" w:type="dxa"/>
+          <w:bottom w:w="130" w:type="dxa"/>
+        </w:tblCellMar>
         <w:tblLook w:val="04A0" w:firstRow="1" w:lastRow="0" w:firstColumn="1" w:lastColumn="0" w:noHBand="0" w:noVBand="1"/>
       </w:tblPr>
       <w:tblGrid>
@@ -9860,7 +9700,6 @@
       <w:tr>
         <w:trPr>
           <w:cantSplit/>
-          <w:trHeight w:val="396"/>
         </w:trPr>
         <w:tc>
           <w:tcPr>
@@ -9906,7 +9745,6 @@
       <w:tr>
         <w:trPr>
           <w:cantSplit/>
-          <w:trHeight w:val="369"/>
         </w:trPr>
         <w:tc>
           <w:tcPr>
@@ -9953,7 +9791,6 @@
       <w:tr>
         <w:trPr>
           <w:cantSplit/>
-          <w:trHeight w:val="558"/>
         </w:trPr>
         <w:tc>
           <w:tcPr>
@@ -10032,6 +9869,10 @@
       <w:tblPr>
         <w:tblW w:w="9356" w:type="dxa"/>
         <w:tblInd w:w="108" w:type="dxa"/>
+        <w:tblCellMar>
+          <w:top w:w="130" w:type="dxa"/>
+          <w:bottom w:w="130" w:type="dxa"/>
+        </w:tblCellMar>
         <w:tblLook w:val="04A0" w:firstRow="1" w:lastRow="0" w:firstColumn="1" w:lastColumn="0" w:noHBand="0" w:noVBand="1"/>
       </w:tblPr>
       <w:tblGrid>
@@ -10041,7 +9882,6 @@
       <w:tr>
         <w:trPr>
           <w:cantSplit/>
-          <w:trHeight w:val="351"/>
         </w:trPr>
         <w:tc>
           <w:tcPr>
@@ -10162,8 +10002,8 @@
         <w:tblW w:w="9135" w:type="dxa"/>
         <w:tblInd w:w="108" w:type="dxa"/>
         <w:tblCellMar>
-          <w:top w:w="28" w:type="dxa"/>
-          <w:bottom w:w="28" w:type="dxa"/>
+          <w:top w:w="130" w:type="dxa"/>
+          <w:bottom w:w="130" w:type="dxa"/>
         </w:tblCellMar>
         <w:tblLook w:val="04A0" w:firstRow="1" w:lastRow="0" w:firstColumn="1" w:lastColumn="0" w:noHBand="0" w:noVBand="1"/>
       </w:tblPr>
@@ -10174,7 +10014,6 @@
       <w:tr>
         <w:trPr>
           <w:cantSplit/>
-          <w:trHeight w:val="2033"/>
         </w:trPr>
         <w:tc>
           <w:tcPr>
@@ -10502,7 +10341,6 @@
       <w:tr>
         <w:trPr>
           <w:cantSplit/>
-          <w:trHeight w:val="728"/>
         </w:trPr>
         <w:tc>
           <w:tcPr>
@@ -10550,7 +10388,6 @@
       <w:tr>
         <w:trPr>
           <w:cantSplit/>
-          <w:trHeight w:val="431"/>
         </w:trPr>
         <w:tc>
           <w:tcPr>
@@ -10597,7 +10434,6 @@
       <w:tr>
         <w:trPr>
           <w:cantSplit/>
-          <w:trHeight w:val="431"/>
         </w:trPr>
         <w:tc>
           <w:tcPr>
@@ -10644,7 +10480,6 @@
       <w:tr>
         <w:trPr>
           <w:cantSplit/>
-          <w:trHeight w:val="431"/>
         </w:trPr>
         <w:tc>
           <w:tcPr>
@@ -10706,7 +10541,6 @@
       <w:tr>
         <w:trPr>
           <w:cantSplit/>
-          <w:trHeight w:val="431"/>
         </w:trPr>
         <w:tc>
           <w:tcPr>
@@ -10768,7 +10602,6 @@
       <w:tr>
         <w:trPr>
           <w:cantSplit/>
-          <w:trHeight w:val="728"/>
         </w:trPr>
         <w:tc>
           <w:tcPr>
@@ -10833,7 +10666,6 @@
       <w:tr>
         <w:trPr>
           <w:cantSplit/>
-          <w:trHeight w:val="512"/>
         </w:trPr>
         <w:tc>
           <w:tcPr>
@@ -10881,7 +10713,6 @@
       <w:tr>
         <w:trPr>
           <w:cantSplit/>
-          <w:trHeight w:val="431"/>
         </w:trPr>
         <w:tc>
           <w:tcPr>
@@ -10973,8 +10804,8 @@
         <w:tblW w:w="9135" w:type="dxa"/>
         <w:tblInd w:w="108" w:type="dxa"/>
         <w:tblCellMar>
-          <w:top w:w="28" w:type="dxa"/>
-          <w:bottom w:w="28" w:type="dxa"/>
+          <w:top w:w="130" w:type="dxa"/>
+          <w:bottom w:w="130" w:type="dxa"/>
         </w:tblCellMar>
         <w:tblLook w:val="04A0" w:firstRow="1" w:lastRow="0" w:firstColumn="1" w:lastColumn="0" w:noHBand="0" w:noVBand="1"/>
       </w:tblPr>
@@ -10985,7 +10816,6 @@
       <w:tr>
         <w:trPr>
           <w:cantSplit/>
-          <w:trHeight w:val="431"/>
         </w:trPr>
         <w:tc>
           <w:tcPr>
@@ -11032,7 +10862,6 @@
       <w:tr>
         <w:trPr>
           <w:cantSplit/>
-          <w:trHeight w:val="431"/>
         </w:trPr>
         <w:tc>
           <w:tcPr>
@@ -11079,7 +10908,6 @@
       <w:tr>
         <w:trPr>
           <w:cantSplit/>
-          <w:trHeight w:val="431"/>
         </w:trPr>
         <w:tc>
           <w:tcPr>
@@ -11126,7 +10954,6 @@
       <w:tr>
         <w:trPr>
           <w:cantSplit/>
-          <w:trHeight w:val="431"/>
         </w:trPr>
         <w:tc>
           <w:tcPr>
@@ -11173,7 +11000,6 @@
       <w:tr>
         <w:trPr>
           <w:cantSplit/>
-          <w:trHeight w:val="431"/>
         </w:trPr>
         <w:tc>
           <w:tcPr>
@@ -11220,7 +11046,6 @@
       <w:tr>
         <w:trPr>
           <w:cantSplit/>
-          <w:trHeight w:val="431"/>
         </w:trPr>
         <w:tc>
           <w:tcPr>
@@ -11267,7 +11092,6 @@
       <w:tr>
         <w:trPr>
           <w:cantSplit/>
-          <w:trHeight w:val="431"/>
         </w:trPr>
         <w:tc>
           <w:tcPr>
@@ -11314,7 +11138,6 @@
       <w:tr>
         <w:trPr>
           <w:cantSplit/>
-          <w:trHeight w:val="431"/>
         </w:trPr>
         <w:tc>
           <w:tcPr>
@@ -11361,7 +11184,6 @@
       <w:tr>
         <w:trPr>
           <w:cantSplit/>
-          <w:trHeight w:val="728"/>
         </w:trPr>
         <w:tc>
           <w:tcPr>
@@ -11409,7 +11231,6 @@
       <w:tr>
         <w:trPr>
           <w:cantSplit/>
-          <w:trHeight w:val="728"/>
         </w:trPr>
         <w:tc>
           <w:tcPr>
@@ -11457,7 +11278,6 @@
       <w:tr>
         <w:trPr>
           <w:cantSplit/>
-          <w:trHeight w:val="674"/>
         </w:trPr>
         <w:tc>
           <w:tcPr>
@@ -11549,8 +11369,8 @@
         <w:tblW w:w="9135" w:type="dxa"/>
         <w:tblInd w:w="108" w:type="dxa"/>
         <w:tblCellMar>
-          <w:top w:w="28" w:type="dxa"/>
-          <w:bottom w:w="28" w:type="dxa"/>
+          <w:top w:w="130" w:type="dxa"/>
+          <w:bottom w:w="130" w:type="dxa"/>
         </w:tblCellMar>
         <w:tblLook w:val="04A0" w:firstRow="1" w:lastRow="0" w:firstColumn="1" w:lastColumn="0" w:noHBand="0" w:noVBand="1"/>
       </w:tblPr>
@@ -11561,7 +11381,6 @@
       <w:tr>
         <w:trPr>
           <w:cantSplit/>
-          <w:trHeight w:val="683"/>
         </w:trPr>
         <w:tc>
           <w:tcPr>
@@ -11609,7 +11428,6 @@
       <w:tr>
         <w:trPr>
           <w:cantSplit/>
-          <w:trHeight w:val="674"/>
         </w:trPr>
         <w:tc>
           <w:tcPr>

</xml_diff>

<commit_message>
Trim oral and poster presentations to the last ten years
Remove eight oral presentations (2010-2015) and two posters (2010-2011).
Invited talks are kept in full.

Co-Authored-By: Claude Sonnet 5.5 <noreply@anthropic.com>
</commit_message>
<xml_diff>
--- a/cv.docx
+++ b/cv.docx
@@ -6081,204 +6081,7 @@
     </w:p>
     <w:p>
       <w:pPr>
-        <w:rPr>
-          <w:sz w:val="24"/>
-          <w:szCs w:val="24"/>
-        </w:rPr>
-      </w:pPr>
-      <w:r>
-        <w:rPr>
-          <w:sz w:val="24"/>
-          <w:szCs w:val="24"/>
-        </w:rPr>
-        <w:t>Talmy, D., Hussain, F., Follows, M.J. The influence of viral reproduction strategies on marine microbial community dynamics. 2</w:t>
-      </w:r>
-      <w:r>
-        <w:rPr>
-          <w:sz w:val="24"/>
-          <w:szCs w:val="24"/>
-          <w:vertAlign w:val="superscript"/>
-        </w:rPr>
-        <w:t>nd</w:t>
-      </w:r>
-      <w:r>
-        <w:rPr>
-          <w:sz w:val="24"/>
-          <w:szCs w:val="24"/>
-        </w:rPr>
-        <w:t xml:space="preserve"> workshop on trait-based approaches to ocean life, New Hampshire, USA, October 5</w:t>
-      </w:r>
-      <w:r>
-        <w:rPr>
-          <w:sz w:val="24"/>
-          <w:szCs w:val="24"/>
-          <w:vertAlign w:val="superscript"/>
-        </w:rPr>
-        <w:t>th</w:t>
-      </w:r>
-      <w:r>
-        <w:rPr>
-          <w:sz w:val="24"/>
-          <w:szCs w:val="24"/>
-        </w:rPr>
-        <w:t>, 2015.</w:t>
-      </w:r>
-    </w:p>
-    <w:p>
-      <w:pPr>
-        <w:rPr>
-          <w:sz w:val="24"/>
-          <w:szCs w:val="24"/>
-        </w:rPr>
-      </w:pPr>
-    </w:p>
-    <w:p>
-      <w:pPr>
-        <w:rPr>
-          <w:sz w:val="24"/>
-          <w:szCs w:val="24"/>
-        </w:rPr>
-      </w:pPr>
-      <w:r>
-        <w:rPr>
-          <w:sz w:val="24"/>
-          <w:szCs w:val="24"/>
-        </w:rPr>
-        <w:t>Talmy, D., Hussain, F., Follows, M.J. The influence of viral reproductive strategies on marine microbial community dynamics. Aquatic Sciences Meeting, Granada, Spain, February 27</w:t>
-      </w:r>
-      <w:r>
-        <w:rPr>
-          <w:sz w:val="24"/>
-          <w:szCs w:val="24"/>
-          <w:vertAlign w:val="superscript"/>
-        </w:rPr>
-        <w:t>th</w:t>
-      </w:r>
-      <w:r>
-        <w:rPr>
-          <w:sz w:val="24"/>
-          <w:szCs w:val="24"/>
-        </w:rPr>
-        <w:t>, 2015.</w:t>
-      </w:r>
-    </w:p>
-    <w:p>
-      <w:pPr>
-        <w:rPr>
-          <w:sz w:val="24"/>
-          <w:szCs w:val="24"/>
-        </w:rPr>
-      </w:pPr>
-    </w:p>
-    <w:p>
-      <w:pPr>
-        <w:rPr>
-          <w:sz w:val="24"/>
-          <w:szCs w:val="24"/>
-        </w:rPr>
-      </w:pPr>
-      <w:r>
-        <w:rPr>
-          <w:sz w:val="24"/>
-          <w:szCs w:val="24"/>
-        </w:rPr>
-        <w:t>Talmy, D., Hardman-Mountford, N.J., Blackford, J.C., Geider, R.J. Phytoplankton photoadaptation in contrasting aquatic light regimes. Ocean Sciences Meeting, Honolulu, Hawaii, USA, February 27</w:t>
-      </w:r>
-      <w:r>
-        <w:rPr>
-          <w:sz w:val="24"/>
-          <w:szCs w:val="24"/>
-          <w:vertAlign w:val="superscript"/>
-        </w:rPr>
-        <w:t>th</w:t>
-      </w:r>
-      <w:r>
-        <w:rPr>
-          <w:sz w:val="24"/>
-          <w:szCs w:val="24"/>
-        </w:rPr>
-        <w:t>, 2014.</w:t>
-      </w:r>
-    </w:p>
-    <w:p>
-      <w:pPr>
-        <w:rPr>
-          <w:sz w:val="24"/>
-          <w:szCs w:val="24"/>
-        </w:rPr>
-      </w:pPr>
-    </w:p>
-    <w:p>
-      <w:pPr>
-        <w:rPr>
-          <w:sz w:val="24"/>
-          <w:szCs w:val="24"/>
-        </w:rPr>
-      </w:pPr>
-      <w:r>
-        <w:rPr>
-          <w:sz w:val="24"/>
-          <w:szCs w:val="24"/>
-        </w:rPr>
-        <w:t xml:space="preserve">Talmy, D., Hardman-Mountford, N.J., Blackford, J.C., Polimene, L., Hill, C.N., Follows, M.J., Geider, R.J. Phytoplankton photoadaptation in contrasting aquatic light regimes. Sack Lunch Seminar Series, Department of Earth, Atmospheric and Planetary Sciences, Massachusetts Institute of Technology, Massachusetts, USA, October 23</w:t>
-      </w:r>
-      <w:r>
-        <w:rPr>
-          <w:sz w:val="24"/>
-          <w:szCs w:val="24"/>
-          <w:vertAlign w:val="superscript"/>
-        </w:rPr>
-        <w:t>rd</w:t>
-      </w:r>
-      <w:r>
-        <w:rPr>
-          <w:sz w:val="24"/>
-          <w:szCs w:val="24"/>
-        </w:rPr>
-        <w:t>, 2013.</w:t>
-      </w:r>
-    </w:p>
-    <w:p>
-      <w:pPr>
-        <w:rPr>
-          <w:sz w:val="24"/>
-          <w:szCs w:val="24"/>
-        </w:rPr>
-      </w:pPr>
-    </w:p>
-    <w:p>
-      <w:pPr>
-        <w:rPr>
-          <w:bCs/>
-          <w:sz w:val="24"/>
-          <w:szCs w:val="24"/>
-        </w:rPr>
-      </w:pPr>
-      <w:r>
-        <w:rPr>
-          <w:sz w:val="24"/>
-          <w:szCs w:val="24"/>
-        </w:rPr>
-        <w:t xml:space="preserve">Talmy, D., Blackford, J.C., Hardman-Mountford, N.J., Geider, R.J. Adaptation to variable light determines resource allocation in phytoplankton. Ocean Sciences Meeting, Salt Lake City, Utah, USA, February 23</w:t>
-      </w:r>
-      <w:r>
-        <w:rPr>
-          <w:sz w:val="24"/>
-          <w:szCs w:val="24"/>
-          <w:vertAlign w:val="superscript"/>
-        </w:rPr>
-        <w:t xml:space="preserve">rd</w:t>
-      </w:r>
-      <w:r>
-        <w:rPr>
-          <w:sz w:val="24"/>
-          <w:szCs w:val="24"/>
-        </w:rPr>
-        <w:t xml:space="preserve">, 2012.</w:t>
-      </w:r>
-    </w:p>
-    <w:p>
-      <w:pPr>
+        <w:keepNext/>
         <w:rPr>
           <w:b/>
           <w:bCs/>
@@ -6286,104 +6089,76 @@
           <w:szCs w:val="24"/>
         </w:rPr>
       </w:pPr>
-    </w:p>
-    <w:p>
-      <w:pPr>
-        <w:rPr>
-          <w:bCs/>
-          <w:color w:val="000000"/>
-          <w:sz w:val="24"/>
-          <w:szCs w:val="24"/>
-        </w:rPr>
-      </w:pPr>
-      <w:r>
-        <w:rPr>
-          <w:sz w:val="24"/>
-          <w:szCs w:val="24"/>
-        </w:rPr>
-        <w:t xml:space="preserve">Talmy, D., Blackford, J.C., Hardman-Mountford, N.J., Geider, R.J. Modeling phytoplankton growth in non steady-state environments. Marine Sciences Seminar, Plymouth Marine Laboratory, Plymouth, UK, May 26</w:t>
-      </w:r>
-      <w:r>
-        <w:rPr>
-          <w:sz w:val="24"/>
-          <w:szCs w:val="24"/>
-          <w:vertAlign w:val="superscript"/>
-        </w:rPr>
-        <w:t xml:space="preserve">th</w:t>
-      </w:r>
-      <w:r>
-        <w:rPr>
-          <w:sz w:val="24"/>
-          <w:szCs w:val="24"/>
-        </w:rPr>
-        <w:t xml:space="preserve">, 2011.</w:t>
-      </w:r>
-    </w:p>
-    <w:p>
-      <w:pPr>
+      <w:r>
         <w:rPr>
           <w:b/>
           <w:bCs/>
           <w:sz w:val="24"/>
           <w:szCs w:val="24"/>
         </w:rPr>
-      </w:pPr>
-    </w:p>
-    <w:p>
-      <w:pPr>
-        <w:rPr>
-          <w:bCs/>
-          <w:color w:val="000000"/>
-          <w:sz w:val="24"/>
-          <w:szCs w:val="24"/>
-        </w:rPr>
-      </w:pPr>
-      <w:r>
-        <w:rPr>
-          <w:sz w:val="24"/>
-          <w:szCs w:val="24"/>
-        </w:rPr>
-        <w:t xml:space="preserve">Talmy, D., Blackford, J.C., Hardman-Mountford, N.J., Geider, R.J. Modeling phytoplankton productivity in the open ocean: including the effects of adaptation to different light regimes. Marine Science and Environmental Microbiology Seminar, University of Essex, January 26</w:t>
-      </w:r>
-      <w:r>
-        <w:rPr>
-          <w:sz w:val="24"/>
-          <w:szCs w:val="24"/>
-          <w:vertAlign w:val="superscript"/>
-        </w:rPr>
-        <w:t xml:space="preserve">th</w:t>
-      </w:r>
-      <w:r>
-        <w:rPr>
-          <w:sz w:val="24"/>
-          <w:szCs w:val="24"/>
-        </w:rPr>
-        <w:t xml:space="preserve">, 2011.</w:t>
-      </w:r>
-    </w:p>
-    <w:p>
-      <w:pPr>
+        <w:t>Poster Presentations</w:t>
+      </w:r>
+    </w:p>
+    <w:p>
+      <w:pPr>
+        <w:keepNext/>
+        <w:rPr>
+          <w:sz w:val="24"/>
+          <w:szCs w:val="24"/>
+        </w:rPr>
+      </w:pPr>
+    </w:p>
+    <w:p>
+      <w:pPr>
+        <w:keepNext/>
+        <w:rPr>
+          <w:i/>
+          <w:iCs/>
+          <w:sz w:val="24"/>
+          <w:szCs w:val="24"/>
+        </w:rPr>
+      </w:pPr>
+      <w:r>
+        <w:rPr>
+          <w:i/>
+          <w:iCs/>
+          <w:sz w:val="24"/>
+          <w:szCs w:val="24"/>
+        </w:rPr>
+        <w:t>Boldened names indicate people in my research group</w:t>
+      </w:r>
+    </w:p>
+    <w:p>
+      <w:pPr>
+        <w:keepNext/>
+        <w:rPr>
+          <w:sz w:val="24"/>
+          <w:szCs w:val="24"/>
+        </w:rPr>
+      </w:pPr>
+    </w:p>
+    <w:p>
+      <w:pPr>
+        <w:rPr>
+          <w:sz w:val="24"/>
+          <w:szCs w:val="24"/>
+        </w:rPr>
+      </w:pPr>
+      <w:r>
         <w:rPr>
           <w:b/>
           <w:bCs/>
           <w:sz w:val="24"/>
           <w:szCs w:val="24"/>
         </w:rPr>
-      </w:pPr>
-    </w:p>
-    <w:p>
-      <w:pPr>
-        <w:rPr>
-          <w:sz w:val="24"/>
-          <w:szCs w:val="24"/>
-        </w:rPr>
-      </w:pPr>
-      <w:r>
-        <w:rPr>
-          <w:sz w:val="24"/>
-          <w:szCs w:val="24"/>
-        </w:rPr>
-        <w:t xml:space="preserve">Talmy, D., Blackford, J.C., Hardman-Mountford, N.J., Geider, R.J. Optimality in phytoplankton growth models and the link with satellite data. NCEO Ocean Carbon Cycle Meeting, Plymouth, UK, July 15</w:t>
+        <w:t xml:space="preserve">Talmy, D., Carr, E.</w:t>
+      </w:r>
+      <w:r>
+        <w:rPr>
+          <w:sz w:val="24"/>
+          <w:szCs w:val="24"/>
+        </w:rPr>
+        <w:t xml:space="preserve"> Modeling community dynamics: impacts of hydrogen peroxide on marine cyanobacteria composition. BioGeoScapes / C-CoMP Modeling Workshop, Woods Hole Oceanographic Institution, Massachusetts, USA, September 10</w:t>
       </w:r>
       <w:r>
         <w:rPr>
@@ -6398,26 +6173,70 @@
           <w:sz w:val="24"/>
           <w:szCs w:val="24"/>
         </w:rPr>
-        <w:t xml:space="preserve">, 2010.</w:t>
-      </w:r>
-    </w:p>
-    <w:p>
-      <w:pPr>
-        <w:rPr>
-          <w:sz w:val="24"/>
-          <w:szCs w:val="24"/>
-        </w:rPr>
-      </w:pPr>
-    </w:p>
-    <w:p>
-      <w:pPr>
-        <w:keepNext/>
+        <w:t xml:space="preserve">, 2025.</w:t>
+      </w:r>
+    </w:p>
+    <w:p>
+      <w:pPr>
+        <w:rPr>
+          <w:sz w:val="24"/>
+          <w:szCs w:val="24"/>
+        </w:rPr>
+      </w:pPr>
+    </w:p>
+    <w:p>
+      <w:pPr>
+        <w:rPr>
+          <w:sz w:val="24"/>
+          <w:szCs w:val="24"/>
+        </w:rPr>
+      </w:pPr>
+      <w:r>
         <w:rPr>
           <w:b/>
           <w:bCs/>
           <w:sz w:val="24"/>
           <w:szCs w:val="24"/>
         </w:rPr>
+        <w:t xml:space="preserve">Talmy, D., Carr, E.</w:t>
+      </w:r>
+      <w:r>
+        <w:rPr>
+          <w:sz w:val="24"/>
+          <w:szCs w:val="24"/>
+        </w:rPr>
+        <w:t xml:space="preserve">, Weitz, J., Dutkiewicz, S. Can viral induced mortality be represented implicitly and capture marine ecological dynamics? BioGeoScapes / C-CoMP Modeling Workshop, Woods Hole Oceanographic Institution, Massachusetts, USA, September 10</w:t>
+      </w:r>
+      <w:r>
+        <w:rPr>
+          <w:sz w:val="24"/>
+          <w:szCs w:val="24"/>
+          <w:vertAlign w:val="superscript"/>
+        </w:rPr>
+        <w:t xml:space="preserve">th</w:t>
+      </w:r>
+      <w:r>
+        <w:rPr>
+          <w:sz w:val="24"/>
+          <w:szCs w:val="24"/>
+        </w:rPr>
+        <w:t xml:space="preserve">, 2025.</w:t>
+      </w:r>
+    </w:p>
+    <w:p>
+      <w:pPr>
+        <w:rPr>
+          <w:sz w:val="24"/>
+          <w:szCs w:val="24"/>
+        </w:rPr>
+      </w:pPr>
+    </w:p>
+    <w:p>
+      <w:pPr>
+        <w:rPr>
+          <w:sz w:val="24"/>
+          <w:szCs w:val="24"/>
+        </w:rPr>
       </w:pPr>
       <w:r>
         <w:rPr>
@@ -6426,41 +6245,103 @@
           <w:sz w:val="24"/>
           <w:szCs w:val="24"/>
         </w:rPr>
-        <w:t>Poster Presentations</w:t>
-      </w:r>
-    </w:p>
-    <w:p>
-      <w:pPr>
-        <w:keepNext/>
-        <w:rPr>
-          <w:sz w:val="24"/>
-          <w:szCs w:val="24"/>
-        </w:rPr>
-      </w:pPr>
-    </w:p>
-    <w:p>
-      <w:pPr>
-        <w:keepNext/>
+        <w:t>Talmy, D., Carr, E.</w:t>
+      </w:r>
+      <w:r>
+        <w:rPr>
+          <w:sz w:val="24"/>
+          <w:szCs w:val="24"/>
+        </w:rPr>
+        <w:t xml:space="preserve">, Dutkiewicz, S., Weitz, J. Can viral induced mortality be represented implicitly and capture marine ecological dynamics? ASLO Aquatic Sciences Meeting, Charlotte, NC, USA, March 27</w:t>
+      </w:r>
+      <w:r>
+        <w:rPr>
+          <w:sz w:val="24"/>
+          <w:szCs w:val="24"/>
+          <w:vertAlign w:val="superscript"/>
+        </w:rPr>
+        <w:t>th</w:t>
+      </w:r>
+      <w:r>
+        <w:rPr>
+          <w:sz w:val="24"/>
+          <w:szCs w:val="24"/>
+        </w:rPr>
+        <w:t xml:space="preserve">, 2025.</w:t>
+      </w:r>
+    </w:p>
+    <w:p>
+      <w:pPr>
+        <w:rPr>
+          <w:sz w:val="24"/>
+          <w:szCs w:val="24"/>
+        </w:rPr>
+      </w:pPr>
+    </w:p>
+    <w:p>
+      <w:pPr>
+        <w:rPr>
+          <w:sz w:val="24"/>
+          <w:szCs w:val="24"/>
+        </w:rPr>
+      </w:pPr>
+      <w:r>
+        <w:rPr>
+          <w:sz w:val="24"/>
+          <w:szCs w:val="24"/>
+        </w:rPr>
+        <w:t xml:space="preserve">Hambrick, K.M., Smith, L.E., Martin, R.M., Stark, G.F., </w:t>
+      </w:r>
+      <w:r>
+        <w:rPr>
+          <w:b/>
+          <w:bCs/>
+          <w:sz w:val="24"/>
+          <w:szCs w:val="24"/>
+        </w:rPr>
+        <w:t>Talmy, D.,</w:t>
+      </w:r>
+      <w:r>
+        <w:rPr>
+          <w:sz w:val="24"/>
+          <w:szCs w:val="24"/>
+        </w:rPr>
+        <w:t xml:space="preserve"> Wilhelm, S.W., Zinser, E.R. Temperature correlates with phage resistance in </w:t>
+      </w:r>
+      <w:r>
         <w:rPr>
           <w:i/>
           <w:iCs/>
           <w:sz w:val="24"/>
           <w:szCs w:val="24"/>
         </w:rPr>
-      </w:pPr>
-      <w:r>
-        <w:rPr>
-          <w:i/>
-          <w:iCs/>
-          <w:sz w:val="24"/>
-          <w:szCs w:val="24"/>
-        </w:rPr>
-        <w:t>Boldened names indicate people in my research group</w:t>
-      </w:r>
-    </w:p>
-    <w:p>
-      <w:pPr>
-        <w:keepNext/>
+        <w:t>Microcystis aeruginosa</w:t>
+      </w:r>
+      <w:r>
+        <w:rPr>
+          <w:sz w:val="24"/>
+          <w:szCs w:val="24"/>
+        </w:rPr>
+        <w:t xml:space="preserve"> NIES-298. ASLO Aquatic Sciences Meeting, Charlotte, NC, USA, March 27</w:t>
+      </w:r>
+      <w:r>
+        <w:rPr>
+          <w:sz w:val="24"/>
+          <w:szCs w:val="24"/>
+          <w:vertAlign w:val="superscript"/>
+        </w:rPr>
+        <w:t>th</w:t>
+      </w:r>
+      <w:r>
+        <w:rPr>
+          <w:sz w:val="24"/>
+          <w:szCs w:val="24"/>
+        </w:rPr>
+        <w:t xml:space="preserve">, 2025.</w:t>
+      </w:r>
+    </w:p>
+    <w:p>
+      <w:pPr>
         <w:rPr>
           <w:sz w:val="24"/>
           <w:szCs w:val="24"/>
@@ -6481,14 +6362,14 @@
           <w:sz w:val="24"/>
           <w:szCs w:val="24"/>
         </w:rPr>
-        <w:t xml:space="preserve">Talmy, D., Carr, E.</w:t>
-      </w:r>
-      <w:r>
-        <w:rPr>
-          <w:sz w:val="24"/>
-          <w:szCs w:val="24"/>
-        </w:rPr>
-        <w:t xml:space="preserve"> Modeling community dynamics: impacts of hydrogen peroxide on marine cyanobacteria composition. BioGeoScapes / C-CoMP Modeling Workshop, Woods Hole Oceanographic Institution, Massachusetts, USA, September 10</w:t>
+        <w:t xml:space="preserve">Carr, E., Rajakaruna, H., Talmy, D.</w:t>
+      </w:r>
+      <w:r>
+        <w:rPr>
+          <w:sz w:val="24"/>
+          <w:szCs w:val="24"/>
+        </w:rPr>
+        <w:t xml:space="preserve"> On the influence of mortality on microbial predator-prey relationships in the surface ocean. 5</w:t>
       </w:r>
       <w:r>
         <w:rPr>
@@ -6503,7 +6384,22 @@
           <w:sz w:val="24"/>
           <w:szCs w:val="24"/>
         </w:rPr>
-        <w:t xml:space="preserve">, 2025.</w:t>
+        <w:t xml:space="preserve"> workshop on trait-based approaches to ocean life, Knoxville, TN, January 27</w:t>
+      </w:r>
+      <w:r>
+        <w:rPr>
+          <w:sz w:val="24"/>
+          <w:szCs w:val="24"/>
+          <w:vertAlign w:val="superscript"/>
+        </w:rPr>
+        <w:t xml:space="preserve">th</w:t>
+      </w:r>
+      <w:r>
+        <w:rPr>
+          <w:sz w:val="24"/>
+          <w:szCs w:val="24"/>
+        </w:rPr>
+        <w:t xml:space="preserve">, 2022.</w:t>
       </w:r>
     </w:p>
     <w:p>
@@ -6528,46 +6424,15 @@
           <w:sz w:val="24"/>
           <w:szCs w:val="24"/>
         </w:rPr>
-        <w:t xml:space="preserve">Talmy, D., Carr, E.</w:t>
-      </w:r>
-      <w:r>
-        <w:rPr>
-          <w:sz w:val="24"/>
-          <w:szCs w:val="24"/>
-        </w:rPr>
-        <w:t xml:space="preserve">, Weitz, J., Dutkiewicz, S. Can viral induced mortality be represented implicitly and capture marine ecological dynamics? BioGeoScapes / C-CoMP Modeling Workshop, Woods Hole Oceanographic Institution, Massachusetts, USA, September 10</w:t>
-      </w:r>
-      <w:r>
-        <w:rPr>
-          <w:sz w:val="24"/>
-          <w:szCs w:val="24"/>
-          <w:vertAlign w:val="superscript"/>
-        </w:rPr>
-        <w:t xml:space="preserve">th</w:t>
-      </w:r>
-      <w:r>
-        <w:rPr>
-          <w:sz w:val="24"/>
-          <w:szCs w:val="24"/>
-        </w:rPr>
-        <w:t xml:space="preserve">, 2025.</w:t>
-      </w:r>
-    </w:p>
-    <w:p>
-      <w:pPr>
-        <w:rPr>
-          <w:sz w:val="24"/>
-          <w:szCs w:val="24"/>
-        </w:rPr>
-      </w:pPr>
-    </w:p>
-    <w:p>
-      <w:pPr>
-        <w:rPr>
-          <w:sz w:val="24"/>
-          <w:szCs w:val="24"/>
-        </w:rPr>
-      </w:pPr>
+        <w:t xml:space="preserve">McCullough, D.K.</w:t>
+      </w:r>
+      <w:r>
+        <w:rPr>
+          <w:sz w:val="24"/>
+          <w:szCs w:val="24"/>
+        </w:rPr>
+        <w:t xml:space="preserve">, Calfee, B., Zinser, E.R., </w:t>
+      </w:r>
       <w:r>
         <w:rPr>
           <w:b/>
@@ -6575,14 +6440,14 @@
           <w:sz w:val="24"/>
           <w:szCs w:val="24"/>
         </w:rPr>
-        <w:t>Talmy, D., Carr, E.</w:t>
-      </w:r>
-      <w:r>
-        <w:rPr>
-          <w:sz w:val="24"/>
-          <w:szCs w:val="24"/>
-        </w:rPr>
-        <w:t xml:space="preserve">, Dutkiewicz, S., Weitz, J. Can viral induced mortality be represented implicitly and capture marine ecological dynamics? ASLO Aquatic Sciences Meeting, Charlotte, NC, USA, March 27</w:t>
+        <w:t xml:space="preserve">Talmy, D.</w:t>
+      </w:r>
+      <w:r>
+        <w:rPr>
+          <w:sz w:val="24"/>
+          <w:szCs w:val="24"/>
+        </w:rPr>
+        <w:t xml:space="preserve"> Toward a general model of the effects of exogenous reactive oxygen on bacterial community dynamics. 5</w:t>
       </w:r>
       <w:r>
         <w:rPr>
@@ -6590,38 +6455,46 @@
           <w:szCs w:val="24"/>
           <w:vertAlign w:val="superscript"/>
         </w:rPr>
-        <w:t>th</w:t>
-      </w:r>
-      <w:r>
-        <w:rPr>
-          <w:sz w:val="24"/>
-          <w:szCs w:val="24"/>
-        </w:rPr>
-        <w:t xml:space="preserve">, 2025.</w:t>
-      </w:r>
-    </w:p>
-    <w:p>
-      <w:pPr>
-        <w:rPr>
-          <w:sz w:val="24"/>
-          <w:szCs w:val="24"/>
-        </w:rPr>
-      </w:pPr>
-    </w:p>
-    <w:p>
-      <w:pPr>
-        <w:rPr>
-          <w:sz w:val="24"/>
-          <w:szCs w:val="24"/>
-        </w:rPr>
-      </w:pPr>
-      <w:r>
-        <w:rPr>
-          <w:sz w:val="24"/>
-          <w:szCs w:val="24"/>
-        </w:rPr>
-        <w:t xml:space="preserve">Hambrick, K.M., Smith, L.E., Martin, R.M., Stark, G.F., </w:t>
-      </w:r>
+        <w:t xml:space="preserve">th</w:t>
+      </w:r>
+      <w:r>
+        <w:rPr>
+          <w:sz w:val="24"/>
+          <w:szCs w:val="24"/>
+        </w:rPr>
+        <w:t xml:space="preserve"> workshop on trait-based approaches to ocean life, Knoxville, TN, January 27</w:t>
+      </w:r>
+      <w:r>
+        <w:rPr>
+          <w:sz w:val="24"/>
+          <w:szCs w:val="24"/>
+          <w:vertAlign w:val="superscript"/>
+        </w:rPr>
+        <w:t xml:space="preserve">th</w:t>
+      </w:r>
+      <w:r>
+        <w:rPr>
+          <w:sz w:val="24"/>
+          <w:szCs w:val="24"/>
+        </w:rPr>
+        <w:t xml:space="preserve">, 2022.</w:t>
+      </w:r>
+    </w:p>
+    <w:p>
+      <w:pPr>
+        <w:rPr>
+          <w:sz w:val="24"/>
+          <w:szCs w:val="24"/>
+        </w:rPr>
+      </w:pPr>
+    </w:p>
+    <w:p>
+      <w:pPr>
+        <w:rPr>
+          <w:sz w:val="24"/>
+          <w:szCs w:val="24"/>
+        </w:rPr>
+      </w:pPr>
       <w:r>
         <w:rPr>
           <w:b/>
@@ -6629,62 +6502,15 @@
           <w:sz w:val="24"/>
           <w:szCs w:val="24"/>
         </w:rPr>
-        <w:t>Talmy, D.,</w:t>
-      </w:r>
-      <w:r>
-        <w:rPr>
-          <w:sz w:val="24"/>
-          <w:szCs w:val="24"/>
-        </w:rPr>
-        <w:t xml:space="preserve"> Wilhelm, S.W., Zinser, E.R. Temperature correlates with phage resistance in </w:t>
-      </w:r>
-      <w:r>
-        <w:rPr>
-          <w:i/>
-          <w:iCs/>
-          <w:sz w:val="24"/>
-          <w:szCs w:val="24"/>
-        </w:rPr>
-        <w:t>Microcystis aeruginosa</w:t>
-      </w:r>
-      <w:r>
-        <w:rPr>
-          <w:sz w:val="24"/>
-          <w:szCs w:val="24"/>
-        </w:rPr>
-        <w:t xml:space="preserve"> NIES-298. ASLO Aquatic Sciences Meeting, Charlotte, NC, USA, March 27</w:t>
-      </w:r>
-      <w:r>
-        <w:rPr>
-          <w:sz w:val="24"/>
-          <w:szCs w:val="24"/>
-          <w:vertAlign w:val="superscript"/>
-        </w:rPr>
-        <w:t>th</w:t>
-      </w:r>
-      <w:r>
-        <w:rPr>
-          <w:sz w:val="24"/>
-          <w:szCs w:val="24"/>
-        </w:rPr>
-        <w:t xml:space="preserve">, 2025.</w:t>
-      </w:r>
-    </w:p>
-    <w:p>
-      <w:pPr>
-        <w:rPr>
-          <w:sz w:val="24"/>
-          <w:szCs w:val="24"/>
-        </w:rPr>
-      </w:pPr>
-    </w:p>
-    <w:p>
-      <w:pPr>
-        <w:rPr>
-          <w:sz w:val="24"/>
-          <w:szCs w:val="24"/>
-        </w:rPr>
-      </w:pPr>
+        <w:t xml:space="preserve">Rajakaruna, H.</w:t>
+      </w:r>
+      <w:r>
+        <w:rPr>
+          <w:sz w:val="24"/>
+          <w:szCs w:val="24"/>
+        </w:rPr>
+        <w:t xml:space="preserve">, Omta, A.W., </w:t>
+      </w:r>
       <w:r>
         <w:rPr>
           <w:b/>
@@ -6692,14 +6518,14 @@
           <w:sz w:val="24"/>
           <w:szCs w:val="24"/>
         </w:rPr>
-        <w:t xml:space="preserve">Carr, E., Rajakaruna, H., Talmy, D.</w:t>
-      </w:r>
-      <w:r>
-        <w:rPr>
-          <w:sz w:val="24"/>
-          <w:szCs w:val="24"/>
-        </w:rPr>
-        <w:t xml:space="preserve"> On the influence of mortality on microbial predator-prey relationships in the surface ocean. 5</w:t>
+        <w:t xml:space="preserve">Carr, E., Talmy, D.</w:t>
+      </w:r>
+      <w:r>
+        <w:rPr>
+          <w:sz w:val="24"/>
+          <w:szCs w:val="24"/>
+        </w:rPr>
+        <w:t xml:space="preserve"> The power-law biomass scaling relationship in natural microbial ecosystems. 5</w:t>
       </w:r>
       <w:r>
         <w:rPr>
@@ -6777,7 +6603,7 @@
           <w:sz w:val="24"/>
           <w:szCs w:val="24"/>
         </w:rPr>
-        <w:t xml:space="preserve"> Toward a general model of the effects of exogenous reactive oxygen on bacterial community dynamics. 5</w:t>
+        <w:t xml:space="preserve"> Connecting hydrogen peroxide damage and nutrient limitation controls on marine cyanobacterial growth. 4</w:t>
       </w:r>
       <w:r>
         <w:rPr>
@@ -6792,7 +6618,7 @@
           <w:sz w:val="24"/>
           <w:szCs w:val="24"/>
         </w:rPr>
-        <w:t xml:space="preserve"> workshop on trait-based approaches to ocean life, Knoxville, TN, January 27</w:t>
+        <w:t xml:space="preserve"> workshop on trait-based approaches to ocean life, Buckinghamshire, UK, August 19</w:t>
       </w:r>
       <w:r>
         <w:rPr>
@@ -6807,7 +6633,7 @@
           <w:sz w:val="24"/>
           <w:szCs w:val="24"/>
         </w:rPr>
-        <w:t xml:space="preserve">, 2022.</w:t>
+        <w:t xml:space="preserve">, 2019.</w:t>
       </w:r>
     </w:p>
     <w:p>
@@ -6832,14 +6658,14 @@
           <w:sz w:val="24"/>
           <w:szCs w:val="24"/>
         </w:rPr>
-        <w:t xml:space="preserve">Rajakaruna, H.</w:t>
-      </w:r>
-      <w:r>
-        <w:rPr>
-          <w:sz w:val="24"/>
-          <w:szCs w:val="24"/>
-        </w:rPr>
-        <w:t xml:space="preserve">, Omta, A.W., </w:t>
+        <w:t xml:space="preserve">Papoulis, S.E.</w:t>
+      </w:r>
+      <w:r>
+        <w:rPr>
+          <w:sz w:val="24"/>
+          <w:szCs w:val="24"/>
+        </w:rPr>
+        <w:t xml:space="preserve">, Wilhelm, S.W., </w:t>
       </w:r>
       <w:r>
         <w:rPr>
@@ -6848,14 +6674,14 @@
           <w:sz w:val="24"/>
           <w:szCs w:val="24"/>
         </w:rPr>
-        <w:t xml:space="preserve">Carr, E., Talmy, D.</w:t>
-      </w:r>
-      <w:r>
-        <w:rPr>
-          <w:sz w:val="24"/>
-          <w:szCs w:val="24"/>
-        </w:rPr>
-        <w:t xml:space="preserve"> The power-law biomass scaling relationship in natural microbial ecosystems. 5</w:t>
+        <w:t xml:space="preserve">Talmy, D.</w:t>
+      </w:r>
+      <w:r>
+        <w:rPr>
+          <w:sz w:val="24"/>
+          <w:szCs w:val="24"/>
+        </w:rPr>
+        <w:t xml:space="preserve">, Zinser, E.R. Environmental nutrients explain the distribution of restriction modification systems in prokaryotic genomes. 4</w:t>
       </w:r>
       <w:r>
         <w:rPr>
@@ -6870,7 +6696,7 @@
           <w:sz w:val="24"/>
           <w:szCs w:val="24"/>
         </w:rPr>
-        <w:t xml:space="preserve"> workshop on trait-based approaches to ocean life, Knoxville, TN, January 27</w:t>
+        <w:t xml:space="preserve"> workshop on trait-based approaches to ocean life, Buckinghamshire, UK, August 20</w:t>
       </w:r>
       <w:r>
         <w:rPr>
@@ -6885,55 +6711,31 @@
           <w:sz w:val="24"/>
           <w:szCs w:val="24"/>
         </w:rPr>
-        <w:t xml:space="preserve">, 2022.</w:t>
-      </w:r>
-    </w:p>
-    <w:p>
-      <w:pPr>
-        <w:rPr>
-          <w:sz w:val="24"/>
-          <w:szCs w:val="24"/>
-        </w:rPr>
-      </w:pPr>
-    </w:p>
-    <w:p>
-      <w:pPr>
-        <w:rPr>
-          <w:sz w:val="24"/>
-          <w:szCs w:val="24"/>
-        </w:rPr>
-      </w:pPr>
-      <w:r>
+        <w:t xml:space="preserve">, 2019.</w:t>
+      </w:r>
+    </w:p>
+    <w:p>
+      <w:pPr>
         <w:rPr>
           <w:b/>
-          <w:bCs/>
-          <w:sz w:val="24"/>
-          <w:szCs w:val="24"/>
-        </w:rPr>
-        <w:t xml:space="preserve">McCullough, D.K.</w:t>
-      </w:r>
-      <w:r>
-        <w:rPr>
-          <w:sz w:val="24"/>
-          <w:szCs w:val="24"/>
-        </w:rPr>
-        <w:t xml:space="preserve">, Calfee, B., Zinser, E.R., </w:t>
-      </w:r>
-      <w:r>
-        <w:rPr>
-          <w:b/>
-          <w:bCs/>
-          <w:sz w:val="24"/>
-          <w:szCs w:val="24"/>
-        </w:rPr>
-        <w:t xml:space="preserve">Talmy, D.</w:t>
-      </w:r>
-      <w:r>
-        <w:rPr>
-          <w:sz w:val="24"/>
-          <w:szCs w:val="24"/>
-        </w:rPr>
-        <w:t xml:space="preserve"> Connecting hydrogen peroxide damage and nutrient limitation controls on marine cyanobacterial growth. 4</w:t>
+          <w:sz w:val="24"/>
+          <w:szCs w:val="24"/>
+        </w:rPr>
+      </w:pPr>
+    </w:p>
+    <w:p>
+      <w:pPr>
+        <w:rPr>
+          <w:sz w:val="24"/>
+          <w:szCs w:val="24"/>
+        </w:rPr>
+      </w:pPr>
+      <w:r>
+        <w:rPr>
+          <w:sz w:val="24"/>
+          <w:szCs w:val="24"/>
+        </w:rPr>
+        <w:t>Talmy, D., Follett, C.L., Follows, M.J. Viral regulation of dissolved organic matter elemental composition. Viruses of Microbes Meeting, Liverpool, UK, July 19</w:t>
       </w:r>
       <w:r>
         <w:rPr>
@@ -6941,138 +6743,6 @@
           <w:szCs w:val="24"/>
           <w:vertAlign w:val="superscript"/>
         </w:rPr>
-        <w:t xml:space="preserve">th</w:t>
-      </w:r>
-      <w:r>
-        <w:rPr>
-          <w:sz w:val="24"/>
-          <w:szCs w:val="24"/>
-        </w:rPr>
-        <w:t xml:space="preserve"> workshop on trait-based approaches to ocean life, Buckinghamshire, UK, August 19</w:t>
-      </w:r>
-      <w:r>
-        <w:rPr>
-          <w:sz w:val="24"/>
-          <w:szCs w:val="24"/>
-          <w:vertAlign w:val="superscript"/>
-        </w:rPr>
-        <w:t xml:space="preserve">th</w:t>
-      </w:r>
-      <w:r>
-        <w:rPr>
-          <w:sz w:val="24"/>
-          <w:szCs w:val="24"/>
-        </w:rPr>
-        <w:t xml:space="preserve">, 2019.</w:t>
-      </w:r>
-    </w:p>
-    <w:p>
-      <w:pPr>
-        <w:rPr>
-          <w:sz w:val="24"/>
-          <w:szCs w:val="24"/>
-        </w:rPr>
-      </w:pPr>
-    </w:p>
-    <w:p>
-      <w:pPr>
-        <w:rPr>
-          <w:sz w:val="24"/>
-          <w:szCs w:val="24"/>
-        </w:rPr>
-      </w:pPr>
-      <w:r>
-        <w:rPr>
-          <w:b/>
-          <w:bCs/>
-          <w:sz w:val="24"/>
-          <w:szCs w:val="24"/>
-        </w:rPr>
-        <w:t xml:space="preserve">Papoulis, S.E.</w:t>
-      </w:r>
-      <w:r>
-        <w:rPr>
-          <w:sz w:val="24"/>
-          <w:szCs w:val="24"/>
-        </w:rPr>
-        <w:t xml:space="preserve">, Wilhelm, S.W., </w:t>
-      </w:r>
-      <w:r>
-        <w:rPr>
-          <w:b/>
-          <w:bCs/>
-          <w:sz w:val="24"/>
-          <w:szCs w:val="24"/>
-        </w:rPr>
-        <w:t xml:space="preserve">Talmy, D.</w:t>
-      </w:r>
-      <w:r>
-        <w:rPr>
-          <w:sz w:val="24"/>
-          <w:szCs w:val="24"/>
-        </w:rPr>
-        <w:t xml:space="preserve">, Zinser, E.R. Environmental nutrients explain the distribution of restriction modification systems in prokaryotic genomes. 4</w:t>
-      </w:r>
-      <w:r>
-        <w:rPr>
-          <w:sz w:val="24"/>
-          <w:szCs w:val="24"/>
-          <w:vertAlign w:val="superscript"/>
-        </w:rPr>
-        <w:t xml:space="preserve">th</w:t>
-      </w:r>
-      <w:r>
-        <w:rPr>
-          <w:sz w:val="24"/>
-          <w:szCs w:val="24"/>
-        </w:rPr>
-        <w:t xml:space="preserve"> workshop on trait-based approaches to ocean life, Buckinghamshire, UK, August 20</w:t>
-      </w:r>
-      <w:r>
-        <w:rPr>
-          <w:sz w:val="24"/>
-          <w:szCs w:val="24"/>
-          <w:vertAlign w:val="superscript"/>
-        </w:rPr>
-        <w:t xml:space="preserve">th</w:t>
-      </w:r>
-      <w:r>
-        <w:rPr>
-          <w:sz w:val="24"/>
-          <w:szCs w:val="24"/>
-        </w:rPr>
-        <w:t xml:space="preserve">, 2019.</w:t>
-      </w:r>
-    </w:p>
-    <w:p>
-      <w:pPr>
-        <w:rPr>
-          <w:b/>
-          <w:sz w:val="24"/>
-          <w:szCs w:val="24"/>
-        </w:rPr>
-      </w:pPr>
-    </w:p>
-    <w:p>
-      <w:pPr>
-        <w:rPr>
-          <w:sz w:val="24"/>
-          <w:szCs w:val="24"/>
-        </w:rPr>
-      </w:pPr>
-      <w:r>
-        <w:rPr>
-          <w:sz w:val="24"/>
-          <w:szCs w:val="24"/>
-        </w:rPr>
-        <w:t>Talmy, D., Follett, C.L., Follows, M.J. Viral regulation of dissolved organic matter elemental composition. Viruses of Microbes Meeting, Liverpool, UK, July 19</w:t>
-      </w:r>
-      <w:r>
-        <w:rPr>
-          <w:sz w:val="24"/>
-          <w:szCs w:val="24"/>
-          <w:vertAlign w:val="superscript"/>
-        </w:rPr>
         <w:t>th</w:t>
       </w:r>
       <w:r>
@@ -7086,90 +6756,6 @@
     <w:p>
       <w:pPr>
         <w:rPr>
-          <w:sz w:val="24"/>
-          <w:szCs w:val="24"/>
-        </w:rPr>
-      </w:pPr>
-    </w:p>
-    <w:p>
-      <w:pPr>
-        <w:rPr>
-          <w:bCs/>
-          <w:color w:val="000000"/>
-          <w:sz w:val="24"/>
-          <w:szCs w:val="24"/>
-        </w:rPr>
-      </w:pPr>
-      <w:r>
-        <w:rPr>
-          <w:sz w:val="24"/>
-          <w:szCs w:val="24"/>
-        </w:rPr>
-        <w:t xml:space="preserve">Talmy, D., Blackford, J.C., Hardman-Mountford, N.J., Geider, R.J. Phytoplankton optimal resource allocation in response to variable light intensity. Advances in Marine Ecosystem Modelling Research (AMEMR) Symposium, Plymouth, UK, June 28</w:t>
-      </w:r>
-      <w:r>
-        <w:rPr>
-          <w:sz w:val="24"/>
-          <w:szCs w:val="24"/>
-          <w:vertAlign w:val="superscript"/>
-        </w:rPr>
-        <w:t xml:space="preserve">th</w:t>
-      </w:r>
-      <w:r>
-        <w:rPr>
-          <w:sz w:val="24"/>
-          <w:szCs w:val="24"/>
-        </w:rPr>
-        <w:t xml:space="preserve">, 2011.</w:t>
-      </w:r>
-    </w:p>
-    <w:p>
-      <w:pPr>
-        <w:rPr>
-          <w:b/>
-          <w:bCs/>
-          <w:sz w:val="24"/>
-          <w:szCs w:val="24"/>
-        </w:rPr>
-      </w:pPr>
-    </w:p>
-    <w:p>
-      <w:pPr>
-        <w:rPr>
-          <w:bCs/>
-          <w:color w:val="000000"/>
-          <w:sz w:val="24"/>
-          <w:szCs w:val="24"/>
-        </w:rPr>
-      </w:pPr>
-      <w:r>
-        <w:rPr>
-          <w:sz w:val="24"/>
-          <w:szCs w:val="24"/>
-        </w:rPr>
-        <w:t xml:space="preserve">Talmy, D., Blackford, J.C., Hardman-Mountford, N.J., Geider, R.J. Optimality in phytoplankton growth models and the link with satellite data. Advanced School on Complexity, Adaptation and Emergence in Marine Ecosystems, Trieste, Italy, October 21</w:t>
-      </w:r>
-      <w:r>
-        <w:rPr>
-          <w:sz w:val="24"/>
-          <w:szCs w:val="24"/>
-          <w:vertAlign w:val="superscript"/>
-        </w:rPr>
-        <w:t xml:space="preserve">st</w:t>
-      </w:r>
-      <w:r>
-        <w:rPr>
-          <w:sz w:val="24"/>
-          <w:szCs w:val="24"/>
-        </w:rPr>
-        <w:t xml:space="preserve">, 2010.</w:t>
-      </w:r>
-    </w:p>
-    <w:p>
-      <w:pPr>
-        <w:rPr>
-          <w:bCs/>
-          <w:color w:val="000000"/>
           <w:sz w:val="24"/>
           <w:szCs w:val="24"/>
         </w:rPr>

</xml_diff>

<commit_message>
Bold only the CV owner's name and underline trainees
Bold "Talmy, D." on every publication, preprint, oral and poster entry in
all years; underline trainees in the research group. Replace the three
"Boldened names..." legends with an underline legend.

Co-Authored-By: Claude Sonnet 5.5 <noreply@anthropic.com>
</commit_message>
<xml_diff>
--- a/cv.docx
+++ b/cv.docx
@@ -945,7 +945,7 @@
           <w:sz w:val="24"/>
           <w:szCs w:val="24"/>
         </w:rPr>
-        <w:t>Boldened names indicate people in my research group</w:t>
+        <w:t xml:space="preserve">Underlined names indicate trainees in my research group</w:t>
       </w:r>
     </w:p>
     <w:p>
@@ -1064,10 +1064,9 @@
       </w:r>
       <w:r>
         <w:rPr>
-          <w:b/>
-          <w:bCs/>
-          <w:sz w:val="24"/>
-          <w:szCs w:val="24"/>
+          <w:sz w:val="24"/>
+          <w:szCs w:val="24"/>
+          <w:u w:val="single"/>
         </w:rPr>
         <w:t xml:space="preserve">Carr, E.</w:t>
       </w:r>
@@ -1140,12 +1139,27 @@
       </w:pPr>
       <w:r>
         <w:rPr>
+          <w:sz w:val="24"/>
+          <w:szCs w:val="24"/>
+          <w:u w:val="single"/>
+        </w:rPr>
+        <w:t xml:space="preserve">McCullough, D.K.</w:t>
+      </w:r>
+      <w:r>
+        <w:rPr>
+          <w:sz w:val="24"/>
+          <w:szCs w:val="24"/>
+        </w:rPr>
+        <w:t xml:space="preserve">, </w:t>
+      </w:r>
+      <w:r>
+        <w:rPr>
           <w:b/>
           <w:bCs/>
           <w:sz w:val="24"/>
           <w:szCs w:val="24"/>
         </w:rPr>
-        <w:t xml:space="preserve">McCullough, D.K., Talmy, D.</w:t>
+        <w:t xml:space="preserve">Talmy, D.</w:t>
       </w:r>
       <w:r>
         <w:rPr>
@@ -1207,10 +1221,9 @@
       </w:r>
       <w:r>
         <w:rPr>
-          <w:b/>
-          <w:bCs/>
-          <w:sz w:val="24"/>
-          <w:szCs w:val="24"/>
+          <w:sz w:val="24"/>
+          <w:szCs w:val="24"/>
+          <w:u w:val="single"/>
         </w:rPr>
         <w:t xml:space="preserve">Carr, E.</w:t>
       </w:r>
@@ -1283,10 +1296,9 @@
       </w:pPr>
       <w:r>
         <w:rPr>
-          <w:b/>
-          <w:bCs/>
-          <w:sz w:val="24"/>
-          <w:szCs w:val="24"/>
+          <w:sz w:val="24"/>
+          <w:szCs w:val="24"/>
+          <w:u w:val="single"/>
         </w:rPr>
         <w:t xml:space="preserve">McCullough, D.K.</w:t>
       </w:r>
@@ -1426,10 +1438,9 @@
       </w:r>
       <w:r>
         <w:rPr>
-          <w:b/>
-          <w:bCs/>
-          <w:sz w:val="24"/>
-          <w:szCs w:val="24"/>
+          <w:sz w:val="24"/>
+          <w:szCs w:val="24"/>
+          <w:u w:val="single"/>
         </w:rPr>
         <w:t xml:space="preserve">McCullough, D.K.</w:t>
       </w:r>
@@ -1641,7 +1652,37 @@
           <w:sz w:val="24"/>
           <w:szCs w:val="24"/>
         </w:rPr>
-        <w:t xml:space="preserve">Talmy, D., Carr, E., Rajakaruna, H.</w:t>
+        <w:t xml:space="preserve">Talmy, D.</w:t>
+      </w:r>
+      <w:r>
+        <w:rPr>
+          <w:sz w:val="24"/>
+          <w:szCs w:val="24"/>
+        </w:rPr>
+        <w:t xml:space="preserve">, </w:t>
+      </w:r>
+      <w:r>
+        <w:rPr>
+          <w:sz w:val="24"/>
+          <w:szCs w:val="24"/>
+          <w:u w:val="single"/>
+        </w:rPr>
+        <w:t xml:space="preserve">Carr, E.</w:t>
+      </w:r>
+      <w:r>
+        <w:rPr>
+          <w:sz w:val="24"/>
+          <w:szCs w:val="24"/>
+        </w:rPr>
+        <w:t xml:space="preserve">, </w:t>
+      </w:r>
+      <w:r>
+        <w:rPr>
+          <w:sz w:val="24"/>
+          <w:szCs w:val="24"/>
+          <w:u w:val="single"/>
+        </w:rPr>
+        <w:t xml:space="preserve">Rajakaruna, H.</w:t>
       </w:r>
       <w:r>
         <w:rPr>
@@ -1770,12 +1811,27 @@
       </w:r>
       <w:r>
         <w:rPr>
+          <w:sz w:val="24"/>
+          <w:szCs w:val="24"/>
+          <w:u w:val="single"/>
+        </w:rPr>
+        <w:t xml:space="preserve">Rajakaruna, H.</w:t>
+      </w:r>
+      <w:r>
+        <w:rPr>
+          <w:sz w:val="24"/>
+          <w:szCs w:val="24"/>
+        </w:rPr>
+        <w:t xml:space="preserve">, </w:t>
+      </w:r>
+      <w:r>
+        <w:rPr>
           <w:b/>
           <w:bCs/>
           <w:sz w:val="24"/>
           <w:szCs w:val="24"/>
         </w:rPr>
-        <w:t xml:space="preserve">Rajakaruna, H., Talmy, D.</w:t>
+        <w:t xml:space="preserve">Talmy, D.</w:t>
       </w:r>
       <w:r>
         <w:rPr>
@@ -1830,12 +1886,86 @@
       </w:pPr>
       <w:r>
         <w:rPr>
-          <w:b/>
-          <w:bCs/>
-          <w:sz w:val="24"/>
-          <w:szCs w:val="24"/>
-        </w:rPr>
-        <w:t xml:space="preserve">Hinson, A., Papoulis, S., Fiet, L., Knight, M., Cho, P., Szeltner, B.</w:t>
+          <w:sz w:val="24"/>
+          <w:szCs w:val="24"/>
+          <w:u w:val="single"/>
+        </w:rPr>
+        <w:t xml:space="preserve">Hinson, A.</w:t>
+      </w:r>
+      <w:r>
+        <w:rPr>
+          <w:sz w:val="24"/>
+          <w:szCs w:val="24"/>
+        </w:rPr>
+        <w:t xml:space="preserve">, </w:t>
+      </w:r>
+      <w:r>
+        <w:rPr>
+          <w:sz w:val="24"/>
+          <w:szCs w:val="24"/>
+          <w:u w:val="single"/>
+        </w:rPr>
+        <w:t xml:space="preserve">Papoulis, S.</w:t>
+      </w:r>
+      <w:r>
+        <w:rPr>
+          <w:sz w:val="24"/>
+          <w:szCs w:val="24"/>
+        </w:rPr>
+        <w:t xml:space="preserve">, </w:t>
+      </w:r>
+      <w:r>
+        <w:rPr>
+          <w:sz w:val="24"/>
+          <w:szCs w:val="24"/>
+          <w:u w:val="single"/>
+        </w:rPr>
+        <w:t xml:space="preserve">Fiet, L.</w:t>
+      </w:r>
+      <w:r>
+        <w:rPr>
+          <w:sz w:val="24"/>
+          <w:szCs w:val="24"/>
+        </w:rPr>
+        <w:t xml:space="preserve">, </w:t>
+      </w:r>
+      <w:r>
+        <w:rPr>
+          <w:sz w:val="24"/>
+          <w:szCs w:val="24"/>
+          <w:u w:val="single"/>
+        </w:rPr>
+        <w:t xml:space="preserve">Knight, M.</w:t>
+      </w:r>
+      <w:r>
+        <w:rPr>
+          <w:sz w:val="24"/>
+          <w:szCs w:val="24"/>
+        </w:rPr>
+        <w:t xml:space="preserve">, </w:t>
+      </w:r>
+      <w:r>
+        <w:rPr>
+          <w:sz w:val="24"/>
+          <w:szCs w:val="24"/>
+          <w:u w:val="single"/>
+        </w:rPr>
+        <w:t xml:space="preserve">Cho, P.</w:t>
+      </w:r>
+      <w:r>
+        <w:rPr>
+          <w:sz w:val="24"/>
+          <w:szCs w:val="24"/>
+        </w:rPr>
+        <w:t xml:space="preserve">, </w:t>
+      </w:r>
+      <w:r>
+        <w:rPr>
+          <w:sz w:val="24"/>
+          <w:szCs w:val="24"/>
+          <w:u w:val="single"/>
+        </w:rPr>
+        <w:t xml:space="preserve">Szeltner, B.</w:t>
       </w:r>
       <w:r>
         <w:rPr>
@@ -1906,12 +2036,26 @@
       </w:pPr>
       <w:r>
         <w:rPr>
-          <w:b/>
-          <w:bCs/>
-          <w:sz w:val="24"/>
-          <w:szCs w:val="24"/>
-        </w:rPr>
-        <w:t xml:space="preserve">Rajakaruna, H., Carr, E.</w:t>
+          <w:sz w:val="24"/>
+          <w:szCs w:val="24"/>
+          <w:u w:val="single"/>
+        </w:rPr>
+        <w:t xml:space="preserve">Rajakaruna, H.</w:t>
+      </w:r>
+      <w:r>
+        <w:rPr>
+          <w:sz w:val="24"/>
+          <w:szCs w:val="24"/>
+        </w:rPr>
+        <w:t xml:space="preserve">, </w:t>
+      </w:r>
+      <w:r>
+        <w:rPr>
+          <w:sz w:val="24"/>
+          <w:szCs w:val="24"/>
+          <w:u w:val="single"/>
+        </w:rPr>
+        <w:t xml:space="preserve">Carr, E.</w:t>
       </w:r>
       <w:r>
         <w:rPr>
@@ -2243,10 +2387,9 @@
       </w:pPr>
       <w:r>
         <w:rPr>
-          <w:b/>
-          <w:bCs/>
-          <w:sz w:val="24"/>
-          <w:szCs w:val="24"/>
+          <w:sz w:val="24"/>
+          <w:szCs w:val="24"/>
+          <w:u w:val="single"/>
         </w:rPr>
         <w:t xml:space="preserve">Papoulis, S.E.</w:t>
       </w:r>
@@ -2849,7 +2992,23 @@
           <w:sz w:val="24"/>
           <w:szCs w:val="24"/>
         </w:rPr>
-        <w:t xml:space="preserve">Omta, A.W., Talmy, D., Sher, D., Finkel, Z.V., Irwin, A.J., Follows, M.J. (2017). Extracting phytoplankton physiological traits from batch and chemostat culture data. </w:t>
+        <w:t xml:space="preserve">Omta, A.W., </w:t>
+      </w:r>
+      <w:r>
+        <w:rPr>
+          <w:b/>
+          <w:bCs/>
+          <w:sz w:val="24"/>
+          <w:szCs w:val="24"/>
+        </w:rPr>
+        <w:t xml:space="preserve">Talmy, D.</w:t>
+      </w:r>
+      <w:r>
+        <w:rPr>
+          <w:sz w:val="24"/>
+          <w:szCs w:val="24"/>
+        </w:rPr>
+        <w:t xml:space="preserve">, Sher, D., Finkel, Z.V., Irwin, A.J., Follows, M.J. (2017). Extracting phytoplankton physiological traits from batch and chemostat culture data. </w:t>
       </w:r>
       <w:r>
         <w:rPr>
@@ -2900,7 +3059,23 @@
           <w:sz w:val="24"/>
           <w:szCs w:val="24"/>
         </w:rPr>
-        <w:t xml:space="preserve">Li, G., Talmy, D., Campbell, D.A. (2017). Diatom growth responses to photoperiod and light are predictable from diel reductant generation. </w:t>
+        <w:t xml:space="preserve">Li, G., </w:t>
+      </w:r>
+      <w:r>
+        <w:rPr>
+          <w:b/>
+          <w:bCs/>
+          <w:sz w:val="24"/>
+          <w:szCs w:val="24"/>
+        </w:rPr>
+        <w:t xml:space="preserve">Talmy, D.</w:t>
+      </w:r>
+      <w:r>
+        <w:rPr>
+          <w:sz w:val="24"/>
+          <w:szCs w:val="24"/>
+        </w:rPr>
+        <w:t xml:space="preserve">, Campbell, D.A. (2017). Diatom growth responses to photoperiod and light are predictable from diel reductant generation. </w:t>
       </w:r>
       <w:r>
         <w:rPr>
@@ -2951,7 +3126,23 @@
           <w:sz w:val="24"/>
           <w:szCs w:val="24"/>
         </w:rPr>
-        <w:t xml:space="preserve">Record, N.R., Talmy, D., Våge, S. (2016). Quantifying tradeoffs for marine viruses. </w:t>
+        <w:t xml:space="preserve">Record, N.R., </w:t>
+      </w:r>
+      <w:r>
+        <w:rPr>
+          <w:b/>
+          <w:bCs/>
+          <w:sz w:val="24"/>
+          <w:szCs w:val="24"/>
+        </w:rPr>
+        <w:t xml:space="preserve">Talmy, D.</w:t>
+      </w:r>
+      <w:r>
+        <w:rPr>
+          <w:sz w:val="24"/>
+          <w:szCs w:val="24"/>
+        </w:rPr>
+        <w:t xml:space="preserve">, Våge, S. (2016). Quantifying tradeoffs for marine viruses. </w:t>
       </w:r>
       <w:r>
         <w:rPr>
@@ -3002,7 +3193,23 @@
           <w:sz w:val="24"/>
           <w:szCs w:val="24"/>
         </w:rPr>
-        <w:t xml:space="preserve">Lopez, J.S., Garcia, N.S., Talmy, D., Martiny, A.C. (2016). Diel variability in the elemental composition of the marine cyanobacterium </w:t>
+        <w:t xml:space="preserve">Lopez, J.S., Garcia, N.S., </w:t>
+      </w:r>
+      <w:r>
+        <w:rPr>
+          <w:b/>
+          <w:bCs/>
+          <w:sz w:val="24"/>
+          <w:szCs w:val="24"/>
+        </w:rPr>
+        <w:t xml:space="preserve">Talmy, D.</w:t>
+      </w:r>
+      <w:r>
+        <w:rPr>
+          <w:sz w:val="24"/>
+          <w:szCs w:val="24"/>
+        </w:rPr>
+        <w:t xml:space="preserve">, Martiny, A.C. (2016). Diel variability in the elemental composition of the marine cyanobacterium </w:t>
       </w:r>
       <w:r>
         <w:rPr>
@@ -3066,10 +3273,19 @@
       </w:pPr>
       <w:r>
         <w:rPr>
-          <w:sz w:val="24"/>
-          <w:szCs w:val="24"/>
-        </w:rPr>
-        <w:t xml:space="preserve">Talmy, D., Martiny, A.C., Hill, C.N., Hickman, A.E., Follows, M.J. (2016). Microzooplankton regulation of surface ocean POC:PON ratios. </w:t>
+          <w:b/>
+          <w:bCs/>
+          <w:sz w:val="24"/>
+          <w:szCs w:val="24"/>
+        </w:rPr>
+        <w:t xml:space="preserve">Talmy, D.</w:t>
+      </w:r>
+      <w:r>
+        <w:rPr>
+          <w:sz w:val="24"/>
+          <w:szCs w:val="24"/>
+        </w:rPr>
+        <w:t xml:space="preserve">, Martiny, A.C., Hill, C.N., Hickman, A.E., Follows, M.J. (2016). Microzooplankton regulation of surface ocean POC:PON ratios. </w:t>
       </w:r>
       <w:r>
         <w:rPr>
@@ -3117,10 +3333,19 @@
       </w:pPr>
       <w:r>
         <w:rPr>
-          <w:sz w:val="24"/>
-          <w:szCs w:val="24"/>
-        </w:rPr>
-        <w:t xml:space="preserve">Talmy, D., Blackford, J., Hardman-Mountford, N.J., Polimene, L., Follows, M.J., Geider, R.J. (2014). Flexible C:N ratio enhances metabolism of large phytoplankton when resource supply is intermittent. </w:t>
+          <w:b/>
+          <w:bCs/>
+          <w:sz w:val="24"/>
+          <w:szCs w:val="24"/>
+        </w:rPr>
+        <w:t xml:space="preserve">Talmy, D.</w:t>
+      </w:r>
+      <w:r>
+        <w:rPr>
+          <w:sz w:val="24"/>
+          <w:szCs w:val="24"/>
+        </w:rPr>
+        <w:t xml:space="preserve">, Blackford, J., Hardman-Mountford, N.J., Polimene, L., Follows, M.J., Geider, R.J. (2014). Flexible C:N ratio enhances metabolism of large phytoplankton when resource supply is intermittent. </w:t>
       </w:r>
       <w:r>
         <w:rPr>
@@ -3168,10 +3393,19 @@
       </w:pPr>
       <w:r>
         <w:rPr>
-          <w:sz w:val="24"/>
-          <w:szCs w:val="24"/>
-        </w:rPr>
-        <w:t xml:space="preserve">Talmy, D., Blackford, J., Hardman-Mountford, N.J., Dumbrell, A.J., Geider, R.J. (2013). An optimality model of photoadaptation in contrasting aquatic light regimes. </w:t>
+          <w:b/>
+          <w:bCs/>
+          <w:sz w:val="24"/>
+          <w:szCs w:val="24"/>
+        </w:rPr>
+        <w:t xml:space="preserve">Talmy, D.</w:t>
+      </w:r>
+      <w:r>
+        <w:rPr>
+          <w:sz w:val="24"/>
+          <w:szCs w:val="24"/>
+        </w:rPr>
+        <w:t xml:space="preserve">, Blackford, J., Hardman-Mountford, N.J., Dumbrell, A.J., Geider, R.J. (2013). An optimality model of photoadaptation in contrasting aquatic light regimes. </w:t>
       </w:r>
       <w:r>
         <w:rPr>
@@ -3255,7 +3489,22 @@
           <w:sz w:val="24"/>
           <w:szCs w:val="24"/>
         </w:rPr>
-        <w:t xml:space="preserve">Talmy, D., Carr, E.</w:t>
+        <w:t xml:space="preserve">Talmy, D.</w:t>
+      </w:r>
+      <w:r>
+        <w:rPr>
+          <w:sz w:val="24"/>
+          <w:szCs w:val="24"/>
+        </w:rPr>
+        <w:t xml:space="preserve">, </w:t>
+      </w:r>
+      <w:r>
+        <w:rPr>
+          <w:sz w:val="24"/>
+          <w:szCs w:val="24"/>
+          <w:u w:val="single"/>
+        </w:rPr>
+        <w:t xml:space="preserve">Carr, E.</w:t>
       </w:r>
       <w:r>
         <w:rPr>
@@ -3317,10 +3566,9 @@
       </w:r>
       <w:r>
         <w:rPr>
-          <w:b/>
-          <w:bCs/>
-          <w:sz w:val="24"/>
-          <w:szCs w:val="24"/>
+          <w:sz w:val="24"/>
+          <w:szCs w:val="24"/>
+          <w:u w:val="single"/>
         </w:rPr>
         <w:t xml:space="preserve">Carr, E.</w:t>
       </w:r>
@@ -5278,7 +5526,7 @@
           <w:sz w:val="24"/>
           <w:szCs w:val="24"/>
         </w:rPr>
-        <w:t>Boldened names indicate people in my research group</w:t>
+        <w:t xml:space="preserve">Underlined names indicate trainees in my research group</w:t>
       </w:r>
     </w:p>
     <w:p>
@@ -5369,19 +5617,95 @@
       </w:pPr>
       <w:r>
         <w:rPr>
+          <w:sz w:val="24"/>
+          <w:szCs w:val="24"/>
+          <w:u w:val="single"/>
+        </w:rPr>
+        <w:t xml:space="preserve">Carr, E.</w:t>
+      </w:r>
+      <w:r>
+        <w:rPr>
+          <w:sz w:val="24"/>
+          <w:szCs w:val="24"/>
+        </w:rPr>
+        <w:t xml:space="preserve">, </w:t>
+      </w:r>
+      <w:r>
+        <w:rPr>
+          <w:sz w:val="24"/>
+          <w:szCs w:val="24"/>
+          <w:u w:val="single"/>
+        </w:rPr>
+        <w:t xml:space="preserve">Rajakaruna, H.</w:t>
+      </w:r>
+      <w:r>
+        <w:rPr>
+          <w:sz w:val="24"/>
+          <w:szCs w:val="24"/>
+        </w:rPr>
+        <w:t xml:space="preserve">, Våge, S., Omta, A.W., </w:t>
+      </w:r>
+      <w:r>
+        <w:rPr>
           <w:b/>
           <w:bCs/>
           <w:sz w:val="24"/>
           <w:szCs w:val="24"/>
         </w:rPr>
-        <w:t xml:space="preserve">Carr, E.</w:t>
-      </w:r>
-      <w:r>
-        <w:rPr>
-          <w:sz w:val="24"/>
-          <w:szCs w:val="24"/>
-        </w:rPr>
-        <w:t xml:space="preserve">, </w:t>
+        <w:t xml:space="preserve">Talmy, D.</w:t>
+      </w:r>
+      <w:r>
+        <w:rPr>
+          <w:sz w:val="24"/>
+          <w:szCs w:val="24"/>
+        </w:rPr>
+        <w:t xml:space="preserve"> Killing the predator: impacts of top-predator mortality on global ocean ecosystem structure. Aquatic Sciences Meeting, Palma de Mallorca, Spain, June 9</w:t>
+      </w:r>
+      <w:r>
+        <w:rPr>
+          <w:sz w:val="24"/>
+          <w:szCs w:val="24"/>
+          <w:vertAlign w:val="superscript"/>
+        </w:rPr>
+        <w:t xml:space="preserve">th</w:t>
+      </w:r>
+      <w:r>
+        <w:rPr>
+          <w:sz w:val="24"/>
+          <w:szCs w:val="24"/>
+        </w:rPr>
+        <w:t xml:space="preserve">, 2023.</w:t>
+      </w:r>
+    </w:p>
+    <w:p>
+      <w:pPr>
+        <w:rPr>
+          <w:sz w:val="24"/>
+          <w:szCs w:val="24"/>
+        </w:rPr>
+      </w:pPr>
+    </w:p>
+    <w:p>
+      <w:pPr>
+        <w:rPr>
+          <w:sz w:val="24"/>
+          <w:szCs w:val="24"/>
+        </w:rPr>
+      </w:pPr>
+      <w:r>
+        <w:rPr>
+          <w:sz w:val="24"/>
+          <w:szCs w:val="24"/>
+          <w:u w:val="single"/>
+        </w:rPr>
+        <w:t xml:space="preserve">McCullough, D.K.</w:t>
+      </w:r>
+      <w:r>
+        <w:rPr>
+          <w:sz w:val="24"/>
+          <w:szCs w:val="24"/>
+        </w:rPr>
+        <w:t xml:space="preserve">, Calfee, B., Zinser, E.R., </w:t>
       </w:r>
       <w:r>
         <w:rPr>
@@ -5390,14 +5714,60 @@
           <w:sz w:val="24"/>
           <w:szCs w:val="24"/>
         </w:rPr>
-        <w:t xml:space="preserve">Rajakaruna, H.</w:t>
-      </w:r>
-      <w:r>
-        <w:rPr>
-          <w:sz w:val="24"/>
-          <w:szCs w:val="24"/>
-        </w:rPr>
-        <w:t xml:space="preserve">, Våge, S., Omta, A.W., </w:t>
+        <w:t xml:space="preserve">Talmy, D.</w:t>
+      </w:r>
+      <w:r>
+        <w:rPr>
+          <w:sz w:val="24"/>
+          <w:szCs w:val="24"/>
+        </w:rPr>
+        <w:t xml:space="preserve"> Modeling the intersection of nutrient limitation and hydrogen peroxide on surface microbial communities. Aquatic Sciences Meeting, Palma de Mallorca, Spain, June 5</w:t>
+      </w:r>
+      <w:r>
+        <w:rPr>
+          <w:sz w:val="24"/>
+          <w:szCs w:val="24"/>
+          <w:vertAlign w:val="superscript"/>
+        </w:rPr>
+        <w:t xml:space="preserve">th</w:t>
+      </w:r>
+      <w:r>
+        <w:rPr>
+          <w:sz w:val="24"/>
+          <w:szCs w:val="24"/>
+        </w:rPr>
+        <w:t xml:space="preserve">, 2023.</w:t>
+      </w:r>
+    </w:p>
+    <w:p>
+      <w:pPr>
+        <w:rPr>
+          <w:sz w:val="24"/>
+          <w:szCs w:val="24"/>
+        </w:rPr>
+      </w:pPr>
+    </w:p>
+    <w:p>
+      <w:pPr>
+        <w:rPr>
+          <w:sz w:val="24"/>
+          <w:szCs w:val="24"/>
+        </w:rPr>
+      </w:pPr>
+      <w:r>
+        <w:rPr>
+          <w:sz w:val="24"/>
+          <w:szCs w:val="24"/>
+          <w:u w:val="single"/>
+        </w:rPr>
+        <w:t xml:space="preserve">Papoulis, S.E.</w:t>
+      </w:r>
+      <w:r>
+        <w:rPr>
+          <w:sz w:val="24"/>
+          <w:szCs w:val="24"/>
+        </w:rPr>
+        <w:t xml:space="preserve">, Wilhelm, S.W., </w:t>
       </w:r>
       <w:r>
         <w:rPr>
@@ -5413,7 +5783,7 @@
           <w:sz w:val="24"/>
           <w:szCs w:val="24"/>
         </w:rPr>
-        <w:t xml:space="preserve"> Killing the predator: impacts of top-predator mortality on global ocean ecosystem structure. Aquatic Sciences Meeting, Palma de Mallorca, Spain, June 9</w:t>
+        <w:t xml:space="preserve">, Zinser, E.R. Nutrient enrichment and predation defense drive cyanobacteria population dynamics. Ocean Sciences Meeting, Virtual, March 3</w:t>
       </w:r>
       <w:r>
         <w:rPr>
@@ -5421,31 +5791,61 @@
           <w:szCs w:val="24"/>
           <w:vertAlign w:val="superscript"/>
         </w:rPr>
-        <w:t xml:space="preserve">th</w:t>
-      </w:r>
-      <w:r>
-        <w:rPr>
-          <w:sz w:val="24"/>
-          <w:szCs w:val="24"/>
-        </w:rPr>
-        <w:t xml:space="preserve">, 2023.</w:t>
-      </w:r>
-    </w:p>
-    <w:p>
-      <w:pPr>
-        <w:rPr>
-          <w:sz w:val="24"/>
-          <w:szCs w:val="24"/>
-        </w:rPr>
-      </w:pPr>
-    </w:p>
-    <w:p>
-      <w:pPr>
-        <w:rPr>
-          <w:sz w:val="24"/>
-          <w:szCs w:val="24"/>
-        </w:rPr>
-      </w:pPr>
+        <w:t xml:space="preserve">rd</w:t>
+      </w:r>
+      <w:r>
+        <w:rPr>
+          <w:sz w:val="24"/>
+          <w:szCs w:val="24"/>
+        </w:rPr>
+        <w:t xml:space="preserve">, 2022.</w:t>
+      </w:r>
+    </w:p>
+    <w:p>
+      <w:pPr>
+        <w:rPr>
+          <w:sz w:val="24"/>
+          <w:szCs w:val="24"/>
+        </w:rPr>
+      </w:pPr>
+    </w:p>
+    <w:p>
+      <w:pPr>
+        <w:rPr>
+          <w:sz w:val="24"/>
+          <w:szCs w:val="24"/>
+        </w:rPr>
+      </w:pPr>
+      <w:r>
+        <w:rPr>
+          <w:sz w:val="24"/>
+          <w:szCs w:val="24"/>
+          <w:u w:val="single"/>
+        </w:rPr>
+        <w:t xml:space="preserve">Rajakaruna, H.</w:t>
+      </w:r>
+      <w:r>
+        <w:rPr>
+          <w:sz w:val="24"/>
+          <w:szCs w:val="24"/>
+        </w:rPr>
+        <w:t xml:space="preserve">, Omta, A.W., </w:t>
+      </w:r>
+      <w:r>
+        <w:rPr>
+          <w:sz w:val="24"/>
+          <w:szCs w:val="24"/>
+          <w:u w:val="single"/>
+        </w:rPr>
+        <w:t xml:space="preserve">Carr, E.</w:t>
+      </w:r>
+      <w:r>
+        <w:rPr>
+          <w:sz w:val="24"/>
+          <w:szCs w:val="24"/>
+        </w:rPr>
+        <w:t xml:space="preserve">, </w:t>
+      </w:r>
       <w:r>
         <w:rPr>
           <w:b/>
@@ -5453,15 +5853,46 @@
           <w:sz w:val="24"/>
           <w:szCs w:val="24"/>
         </w:rPr>
-        <w:t xml:space="preserve">McCullough, D.K.</w:t>
-      </w:r>
-      <w:r>
-        <w:rPr>
-          <w:sz w:val="24"/>
-          <w:szCs w:val="24"/>
-        </w:rPr>
-        <w:t xml:space="preserve">, Calfee, B., Zinser, E.R., </w:t>
-      </w:r>
+        <w:t xml:space="preserve">Talmy, D.</w:t>
+      </w:r>
+      <w:r>
+        <w:rPr>
+          <w:sz w:val="24"/>
+          <w:szCs w:val="24"/>
+        </w:rPr>
+        <w:t xml:space="preserve"> The power-law biomass scaling relationship in natural microbial ecosystems. Ocean Sciences Meeting, Virtual, March 4</w:t>
+      </w:r>
+      <w:r>
+        <w:rPr>
+          <w:sz w:val="24"/>
+          <w:szCs w:val="24"/>
+          <w:vertAlign w:val="superscript"/>
+        </w:rPr>
+        <w:t xml:space="preserve">th</w:t>
+      </w:r>
+      <w:r>
+        <w:rPr>
+          <w:sz w:val="24"/>
+          <w:szCs w:val="24"/>
+        </w:rPr>
+        <w:t xml:space="preserve">, 2022.</w:t>
+      </w:r>
+    </w:p>
+    <w:p>
+      <w:pPr>
+        <w:rPr>
+          <w:sz w:val="24"/>
+          <w:szCs w:val="24"/>
+        </w:rPr>
+      </w:pPr>
+    </w:p>
+    <w:p>
+      <w:pPr>
+        <w:rPr>
+          <w:sz w:val="24"/>
+          <w:szCs w:val="24"/>
+        </w:rPr>
+      </w:pPr>
       <w:r>
         <w:rPr>
           <w:b/>
@@ -5476,7 +5907,7 @@
           <w:sz w:val="24"/>
           <w:szCs w:val="24"/>
         </w:rPr>
-        <w:t xml:space="preserve"> Modeling the intersection of nutrient limitation and hydrogen peroxide on surface microbial communities. Aquatic Sciences Meeting, Palma de Mallorca, Spain, June 5</w:t>
+        <w:t xml:space="preserve">, Våge, S., Cael, B.B., Follows, M.J. Trade-offs modify ecosystem biomass structure along trophic gradients. 4</w:t>
       </w:r>
       <w:r>
         <w:rPr>
@@ -5491,24 +5922,54 @@
           <w:sz w:val="24"/>
           <w:szCs w:val="24"/>
         </w:rPr>
-        <w:t xml:space="preserve">, 2023.</w:t>
-      </w:r>
-    </w:p>
-    <w:p>
-      <w:pPr>
-        <w:rPr>
-          <w:sz w:val="24"/>
-          <w:szCs w:val="24"/>
-        </w:rPr>
-      </w:pPr>
-    </w:p>
-    <w:p>
-      <w:pPr>
-        <w:rPr>
-          <w:sz w:val="24"/>
-          <w:szCs w:val="24"/>
-        </w:rPr>
-      </w:pPr>
+        <w:t xml:space="preserve"> workshop on trait-based approaches to ocean life, Buckinghamshire, UK, August 18</w:t>
+      </w:r>
+      <w:r>
+        <w:rPr>
+          <w:sz w:val="24"/>
+          <w:szCs w:val="24"/>
+          <w:vertAlign w:val="superscript"/>
+        </w:rPr>
+        <w:t xml:space="preserve">th</w:t>
+      </w:r>
+      <w:r>
+        <w:rPr>
+          <w:sz w:val="24"/>
+          <w:szCs w:val="24"/>
+        </w:rPr>
+        <w:t xml:space="preserve">, 2019.</w:t>
+      </w:r>
+    </w:p>
+    <w:p>
+      <w:pPr>
+        <w:rPr>
+          <w:sz w:val="24"/>
+          <w:szCs w:val="24"/>
+        </w:rPr>
+      </w:pPr>
+    </w:p>
+    <w:p>
+      <w:pPr>
+        <w:rPr>
+          <w:sz w:val="24"/>
+          <w:szCs w:val="24"/>
+        </w:rPr>
+      </w:pPr>
+      <w:r>
+        <w:rPr>
+          <w:sz w:val="24"/>
+          <w:szCs w:val="24"/>
+          <w:u w:val="single"/>
+        </w:rPr>
+        <w:t xml:space="preserve">Showalter, G.M.</w:t>
+      </w:r>
+      <w:r>
+        <w:rPr>
+          <w:sz w:val="24"/>
+          <w:szCs w:val="24"/>
+        </w:rPr>
+        <w:t xml:space="preserve">, </w:t>
+      </w:r>
       <w:r>
         <w:rPr>
           <w:b/>
@@ -5516,14 +5977,60 @@
           <w:sz w:val="24"/>
           <w:szCs w:val="24"/>
         </w:rPr>
-        <w:t>Papoulis, S.E.</w:t>
-      </w:r>
-      <w:r>
-        <w:rPr>
-          <w:sz w:val="24"/>
-          <w:szCs w:val="24"/>
-        </w:rPr>
-        <w:t xml:space="preserve">, Wilhelm, S.W., </w:t>
+        <w:t xml:space="preserve">Talmy, D.</w:t>
+      </w:r>
+      <w:r>
+        <w:rPr>
+          <w:sz w:val="24"/>
+          <w:szCs w:val="24"/>
+        </w:rPr>
+        <w:t xml:space="preserve">, Deming, J.W. Modeling virus-host dynamics in sea ice brines. International Symposium on Sea Ice, Winnipeg, Manitoba, Canada, August 17-21</w:t>
+      </w:r>
+      <w:r>
+        <w:rPr>
+          <w:sz w:val="24"/>
+          <w:szCs w:val="24"/>
+          <w:vertAlign w:val="superscript"/>
+        </w:rPr>
+        <w:t xml:space="preserve">st</w:t>
+      </w:r>
+      <w:r>
+        <w:rPr>
+          <w:sz w:val="24"/>
+          <w:szCs w:val="24"/>
+        </w:rPr>
+        <w:t xml:space="preserve">, 2019.</w:t>
+      </w:r>
+    </w:p>
+    <w:p>
+      <w:pPr>
+        <w:rPr>
+          <w:sz w:val="24"/>
+          <w:szCs w:val="24"/>
+        </w:rPr>
+      </w:pPr>
+    </w:p>
+    <w:p>
+      <w:pPr>
+        <w:rPr>
+          <w:sz w:val="24"/>
+          <w:szCs w:val="24"/>
+        </w:rPr>
+      </w:pPr>
+      <w:r>
+        <w:rPr>
+          <w:sz w:val="24"/>
+          <w:szCs w:val="24"/>
+          <w:u w:val="single"/>
+        </w:rPr>
+        <w:t xml:space="preserve">Hinson, A.</w:t>
+      </w:r>
+      <w:r>
+        <w:rPr>
+          <w:sz w:val="24"/>
+          <w:szCs w:val="24"/>
+        </w:rPr>
+        <w:t xml:space="preserve">, </w:t>
       </w:r>
       <w:r>
         <w:rPr>
@@ -5532,14 +6039,14 @@
           <w:sz w:val="24"/>
           <w:szCs w:val="24"/>
         </w:rPr>
-        <w:t>Talmy, D.</w:t>
-      </w:r>
-      <w:r>
-        <w:rPr>
-          <w:sz w:val="24"/>
-          <w:szCs w:val="24"/>
-        </w:rPr>
-        <w:t>, Zinser, E.R. Nutrient enrichment and predation defense drive cyanobacteria population dynamics. Ocean Sciences Meeting, Virtual, March 3</w:t>
+        <w:t xml:space="preserve">Talmy, D.</w:t>
+      </w:r>
+      <w:r>
+        <w:rPr>
+          <w:sz w:val="24"/>
+          <w:szCs w:val="24"/>
+        </w:rPr>
+        <w:t xml:space="preserve"> What controls algal-virus population dynamics in diverse systems? Aquatic Sciences Meeting, San Juan, Puerto Rico, February 26</w:t>
       </w:r>
       <w:r>
         <w:rPr>
@@ -5547,14 +6054,14 @@
           <w:szCs w:val="24"/>
           <w:vertAlign w:val="superscript"/>
         </w:rPr>
-        <w:t>rd</w:t>
-      </w:r>
-      <w:r>
-        <w:rPr>
-          <w:sz w:val="24"/>
-          <w:szCs w:val="24"/>
-        </w:rPr>
-        <w:t>, 2022.</w:t>
+        <w:t xml:space="preserve">th</w:t>
+      </w:r>
+      <w:r>
+        <w:rPr>
+          <w:sz w:val="24"/>
+          <w:szCs w:val="24"/>
+        </w:rPr>
+        <w:t xml:space="preserve">, 2019.</w:t>
       </w:r>
     </w:p>
     <w:p>
@@ -5579,15 +6086,61 @@
           <w:sz w:val="24"/>
           <w:szCs w:val="24"/>
         </w:rPr>
-        <w:t xml:space="preserve">Rajakaruna, H.</w:t>
-      </w:r>
-      <w:r>
-        <w:rPr>
-          <w:sz w:val="24"/>
-          <w:szCs w:val="24"/>
-        </w:rPr>
-        <w:t xml:space="preserve">, Omta, A.W., </w:t>
-      </w:r>
+        <w:t xml:space="preserve">Talmy, D.</w:t>
+      </w:r>
+      <w:r>
+        <w:rPr>
+          <w:sz w:val="24"/>
+          <w:szCs w:val="24"/>
+        </w:rPr>
+        <w:t xml:space="preserve">, Bidle, K.D., Kranzler, C., Thamatrakoln, K. Inferring nutrient and light sensitivity of phytoplankton host-virus metabolism from laboratory population dynamics. 9</w:t>
+      </w:r>
+      <w:r>
+        <w:rPr>
+          <w:sz w:val="24"/>
+          <w:szCs w:val="24"/>
+          <w:vertAlign w:val="superscript"/>
+        </w:rPr>
+        <w:t xml:space="preserve">th</w:t>
+      </w:r>
+      <w:r>
+        <w:rPr>
+          <w:sz w:val="24"/>
+          <w:szCs w:val="24"/>
+        </w:rPr>
+        <w:t xml:space="preserve"> Aquatic Virus Workshop, Lincoln, Nebraska, USA, June 20</w:t>
+      </w:r>
+      <w:r>
+        <w:rPr>
+          <w:sz w:val="24"/>
+          <w:szCs w:val="24"/>
+          <w:vertAlign w:val="superscript"/>
+        </w:rPr>
+        <w:t xml:space="preserve">th</w:t>
+      </w:r>
+      <w:r>
+        <w:rPr>
+          <w:sz w:val="24"/>
+          <w:szCs w:val="24"/>
+        </w:rPr>
+        <w:t xml:space="preserve">, 2018.</w:t>
+      </w:r>
+    </w:p>
+    <w:p>
+      <w:pPr>
+        <w:rPr>
+          <w:sz w:val="24"/>
+          <w:szCs w:val="24"/>
+        </w:rPr>
+      </w:pPr>
+    </w:p>
+    <w:p>
+      <w:pPr>
+        <w:rPr>
+          <w:sz w:val="24"/>
+          <w:szCs w:val="24"/>
+        </w:rPr>
+      </w:pPr>
       <w:r>
         <w:rPr>
           <w:b/>
@@ -5595,14 +6148,14 @@
           <w:sz w:val="24"/>
           <w:szCs w:val="24"/>
         </w:rPr>
-        <w:t xml:space="preserve">Carr, E., Talmy, D.</w:t>
-      </w:r>
-      <w:r>
-        <w:rPr>
-          <w:sz w:val="24"/>
-          <w:szCs w:val="24"/>
-        </w:rPr>
-        <w:t xml:space="preserve"> The power-law biomass scaling relationship in natural microbial ecosystems. Ocean Sciences Meeting, Virtual, March 4</w:t>
+        <w:t xml:space="preserve">Talmy, D.</w:t>
+      </w:r>
+      <w:r>
+        <w:rPr>
+          <w:sz w:val="24"/>
+          <w:szCs w:val="24"/>
+        </w:rPr>
+        <w:t xml:space="preserve">, Zakem, E., Follows, M.J. Modeling competitive interactions among viruses and microzooplankton grazers in the global ocean. Ocean Sciences Meeting, Portland, Oregon, USA, February 15</w:t>
       </w:r>
       <w:r>
         <w:rPr>
@@ -5617,7 +6170,7 @@
           <w:sz w:val="24"/>
           <w:szCs w:val="24"/>
         </w:rPr>
-        <w:t xml:space="preserve">, 2022.</w:t>
+        <w:t xml:space="preserve">, 2018.</w:t>
       </w:r>
     </w:p>
     <w:p>
@@ -5649,7 +6202,7 @@
           <w:sz w:val="24"/>
           <w:szCs w:val="24"/>
         </w:rPr>
-        <w:t xml:space="preserve">, Våge, S., Cael, B.B., Follows, M.J. Trade-offs modify ecosystem biomass structure along trophic gradients. 4</w:t>
+        <w:t xml:space="preserve">, Follett, C.L., Follows, M.J. Does viral lysis influence dissolved organic matter elemental composition? Aquatic Sciences Meeting, Honolulu, Hawaii, USA, February 28</w:t>
       </w:r>
       <w:r>
         <w:rPr>
@@ -5664,27 +6217,13 @@
           <w:sz w:val="24"/>
           <w:szCs w:val="24"/>
         </w:rPr>
-        <w:t xml:space="preserve"> workshop on trait-based approaches to ocean life, Buckinghamshire, UK, August 18</w:t>
-      </w:r>
-      <w:r>
-        <w:rPr>
-          <w:sz w:val="24"/>
-          <w:szCs w:val="24"/>
-          <w:vertAlign w:val="superscript"/>
-        </w:rPr>
-        <w:t xml:space="preserve">th</w:t>
-      </w:r>
-      <w:r>
-        <w:rPr>
-          <w:sz w:val="24"/>
-          <w:szCs w:val="24"/>
-        </w:rPr>
-        <w:t xml:space="preserve">, 2019.</w:t>
-      </w:r>
-    </w:p>
-    <w:p>
-      <w:pPr>
-        <w:rPr>
+        <w:t xml:space="preserve">, 2017.</w:t>
+      </w:r>
+    </w:p>
+    <w:p>
+      <w:pPr>
+        <w:rPr>
+          <w:b/>
           <w:sz w:val="24"/>
           <w:szCs w:val="24"/>
         </w:rPr>
@@ -5704,14 +6243,30 @@
           <w:sz w:val="24"/>
           <w:szCs w:val="24"/>
         </w:rPr>
-        <w:t>Showalter, G.M., Talmy, D.</w:t>
-      </w:r>
-      <w:r>
-        <w:rPr>
-          <w:sz w:val="24"/>
-          <w:szCs w:val="24"/>
-        </w:rPr>
-        <w:t>, Deming, J.W. Modeling virus-host dynamics in sea ice brines. International Symposium on Sea Ice, Winnipeg, Manitoba, Canada, August 17-21</w:t>
+        <w:t xml:space="preserve">Talmy, D.</w:t>
+      </w:r>
+      <w:r>
+        <w:rPr>
+          <w:sz w:val="24"/>
+          <w:szCs w:val="24"/>
+        </w:rPr>
+        <w:t xml:space="preserve">, Thamatrakoln, K., Bidle, K.D., Follows, M.J. How does viral infection of </w:t>
+      </w:r>
+      <w:r>
+        <w:rPr>
+          <w:i/>
+          <w:iCs/>
+          <w:sz w:val="24"/>
+          <w:szCs w:val="24"/>
+        </w:rPr>
+        <w:t xml:space="preserve">Emiliania huxleyi</w:t>
+      </w:r>
+      <w:r>
+        <w:rPr>
+          <w:sz w:val="24"/>
+          <w:szCs w:val="24"/>
+        </w:rPr>
+        <w:t xml:space="preserve"> depend on ambient irradiance? Monteiro group meeting, University of Bristol, Bristol, UK, July 26</w:t>
       </w:r>
       <w:r>
         <w:rPr>
@@ -5719,19 +6274,20 @@
           <w:szCs w:val="24"/>
           <w:vertAlign w:val="superscript"/>
         </w:rPr>
-        <w:t>st</w:t>
-      </w:r>
-      <w:r>
-        <w:rPr>
-          <w:sz w:val="24"/>
-          <w:szCs w:val="24"/>
-        </w:rPr>
-        <w:t>, 2019.</w:t>
-      </w:r>
-    </w:p>
-    <w:p>
-      <w:pPr>
-        <w:rPr>
+        <w:t xml:space="preserve">th</w:t>
+      </w:r>
+      <w:r>
+        <w:rPr>
+          <w:sz w:val="24"/>
+          <w:szCs w:val="24"/>
+        </w:rPr>
+        <w:t xml:space="preserve">, 2016.</w:t>
+      </w:r>
+    </w:p>
+    <w:p>
+      <w:pPr>
+        <w:rPr>
+          <w:b/>
           <w:sz w:val="24"/>
           <w:szCs w:val="24"/>
         </w:rPr>
@@ -5751,14 +6307,14 @@
           <w:sz w:val="24"/>
           <w:szCs w:val="24"/>
         </w:rPr>
-        <w:t xml:space="preserve">Hinson, A., Talmy, D.</w:t>
-      </w:r>
-      <w:r>
-        <w:rPr>
-          <w:sz w:val="24"/>
-          <w:szCs w:val="24"/>
-        </w:rPr>
-        <w:t xml:space="preserve"> What controls algal-virus population dynamics in diverse systems? Aquatic Sciences Meeting, San Juan, Puerto Rico, February 26</w:t>
+        <w:t xml:space="preserve">Talmy, D.</w:t>
+      </w:r>
+      <w:r>
+        <w:rPr>
+          <w:sz w:val="24"/>
+          <w:szCs w:val="24"/>
+        </w:rPr>
+        <w:t xml:space="preserve">, Hussain, F., Follows, M.J. The influence of lytic vs. lysogenic viral reproduction on host-virus populations. 8</w:t>
       </w:r>
       <w:r>
         <w:rPr>
@@ -5773,12 +6329,28 @@
           <w:sz w:val="24"/>
           <w:szCs w:val="24"/>
         </w:rPr>
-        <w:t xml:space="preserve">, 2019.</w:t>
-      </w:r>
-    </w:p>
-    <w:p>
-      <w:pPr>
-        <w:rPr>
+        <w:t xml:space="preserve"> Aquatic Virus Workshop, Plymouth, UK, July 11</w:t>
+      </w:r>
+      <w:r>
+        <w:rPr>
+          <w:sz w:val="24"/>
+          <w:szCs w:val="24"/>
+          <w:vertAlign w:val="superscript"/>
+        </w:rPr>
+        <w:t xml:space="preserve">th</w:t>
+      </w:r>
+      <w:r>
+        <w:rPr>
+          <w:sz w:val="24"/>
+          <w:szCs w:val="24"/>
+        </w:rPr>
+        <w:t xml:space="preserve">, 2016.</w:t>
+      </w:r>
+    </w:p>
+    <w:p>
+      <w:pPr>
+        <w:rPr>
+          <w:b/>
           <w:sz w:val="24"/>
           <w:szCs w:val="24"/>
         </w:rPr>
@@ -5805,7 +6377,7 @@
           <w:sz w:val="24"/>
           <w:szCs w:val="24"/>
         </w:rPr>
-        <w:t xml:space="preserve">, Bidle, K.D., Kranzler, C., Thamatrakoln, K. Inferring nutrient and light sensitivity of phytoplankton host-virus metabolism from laboratory population dynamics. 9</w:t>
+        <w:t xml:space="preserve">, Martiny, A.C., Hickman, A.E., Hill, C.N., Follows, M.J. Microzooplankton regulation of surface ocean POC:PON ratios. Ocean Sciences Meeting, New Orleans, Louisiana, USA, February 25</w:t>
       </w:r>
       <w:r>
         <w:rPr>
@@ -5820,274 +6392,81 @@
           <w:sz w:val="24"/>
           <w:szCs w:val="24"/>
         </w:rPr>
-        <w:t xml:space="preserve"> Aquatic Virus Workshop, Lincoln, Nebraska, USA, June 20</w:t>
-      </w:r>
-      <w:r>
-        <w:rPr>
-          <w:sz w:val="24"/>
-          <w:szCs w:val="24"/>
-          <w:vertAlign w:val="superscript"/>
-        </w:rPr>
-        <w:t xml:space="preserve">th</w:t>
-      </w:r>
-      <w:r>
-        <w:rPr>
-          <w:sz w:val="24"/>
-          <w:szCs w:val="24"/>
-        </w:rPr>
-        <w:t xml:space="preserve">, 2018.</w:t>
-      </w:r>
-    </w:p>
-    <w:p>
-      <w:pPr>
-        <w:rPr>
-          <w:sz w:val="24"/>
-          <w:szCs w:val="24"/>
-        </w:rPr>
-      </w:pPr>
-    </w:p>
-    <w:p>
-      <w:pPr>
-        <w:rPr>
-          <w:sz w:val="24"/>
-          <w:szCs w:val="24"/>
-        </w:rPr>
-      </w:pPr>
-      <w:r>
+        <w:t xml:space="preserve">, 2016.</w:t>
+      </w:r>
+    </w:p>
+    <w:p>
+      <w:pPr>
+        <w:rPr>
+          <w:sz w:val="24"/>
+          <w:szCs w:val="24"/>
+        </w:rPr>
+      </w:pPr>
+    </w:p>
+    <w:p>
+      <w:pPr>
+        <w:keepNext/>
         <w:rPr>
           <w:b/>
           <w:bCs/>
           <w:sz w:val="24"/>
           <w:szCs w:val="24"/>
         </w:rPr>
-        <w:t>Talmy, D.</w:t>
-      </w:r>
-      <w:r>
-        <w:rPr>
-          <w:sz w:val="24"/>
-          <w:szCs w:val="24"/>
-        </w:rPr>
-        <w:t>, Zakem, E., Follows, M.J. Modeling competitive interactions among viruses and microzooplankton grazers in the global ocean. Ocean Sciences Meeting, Portland, Oregon, USA, February 15</w:t>
-      </w:r>
-      <w:r>
-        <w:rPr>
-          <w:sz w:val="24"/>
-          <w:szCs w:val="24"/>
-          <w:vertAlign w:val="superscript"/>
-        </w:rPr>
-        <w:t>th</w:t>
-      </w:r>
-      <w:r>
-        <w:rPr>
-          <w:sz w:val="24"/>
-          <w:szCs w:val="24"/>
-        </w:rPr>
-        <w:t>, 2018.</w:t>
-      </w:r>
-    </w:p>
-    <w:p>
-      <w:pPr>
-        <w:rPr>
-          <w:sz w:val="24"/>
-          <w:szCs w:val="24"/>
-        </w:rPr>
-      </w:pPr>
-    </w:p>
-    <w:p>
-      <w:pPr>
-        <w:rPr>
-          <w:sz w:val="24"/>
-          <w:szCs w:val="24"/>
-        </w:rPr>
-      </w:pPr>
-      <w:r>
-        <w:rPr>
-          <w:sz w:val="24"/>
-          <w:szCs w:val="24"/>
-        </w:rPr>
-        <w:t>Talmy, D., Follett, C.L., Follows, M.J. Does viral lysis influence dissolved organic matter elemental composition? Aquatic Sciences Meeting, Honolulu, Hawaii, USA, February 28</w:t>
-      </w:r>
-      <w:r>
-        <w:rPr>
-          <w:sz w:val="24"/>
-          <w:szCs w:val="24"/>
-          <w:vertAlign w:val="superscript"/>
-        </w:rPr>
-        <w:t>th</w:t>
-      </w:r>
-      <w:r>
-        <w:rPr>
-          <w:sz w:val="24"/>
-          <w:szCs w:val="24"/>
-        </w:rPr>
-        <w:t>, 2017.</w:t>
-      </w:r>
-    </w:p>
-    <w:p>
-      <w:pPr>
-        <w:rPr>
-          <w:b/>
-          <w:sz w:val="24"/>
-          <w:szCs w:val="24"/>
-        </w:rPr>
-      </w:pPr>
-    </w:p>
-    <w:p>
-      <w:pPr>
-        <w:rPr>
-          <w:sz w:val="24"/>
-          <w:szCs w:val="24"/>
-        </w:rPr>
-      </w:pPr>
-      <w:r>
-        <w:rPr>
-          <w:sz w:val="24"/>
-          <w:szCs w:val="24"/>
-        </w:rPr>
-        <w:lastRenderedPageBreak/>
-        <w:t xml:space="preserve">Talmy, D., Thamatrakoln, K., Bidle, K.D., Follows, M.J. How does viral infection of </w:t>
-      </w:r>
-      <w:r>
-        <w:rPr>
-          <w:i/>
-          <w:sz w:val="24"/>
-          <w:szCs w:val="24"/>
-        </w:rPr>
-        <w:t xml:space="preserve">Emiliania huxleyi</w:t>
-      </w:r>
-      <w:r>
-        <w:rPr>
-          <w:sz w:val="24"/>
-          <w:szCs w:val="24"/>
-        </w:rPr>
-        <w:t xml:space="preserve"> depend on ambient irradiance? Monteiro group meeting, University of Bristol, Bristol, UK, July 26</w:t>
-      </w:r>
-      <w:r>
-        <w:rPr>
-          <w:sz w:val="24"/>
-          <w:szCs w:val="24"/>
-          <w:vertAlign w:val="superscript"/>
-        </w:rPr>
-        <w:t>th</w:t>
-      </w:r>
-      <w:r>
-        <w:rPr>
-          <w:sz w:val="24"/>
-          <w:szCs w:val="24"/>
-        </w:rPr>
-        <w:t>, 2016.</w:t>
-      </w:r>
-    </w:p>
-    <w:p>
-      <w:pPr>
-        <w:rPr>
-          <w:b/>
-          <w:sz w:val="24"/>
-          <w:szCs w:val="24"/>
-        </w:rPr>
-      </w:pPr>
-    </w:p>
-    <w:p>
-      <w:pPr>
-        <w:rPr>
-          <w:sz w:val="24"/>
-          <w:szCs w:val="24"/>
-        </w:rPr>
-      </w:pPr>
-      <w:r>
-        <w:rPr>
-          <w:sz w:val="24"/>
-          <w:szCs w:val="24"/>
-        </w:rPr>
-        <w:t>Talmy, D., Hussain, F., Follows, M.J. The influence of lytic vs. lysogenic viral reproduction on host-virus populations. 8</w:t>
-      </w:r>
-      <w:r>
-        <w:rPr>
-          <w:sz w:val="24"/>
-          <w:szCs w:val="24"/>
-          <w:vertAlign w:val="superscript"/>
-        </w:rPr>
-        <w:t>th</w:t>
-      </w:r>
-      <w:r>
-        <w:rPr>
-          <w:sz w:val="24"/>
-          <w:szCs w:val="24"/>
-        </w:rPr>
-        <w:t xml:space="preserve"> Aquatic Virus Workshop, Plymouth, UK, July 11</w:t>
-      </w:r>
-      <w:r>
-        <w:rPr>
-          <w:sz w:val="24"/>
-          <w:szCs w:val="24"/>
-          <w:vertAlign w:val="superscript"/>
-        </w:rPr>
-        <w:t>th</w:t>
-      </w:r>
-      <w:r>
-        <w:rPr>
-          <w:sz w:val="24"/>
-          <w:szCs w:val="24"/>
-        </w:rPr>
-        <w:t>, 2016.</w:t>
-      </w:r>
-    </w:p>
-    <w:p>
-      <w:pPr>
-        <w:rPr>
-          <w:b/>
-          <w:sz w:val="24"/>
-          <w:szCs w:val="24"/>
-        </w:rPr>
-      </w:pPr>
-    </w:p>
-    <w:p>
-      <w:pPr>
-        <w:rPr>
-          <w:sz w:val="24"/>
-          <w:szCs w:val="24"/>
-        </w:rPr>
-      </w:pPr>
-      <w:r>
-        <w:rPr>
-          <w:sz w:val="24"/>
-          <w:szCs w:val="24"/>
-        </w:rPr>
-        <w:t>Talmy, D., Martiny, A.C., Hickman, A.E., Hill, C.N., Follows, M.J. Microzooplankton regulation of surface ocean POC:PON ratios. Ocean Sciences Meeting, New Orleans, Louisiana, USA, February 25</w:t>
-      </w:r>
-      <w:r>
-        <w:rPr>
-          <w:sz w:val="24"/>
-          <w:szCs w:val="24"/>
-          <w:vertAlign w:val="superscript"/>
-        </w:rPr>
-        <w:t>th</w:t>
-      </w:r>
-      <w:r>
-        <w:rPr>
-          <w:sz w:val="24"/>
-          <w:szCs w:val="24"/>
-        </w:rPr>
-        <w:t>, 2016.</w:t>
-      </w:r>
-    </w:p>
-    <w:p>
-      <w:pPr>
-        <w:rPr>
-          <w:sz w:val="24"/>
-          <w:szCs w:val="24"/>
-        </w:rPr>
-      </w:pPr>
-    </w:p>
-    <w:p>
-      <w:pPr>
-        <w:keepNext/>
+      </w:pPr>
+      <w:r>
         <w:rPr>
           <w:b/>
           <w:bCs/>
           <w:sz w:val="24"/>
           <w:szCs w:val="24"/>
         </w:rPr>
+        <w:t>Poster Presentations</w:t>
+      </w:r>
+    </w:p>
+    <w:p>
+      <w:pPr>
+        <w:keepNext/>
+        <w:rPr>
+          <w:sz w:val="24"/>
+          <w:szCs w:val="24"/>
+        </w:rPr>
+      </w:pPr>
+    </w:p>
+    <w:p>
+      <w:pPr>
+        <w:keepNext/>
+        <w:rPr>
+          <w:i/>
+          <w:iCs/>
+          <w:sz w:val="24"/>
+          <w:szCs w:val="24"/>
+        </w:rPr>
+      </w:pPr>
+      <w:r>
+        <w:rPr>
+          <w:i/>
+          <w:iCs/>
+          <w:sz w:val="24"/>
+          <w:szCs w:val="24"/>
+        </w:rPr>
+        <w:t xml:space="preserve">Underlined names indicate trainees in my research group</w:t>
+      </w:r>
+    </w:p>
+    <w:p>
+      <w:pPr>
+        <w:keepNext/>
+        <w:rPr>
+          <w:sz w:val="24"/>
+          <w:szCs w:val="24"/>
+        </w:rPr>
+      </w:pPr>
+    </w:p>
+    <w:p>
+      <w:pPr>
+        <w:rPr>
+          <w:sz w:val="24"/>
+          <w:szCs w:val="24"/>
+        </w:rPr>
       </w:pPr>
       <w:r>
         <w:rPr>
@@ -6096,54 +6475,285 @@
           <w:sz w:val="24"/>
           <w:szCs w:val="24"/>
         </w:rPr>
-        <w:t>Poster Presentations</w:t>
-      </w:r>
-    </w:p>
-    <w:p>
-      <w:pPr>
-        <w:keepNext/>
-        <w:rPr>
-          <w:sz w:val="24"/>
-          <w:szCs w:val="24"/>
-        </w:rPr>
-      </w:pPr>
-    </w:p>
-    <w:p>
-      <w:pPr>
-        <w:keepNext/>
+        <w:t xml:space="preserve">Talmy, D.</w:t>
+      </w:r>
+      <w:r>
+        <w:rPr>
+          <w:sz w:val="24"/>
+          <w:szCs w:val="24"/>
+        </w:rPr>
+        <w:t xml:space="preserve">, </w:t>
+      </w:r>
+      <w:r>
+        <w:rPr>
+          <w:sz w:val="24"/>
+          <w:szCs w:val="24"/>
+          <w:u w:val="single"/>
+        </w:rPr>
+        <w:t xml:space="preserve">Carr, E.</w:t>
+      </w:r>
+      <w:r>
+        <w:rPr>
+          <w:sz w:val="24"/>
+          <w:szCs w:val="24"/>
+        </w:rPr>
+        <w:t xml:space="preserve"> Modeling community dynamics: impacts of hydrogen peroxide on marine cyanobacteria composition. BioGeoScapes / C-CoMP Modeling Workshop, Woods Hole Oceanographic Institution, Massachusetts, USA, September 10</w:t>
+      </w:r>
+      <w:r>
+        <w:rPr>
+          <w:sz w:val="24"/>
+          <w:szCs w:val="24"/>
+          <w:vertAlign w:val="superscript"/>
+        </w:rPr>
+        <w:t xml:space="preserve">th</w:t>
+      </w:r>
+      <w:r>
+        <w:rPr>
+          <w:sz w:val="24"/>
+          <w:szCs w:val="24"/>
+        </w:rPr>
+        <w:t xml:space="preserve">, 2025.</w:t>
+      </w:r>
+    </w:p>
+    <w:p>
+      <w:pPr>
+        <w:rPr>
+          <w:sz w:val="24"/>
+          <w:szCs w:val="24"/>
+        </w:rPr>
+      </w:pPr>
+    </w:p>
+    <w:p>
+      <w:pPr>
+        <w:rPr>
+          <w:sz w:val="24"/>
+          <w:szCs w:val="24"/>
+        </w:rPr>
+      </w:pPr>
+      <w:r>
+        <w:rPr>
+          <w:b/>
+          <w:bCs/>
+          <w:sz w:val="24"/>
+          <w:szCs w:val="24"/>
+        </w:rPr>
+        <w:t xml:space="preserve">Talmy, D.</w:t>
+      </w:r>
+      <w:r>
+        <w:rPr>
+          <w:sz w:val="24"/>
+          <w:szCs w:val="24"/>
+        </w:rPr>
+        <w:t xml:space="preserve">, </w:t>
+      </w:r>
+      <w:r>
+        <w:rPr>
+          <w:sz w:val="24"/>
+          <w:szCs w:val="24"/>
+          <w:u w:val="single"/>
+        </w:rPr>
+        <w:t xml:space="preserve">Carr, E.</w:t>
+      </w:r>
+      <w:r>
+        <w:rPr>
+          <w:sz w:val="24"/>
+          <w:szCs w:val="24"/>
+        </w:rPr>
+        <w:t xml:space="preserve">, Weitz, J., Dutkiewicz, S. Can viral induced mortality be represented implicitly and capture marine ecological dynamics? BioGeoScapes / C-CoMP Modeling Workshop, Woods Hole Oceanographic Institution, Massachusetts, USA, September 10</w:t>
+      </w:r>
+      <w:r>
+        <w:rPr>
+          <w:sz w:val="24"/>
+          <w:szCs w:val="24"/>
+          <w:vertAlign w:val="superscript"/>
+        </w:rPr>
+        <w:t xml:space="preserve">th</w:t>
+      </w:r>
+      <w:r>
+        <w:rPr>
+          <w:sz w:val="24"/>
+          <w:szCs w:val="24"/>
+        </w:rPr>
+        <w:t xml:space="preserve">, 2025.</w:t>
+      </w:r>
+    </w:p>
+    <w:p>
+      <w:pPr>
+        <w:rPr>
+          <w:sz w:val="24"/>
+          <w:szCs w:val="24"/>
+        </w:rPr>
+      </w:pPr>
+    </w:p>
+    <w:p>
+      <w:pPr>
+        <w:rPr>
+          <w:sz w:val="24"/>
+          <w:szCs w:val="24"/>
+        </w:rPr>
+      </w:pPr>
+      <w:r>
+        <w:rPr>
+          <w:b/>
+          <w:bCs/>
+          <w:sz w:val="24"/>
+          <w:szCs w:val="24"/>
+        </w:rPr>
+        <w:t xml:space="preserve">Talmy, D.</w:t>
+      </w:r>
+      <w:r>
+        <w:rPr>
+          <w:sz w:val="24"/>
+          <w:szCs w:val="24"/>
+        </w:rPr>
+        <w:t xml:space="preserve">, </w:t>
+      </w:r>
+      <w:r>
+        <w:rPr>
+          <w:sz w:val="24"/>
+          <w:szCs w:val="24"/>
+          <w:u w:val="single"/>
+        </w:rPr>
+        <w:t xml:space="preserve">Carr, E.</w:t>
+      </w:r>
+      <w:r>
+        <w:rPr>
+          <w:sz w:val="24"/>
+          <w:szCs w:val="24"/>
+        </w:rPr>
+        <w:t xml:space="preserve">, Dutkiewicz, S., Weitz, J. Can viral induced mortality be represented implicitly and capture marine ecological dynamics? ASLO Aquatic Sciences Meeting, Charlotte, NC, USA, March 27</w:t>
+      </w:r>
+      <w:r>
+        <w:rPr>
+          <w:sz w:val="24"/>
+          <w:szCs w:val="24"/>
+          <w:vertAlign w:val="superscript"/>
+        </w:rPr>
+        <w:t xml:space="preserve">th</w:t>
+      </w:r>
+      <w:r>
+        <w:rPr>
+          <w:sz w:val="24"/>
+          <w:szCs w:val="24"/>
+        </w:rPr>
+        <w:t xml:space="preserve">, 2025.</w:t>
+      </w:r>
+    </w:p>
+    <w:p>
+      <w:pPr>
+        <w:rPr>
+          <w:sz w:val="24"/>
+          <w:szCs w:val="24"/>
+        </w:rPr>
+      </w:pPr>
+    </w:p>
+    <w:p>
+      <w:pPr>
+        <w:rPr>
+          <w:sz w:val="24"/>
+          <w:szCs w:val="24"/>
+        </w:rPr>
+      </w:pPr>
+      <w:r>
+        <w:rPr>
+          <w:sz w:val="24"/>
+          <w:szCs w:val="24"/>
+        </w:rPr>
+        <w:t xml:space="preserve">Hambrick, K.M., Smith, L.E., Martin, R.M., Stark, G.F., </w:t>
+      </w:r>
+      <w:r>
+        <w:rPr>
+          <w:b/>
+          <w:bCs/>
+          <w:sz w:val="24"/>
+          <w:szCs w:val="24"/>
+        </w:rPr>
+        <w:t xml:space="preserve">Talmy, D.</w:t>
+      </w:r>
+      <w:r>
+        <w:rPr>
+          <w:sz w:val="24"/>
+          <w:szCs w:val="24"/>
+        </w:rPr>
+        <w:t xml:space="preserve">, Wilhelm, S.W., Zinser, E.R. Temperature correlates with phage resistance in </w:t>
+      </w:r>
+      <w:r>
         <w:rPr>
           <w:i/>
           <w:iCs/>
           <w:sz w:val="24"/>
           <w:szCs w:val="24"/>
         </w:rPr>
-      </w:pPr>
-      <w:r>
-        <w:rPr>
-          <w:i/>
-          <w:iCs/>
-          <w:sz w:val="24"/>
-          <w:szCs w:val="24"/>
-        </w:rPr>
-        <w:t>Boldened names indicate people in my research group</w:t>
-      </w:r>
-    </w:p>
-    <w:p>
-      <w:pPr>
-        <w:keepNext/>
-        <w:rPr>
-          <w:sz w:val="24"/>
-          <w:szCs w:val="24"/>
-        </w:rPr>
-      </w:pPr>
-    </w:p>
-    <w:p>
-      <w:pPr>
-        <w:rPr>
-          <w:sz w:val="24"/>
-          <w:szCs w:val="24"/>
-        </w:rPr>
-      </w:pPr>
+        <w:t xml:space="preserve">Microcystis aeruginosa</w:t>
+      </w:r>
+      <w:r>
+        <w:rPr>
+          <w:sz w:val="24"/>
+          <w:szCs w:val="24"/>
+        </w:rPr>
+        <w:t xml:space="preserve"> NIES-298. ASLO Aquatic Sciences Meeting, Charlotte, NC, USA, March 27</w:t>
+      </w:r>
+      <w:r>
+        <w:rPr>
+          <w:sz w:val="24"/>
+          <w:szCs w:val="24"/>
+          <w:vertAlign w:val="superscript"/>
+        </w:rPr>
+        <w:t xml:space="preserve">th</w:t>
+      </w:r>
+      <w:r>
+        <w:rPr>
+          <w:sz w:val="24"/>
+          <w:szCs w:val="24"/>
+        </w:rPr>
+        <w:t xml:space="preserve">, 2025.</w:t>
+      </w:r>
+    </w:p>
+    <w:p>
+      <w:pPr>
+        <w:rPr>
+          <w:sz w:val="24"/>
+          <w:szCs w:val="24"/>
+        </w:rPr>
+      </w:pPr>
+    </w:p>
+    <w:p>
+      <w:pPr>
+        <w:rPr>
+          <w:sz w:val="24"/>
+          <w:szCs w:val="24"/>
+        </w:rPr>
+      </w:pPr>
+      <w:r>
+        <w:rPr>
+          <w:sz w:val="24"/>
+          <w:szCs w:val="24"/>
+          <w:u w:val="single"/>
+        </w:rPr>
+        <w:t xml:space="preserve">Carr, E.</w:t>
+      </w:r>
+      <w:r>
+        <w:rPr>
+          <w:sz w:val="24"/>
+          <w:szCs w:val="24"/>
+        </w:rPr>
+        <w:t xml:space="preserve">, </w:t>
+      </w:r>
+      <w:r>
+        <w:rPr>
+          <w:sz w:val="24"/>
+          <w:szCs w:val="24"/>
+          <w:u w:val="single"/>
+        </w:rPr>
+        <w:t xml:space="preserve">Rajakaruna, H.</w:t>
+      </w:r>
+      <w:r>
+        <w:rPr>
+          <w:sz w:val="24"/>
+          <w:szCs w:val="24"/>
+        </w:rPr>
+        <w:t xml:space="preserve">, </w:t>
+      </w:r>
       <w:r>
         <w:rPr>
           <w:b/>
@@ -6151,14 +6761,14 @@
           <w:sz w:val="24"/>
           <w:szCs w:val="24"/>
         </w:rPr>
-        <w:t xml:space="preserve">Talmy, D., Carr, E.</w:t>
-      </w:r>
-      <w:r>
-        <w:rPr>
-          <w:sz w:val="24"/>
-          <w:szCs w:val="24"/>
-        </w:rPr>
-        <w:t xml:space="preserve"> Modeling community dynamics: impacts of hydrogen peroxide on marine cyanobacteria composition. BioGeoScapes / C-CoMP Modeling Workshop, Woods Hole Oceanographic Institution, Massachusetts, USA, September 10</w:t>
+        <w:t xml:space="preserve">Talmy, D.</w:t>
+      </w:r>
+      <w:r>
+        <w:rPr>
+          <w:sz w:val="24"/>
+          <w:szCs w:val="24"/>
+        </w:rPr>
+        <w:t xml:space="preserve"> On the influence of mortality on microbial predator-prey relationships in the surface ocean. 5</w:t>
       </w:r>
       <w:r>
         <w:rPr>
@@ -6173,24 +6783,54 @@
           <w:sz w:val="24"/>
           <w:szCs w:val="24"/>
         </w:rPr>
-        <w:t xml:space="preserve">, 2025.</w:t>
-      </w:r>
-    </w:p>
-    <w:p>
-      <w:pPr>
-        <w:rPr>
-          <w:sz w:val="24"/>
-          <w:szCs w:val="24"/>
-        </w:rPr>
-      </w:pPr>
-    </w:p>
-    <w:p>
-      <w:pPr>
-        <w:rPr>
-          <w:sz w:val="24"/>
-          <w:szCs w:val="24"/>
-        </w:rPr>
-      </w:pPr>
+        <w:t xml:space="preserve"> workshop on trait-based approaches to ocean life, Knoxville, TN, January 27</w:t>
+      </w:r>
+      <w:r>
+        <w:rPr>
+          <w:sz w:val="24"/>
+          <w:szCs w:val="24"/>
+          <w:vertAlign w:val="superscript"/>
+        </w:rPr>
+        <w:t xml:space="preserve">th</w:t>
+      </w:r>
+      <w:r>
+        <w:rPr>
+          <w:sz w:val="24"/>
+          <w:szCs w:val="24"/>
+        </w:rPr>
+        <w:t xml:space="preserve">, 2022.</w:t>
+      </w:r>
+    </w:p>
+    <w:p>
+      <w:pPr>
+        <w:rPr>
+          <w:sz w:val="24"/>
+          <w:szCs w:val="24"/>
+        </w:rPr>
+      </w:pPr>
+    </w:p>
+    <w:p>
+      <w:pPr>
+        <w:rPr>
+          <w:sz w:val="24"/>
+          <w:szCs w:val="24"/>
+        </w:rPr>
+      </w:pPr>
+      <w:r>
+        <w:rPr>
+          <w:sz w:val="24"/>
+          <w:szCs w:val="24"/>
+          <w:u w:val="single"/>
+        </w:rPr>
+        <w:t xml:space="preserve">McCullough, D.K.</w:t>
+      </w:r>
+      <w:r>
+        <w:rPr>
+          <w:sz w:val="24"/>
+          <w:szCs w:val="24"/>
+        </w:rPr>
+        <w:t xml:space="preserve">, Calfee, B., Zinser, E.R., </w:t>
+      </w:r>
       <w:r>
         <w:rPr>
           <w:b/>
@@ -6198,14 +6838,14 @@
           <w:sz w:val="24"/>
           <w:szCs w:val="24"/>
         </w:rPr>
-        <w:t xml:space="preserve">Talmy, D., Carr, E.</w:t>
-      </w:r>
-      <w:r>
-        <w:rPr>
-          <w:sz w:val="24"/>
-          <w:szCs w:val="24"/>
-        </w:rPr>
-        <w:t xml:space="preserve">, Weitz, J., Dutkiewicz, S. Can viral induced mortality be represented implicitly and capture marine ecological dynamics? BioGeoScapes / C-CoMP Modeling Workshop, Woods Hole Oceanographic Institution, Massachusetts, USA, September 10</w:t>
+        <w:t xml:space="preserve">Talmy, D.</w:t>
+      </w:r>
+      <w:r>
+        <w:rPr>
+          <w:sz w:val="24"/>
+          <w:szCs w:val="24"/>
+        </w:rPr>
+        <w:t xml:space="preserve"> Toward a general model of the effects of exogenous reactive oxygen on bacterial community dynamics. 5</w:t>
       </w:r>
       <w:r>
         <w:rPr>
@@ -6220,24 +6860,69 @@
           <w:sz w:val="24"/>
           <w:szCs w:val="24"/>
         </w:rPr>
-        <w:t xml:space="preserve">, 2025.</w:t>
-      </w:r>
-    </w:p>
-    <w:p>
-      <w:pPr>
-        <w:rPr>
-          <w:sz w:val="24"/>
-          <w:szCs w:val="24"/>
-        </w:rPr>
-      </w:pPr>
-    </w:p>
-    <w:p>
-      <w:pPr>
-        <w:rPr>
-          <w:sz w:val="24"/>
-          <w:szCs w:val="24"/>
-        </w:rPr>
-      </w:pPr>
+        <w:t xml:space="preserve"> workshop on trait-based approaches to ocean life, Knoxville, TN, January 27</w:t>
+      </w:r>
+      <w:r>
+        <w:rPr>
+          <w:sz w:val="24"/>
+          <w:szCs w:val="24"/>
+          <w:vertAlign w:val="superscript"/>
+        </w:rPr>
+        <w:t xml:space="preserve">th</w:t>
+      </w:r>
+      <w:r>
+        <w:rPr>
+          <w:sz w:val="24"/>
+          <w:szCs w:val="24"/>
+        </w:rPr>
+        <w:t xml:space="preserve">, 2022.</w:t>
+      </w:r>
+    </w:p>
+    <w:p>
+      <w:pPr>
+        <w:rPr>
+          <w:sz w:val="24"/>
+          <w:szCs w:val="24"/>
+        </w:rPr>
+      </w:pPr>
+    </w:p>
+    <w:p>
+      <w:pPr>
+        <w:rPr>
+          <w:sz w:val="24"/>
+          <w:szCs w:val="24"/>
+        </w:rPr>
+      </w:pPr>
+      <w:r>
+        <w:rPr>
+          <w:sz w:val="24"/>
+          <w:szCs w:val="24"/>
+          <w:u w:val="single"/>
+        </w:rPr>
+        <w:t xml:space="preserve">Rajakaruna, H.</w:t>
+      </w:r>
+      <w:r>
+        <w:rPr>
+          <w:sz w:val="24"/>
+          <w:szCs w:val="24"/>
+        </w:rPr>
+        <w:t xml:space="preserve">, Omta, A.W., </w:t>
+      </w:r>
+      <w:r>
+        <w:rPr>
+          <w:sz w:val="24"/>
+          <w:szCs w:val="24"/>
+          <w:u w:val="single"/>
+        </w:rPr>
+        <w:t xml:space="preserve">Carr, E.</w:t>
+      </w:r>
+      <w:r>
+        <w:rPr>
+          <w:sz w:val="24"/>
+          <w:szCs w:val="24"/>
+        </w:rPr>
+        <w:t xml:space="preserve">, </w:t>
+      </w:r>
       <w:r>
         <w:rPr>
           <w:b/>
@@ -6245,14 +6930,14 @@
           <w:sz w:val="24"/>
           <w:szCs w:val="24"/>
         </w:rPr>
-        <w:t>Talmy, D., Carr, E.</w:t>
-      </w:r>
-      <w:r>
-        <w:rPr>
-          <w:sz w:val="24"/>
-          <w:szCs w:val="24"/>
-        </w:rPr>
-        <w:t xml:space="preserve">, Dutkiewicz, S., Weitz, J. Can viral induced mortality be represented implicitly and capture marine ecological dynamics? ASLO Aquatic Sciences Meeting, Charlotte, NC, USA, March 27</w:t>
+        <w:t xml:space="preserve">Talmy, D.</w:t>
+      </w:r>
+      <w:r>
+        <w:rPr>
+          <w:sz w:val="24"/>
+          <w:szCs w:val="24"/>
+        </w:rPr>
+        <w:t xml:space="preserve"> The power-law biomass scaling relationship in natural microbial ecosystems. 5</w:t>
       </w:r>
       <w:r>
         <w:rPr>
@@ -6260,37 +6945,60 @@
           <w:szCs w:val="24"/>
           <w:vertAlign w:val="superscript"/>
         </w:rPr>
-        <w:t>th</w:t>
-      </w:r>
-      <w:r>
-        <w:rPr>
-          <w:sz w:val="24"/>
-          <w:szCs w:val="24"/>
-        </w:rPr>
-        <w:t xml:space="preserve">, 2025.</w:t>
-      </w:r>
-    </w:p>
-    <w:p>
-      <w:pPr>
-        <w:rPr>
-          <w:sz w:val="24"/>
-          <w:szCs w:val="24"/>
-        </w:rPr>
-      </w:pPr>
-    </w:p>
-    <w:p>
-      <w:pPr>
-        <w:rPr>
-          <w:sz w:val="24"/>
-          <w:szCs w:val="24"/>
-        </w:rPr>
-      </w:pPr>
-      <w:r>
-        <w:rPr>
-          <w:sz w:val="24"/>
-          <w:szCs w:val="24"/>
-        </w:rPr>
-        <w:t xml:space="preserve">Hambrick, K.M., Smith, L.E., Martin, R.M., Stark, G.F., </w:t>
+        <w:t xml:space="preserve">th</w:t>
+      </w:r>
+      <w:r>
+        <w:rPr>
+          <w:sz w:val="24"/>
+          <w:szCs w:val="24"/>
+        </w:rPr>
+        <w:t xml:space="preserve"> workshop on trait-based approaches to ocean life, Knoxville, TN, January 27</w:t>
+      </w:r>
+      <w:r>
+        <w:rPr>
+          <w:sz w:val="24"/>
+          <w:szCs w:val="24"/>
+          <w:vertAlign w:val="superscript"/>
+        </w:rPr>
+        <w:t xml:space="preserve">th</w:t>
+      </w:r>
+      <w:r>
+        <w:rPr>
+          <w:sz w:val="24"/>
+          <w:szCs w:val="24"/>
+        </w:rPr>
+        <w:t xml:space="preserve">, 2022.</w:t>
+      </w:r>
+    </w:p>
+    <w:p>
+      <w:pPr>
+        <w:rPr>
+          <w:sz w:val="24"/>
+          <w:szCs w:val="24"/>
+        </w:rPr>
+      </w:pPr>
+    </w:p>
+    <w:p>
+      <w:pPr>
+        <w:rPr>
+          <w:sz w:val="24"/>
+          <w:szCs w:val="24"/>
+        </w:rPr>
+      </w:pPr>
+      <w:r>
+        <w:rPr>
+          <w:sz w:val="24"/>
+          <w:szCs w:val="24"/>
+          <w:u w:val="single"/>
+        </w:rPr>
+        <w:t xml:space="preserve">McCullough, D.K.</w:t>
+      </w:r>
+      <w:r>
+        <w:rPr>
+          <w:sz w:val="24"/>
+          <w:szCs w:val="24"/>
+        </w:rPr>
+        <w:t xml:space="preserve">, Calfee, B., Zinser, E.R., </w:t>
       </w:r>
       <w:r>
         <w:rPr>
@@ -6299,30 +7007,14 @@
           <w:sz w:val="24"/>
           <w:szCs w:val="24"/>
         </w:rPr>
-        <w:t>Talmy, D.,</w:t>
-      </w:r>
-      <w:r>
-        <w:rPr>
-          <w:sz w:val="24"/>
-          <w:szCs w:val="24"/>
-        </w:rPr>
-        <w:t xml:space="preserve"> Wilhelm, S.W., Zinser, E.R. Temperature correlates with phage resistance in </w:t>
-      </w:r>
-      <w:r>
-        <w:rPr>
-          <w:i/>
-          <w:iCs/>
-          <w:sz w:val="24"/>
-          <w:szCs w:val="24"/>
-        </w:rPr>
-        <w:t>Microcystis aeruginosa</w:t>
-      </w:r>
-      <w:r>
-        <w:rPr>
-          <w:sz w:val="24"/>
-          <w:szCs w:val="24"/>
-        </w:rPr>
-        <w:t xml:space="preserve"> NIES-298. ASLO Aquatic Sciences Meeting, Charlotte, NC, USA, March 27</w:t>
+        <w:t xml:space="preserve">Talmy, D.</w:t>
+      </w:r>
+      <w:r>
+        <w:rPr>
+          <w:sz w:val="24"/>
+          <w:szCs w:val="24"/>
+        </w:rPr>
+        <w:t xml:space="preserve"> Connecting hydrogen peroxide damage and nutrient limitation controls on marine cyanobacterial growth. 4</w:t>
       </w:r>
       <w:r>
         <w:rPr>
@@ -6330,31 +7022,61 @@
           <w:szCs w:val="24"/>
           <w:vertAlign w:val="superscript"/>
         </w:rPr>
-        <w:t>th</w:t>
-      </w:r>
-      <w:r>
-        <w:rPr>
-          <w:sz w:val="24"/>
-          <w:szCs w:val="24"/>
-        </w:rPr>
-        <w:t xml:space="preserve">, 2025.</w:t>
-      </w:r>
-    </w:p>
-    <w:p>
-      <w:pPr>
-        <w:rPr>
-          <w:sz w:val="24"/>
-          <w:szCs w:val="24"/>
-        </w:rPr>
-      </w:pPr>
-    </w:p>
-    <w:p>
-      <w:pPr>
-        <w:rPr>
-          <w:sz w:val="24"/>
-          <w:szCs w:val="24"/>
-        </w:rPr>
-      </w:pPr>
+        <w:t xml:space="preserve">th</w:t>
+      </w:r>
+      <w:r>
+        <w:rPr>
+          <w:sz w:val="24"/>
+          <w:szCs w:val="24"/>
+        </w:rPr>
+        <w:t xml:space="preserve"> workshop on trait-based approaches to ocean life, Buckinghamshire, UK, August 19</w:t>
+      </w:r>
+      <w:r>
+        <w:rPr>
+          <w:sz w:val="24"/>
+          <w:szCs w:val="24"/>
+          <w:vertAlign w:val="superscript"/>
+        </w:rPr>
+        <w:t xml:space="preserve">th</w:t>
+      </w:r>
+      <w:r>
+        <w:rPr>
+          <w:sz w:val="24"/>
+          <w:szCs w:val="24"/>
+        </w:rPr>
+        <w:t xml:space="preserve">, 2019.</w:t>
+      </w:r>
+    </w:p>
+    <w:p>
+      <w:pPr>
+        <w:rPr>
+          <w:sz w:val="24"/>
+          <w:szCs w:val="24"/>
+        </w:rPr>
+      </w:pPr>
+    </w:p>
+    <w:p>
+      <w:pPr>
+        <w:rPr>
+          <w:sz w:val="24"/>
+          <w:szCs w:val="24"/>
+        </w:rPr>
+      </w:pPr>
+      <w:r>
+        <w:rPr>
+          <w:sz w:val="24"/>
+          <w:szCs w:val="24"/>
+          <w:u w:val="single"/>
+        </w:rPr>
+        <w:t xml:space="preserve">Papoulis, S.E.</w:t>
+      </w:r>
+      <w:r>
+        <w:rPr>
+          <w:sz w:val="24"/>
+          <w:szCs w:val="24"/>
+        </w:rPr>
+        <w:t xml:space="preserve">, Wilhelm, S.W., </w:t>
+      </w:r>
       <w:r>
         <w:rPr>
           <w:b/>
@@ -6362,14 +7084,14 @@
           <w:sz w:val="24"/>
           <w:szCs w:val="24"/>
         </w:rPr>
-        <w:t xml:space="preserve">Carr, E., Rajakaruna, H., Talmy, D.</w:t>
-      </w:r>
-      <w:r>
-        <w:rPr>
-          <w:sz w:val="24"/>
-          <w:szCs w:val="24"/>
-        </w:rPr>
-        <w:t xml:space="preserve"> On the influence of mortality on microbial predator-prey relationships in the surface ocean. 5</w:t>
+        <w:t xml:space="preserve">Talmy, D.</w:t>
+      </w:r>
+      <w:r>
+        <w:rPr>
+          <w:sz w:val="24"/>
+          <w:szCs w:val="24"/>
+        </w:rPr>
+        <w:t xml:space="preserve">, Zinser, E.R. Environmental nutrients explain the distribution of restriction modification systems in prokaryotic genomes. 4</w:t>
       </w:r>
       <w:r>
         <w:rPr>
@@ -6384,7 +7106,7 @@
           <w:sz w:val="24"/>
           <w:szCs w:val="24"/>
         </w:rPr>
-        <w:t xml:space="preserve"> workshop on trait-based approaches to ocean life, Knoxville, TN, January 27</w:t>
+        <w:t xml:space="preserve"> workshop on trait-based approaches to ocean life, Buckinghamshire, UK, August 20</w:t>
       </w:r>
       <w:r>
         <w:rPr>
@@ -6399,12 +7121,13 @@
           <w:sz w:val="24"/>
           <w:szCs w:val="24"/>
         </w:rPr>
-        <w:t xml:space="preserve">, 2022.</w:t>
-      </w:r>
-    </w:p>
-    <w:p>
-      <w:pPr>
-        <w:rPr>
+        <w:t xml:space="preserve">, 2019.</w:t>
+      </w:r>
+    </w:p>
+    <w:p>
+      <w:pPr>
+        <w:rPr>
+          <w:b/>
           <w:sz w:val="24"/>
           <w:szCs w:val="24"/>
         </w:rPr>
@@ -6424,22 +7147,6 @@
           <w:sz w:val="24"/>
           <w:szCs w:val="24"/>
         </w:rPr>
-        <w:t xml:space="preserve">McCullough, D.K.</w:t>
-      </w:r>
-      <w:r>
-        <w:rPr>
-          <w:sz w:val="24"/>
-          <w:szCs w:val="24"/>
-        </w:rPr>
-        <w:t xml:space="preserve">, Calfee, B., Zinser, E.R., </w:t>
-      </w:r>
-      <w:r>
-        <w:rPr>
-          <w:b/>
-          <w:bCs/>
-          <w:sz w:val="24"/>
-          <w:szCs w:val="24"/>
-        </w:rPr>
         <w:t xml:space="preserve">Talmy, D.</w:t>
       </w:r>
       <w:r>
@@ -6447,7 +7154,7 @@
           <w:sz w:val="24"/>
           <w:szCs w:val="24"/>
         </w:rPr>
-        <w:t xml:space="preserve"> Toward a general model of the effects of exogenous reactive oxygen on bacterial community dynamics. 5</w:t>
+        <w:t xml:space="preserve">, Follett, C.L., Follows, M.J. Viral regulation of dissolved organic matter elemental composition. Viruses of Microbes Meeting, Liverpool, UK, July 19</w:t>
       </w:r>
       <w:r>
         <w:rPr>
@@ -6462,295 +7169,7 @@
           <w:sz w:val="24"/>
           <w:szCs w:val="24"/>
         </w:rPr>
-        <w:t xml:space="preserve"> workshop on trait-based approaches to ocean life, Knoxville, TN, January 27</w:t>
-      </w:r>
-      <w:r>
-        <w:rPr>
-          <w:sz w:val="24"/>
-          <w:szCs w:val="24"/>
-          <w:vertAlign w:val="superscript"/>
-        </w:rPr>
-        <w:t xml:space="preserve">th</w:t>
-      </w:r>
-      <w:r>
-        <w:rPr>
-          <w:sz w:val="24"/>
-          <w:szCs w:val="24"/>
-        </w:rPr>
-        <w:t xml:space="preserve">, 2022.</w:t>
-      </w:r>
-    </w:p>
-    <w:p>
-      <w:pPr>
-        <w:rPr>
-          <w:sz w:val="24"/>
-          <w:szCs w:val="24"/>
-        </w:rPr>
-      </w:pPr>
-    </w:p>
-    <w:p>
-      <w:pPr>
-        <w:rPr>
-          <w:sz w:val="24"/>
-          <w:szCs w:val="24"/>
-        </w:rPr>
-      </w:pPr>
-      <w:r>
-        <w:rPr>
-          <w:b/>
-          <w:bCs/>
-          <w:sz w:val="24"/>
-          <w:szCs w:val="24"/>
-        </w:rPr>
-        <w:t xml:space="preserve">Rajakaruna, H.</w:t>
-      </w:r>
-      <w:r>
-        <w:rPr>
-          <w:sz w:val="24"/>
-          <w:szCs w:val="24"/>
-        </w:rPr>
-        <w:t xml:space="preserve">, Omta, A.W., </w:t>
-      </w:r>
-      <w:r>
-        <w:rPr>
-          <w:b/>
-          <w:bCs/>
-          <w:sz w:val="24"/>
-          <w:szCs w:val="24"/>
-        </w:rPr>
-        <w:t xml:space="preserve">Carr, E., Talmy, D.</w:t>
-      </w:r>
-      <w:r>
-        <w:rPr>
-          <w:sz w:val="24"/>
-          <w:szCs w:val="24"/>
-        </w:rPr>
-        <w:t xml:space="preserve"> The power-law biomass scaling relationship in natural microbial ecosystems. 5</w:t>
-      </w:r>
-      <w:r>
-        <w:rPr>
-          <w:sz w:val="24"/>
-          <w:szCs w:val="24"/>
-          <w:vertAlign w:val="superscript"/>
-        </w:rPr>
-        <w:t xml:space="preserve">th</w:t>
-      </w:r>
-      <w:r>
-        <w:rPr>
-          <w:sz w:val="24"/>
-          <w:szCs w:val="24"/>
-        </w:rPr>
-        <w:t xml:space="preserve"> workshop on trait-based approaches to ocean life, Knoxville, TN, January 27</w:t>
-      </w:r>
-      <w:r>
-        <w:rPr>
-          <w:sz w:val="24"/>
-          <w:szCs w:val="24"/>
-          <w:vertAlign w:val="superscript"/>
-        </w:rPr>
-        <w:t xml:space="preserve">th</w:t>
-      </w:r>
-      <w:r>
-        <w:rPr>
-          <w:sz w:val="24"/>
-          <w:szCs w:val="24"/>
-        </w:rPr>
-        <w:t xml:space="preserve">, 2022.</w:t>
-      </w:r>
-    </w:p>
-    <w:p>
-      <w:pPr>
-        <w:rPr>
-          <w:sz w:val="24"/>
-          <w:szCs w:val="24"/>
-        </w:rPr>
-      </w:pPr>
-    </w:p>
-    <w:p>
-      <w:pPr>
-        <w:rPr>
-          <w:sz w:val="24"/>
-          <w:szCs w:val="24"/>
-        </w:rPr>
-      </w:pPr>
-      <w:r>
-        <w:rPr>
-          <w:b/>
-          <w:bCs/>
-          <w:sz w:val="24"/>
-          <w:szCs w:val="24"/>
-        </w:rPr>
-        <w:t xml:space="preserve">McCullough, D.K.</w:t>
-      </w:r>
-      <w:r>
-        <w:rPr>
-          <w:sz w:val="24"/>
-          <w:szCs w:val="24"/>
-        </w:rPr>
-        <w:t xml:space="preserve">, Calfee, B., Zinser, E.R., </w:t>
-      </w:r>
-      <w:r>
-        <w:rPr>
-          <w:b/>
-          <w:bCs/>
-          <w:sz w:val="24"/>
-          <w:szCs w:val="24"/>
-        </w:rPr>
-        <w:t xml:space="preserve">Talmy, D.</w:t>
-      </w:r>
-      <w:r>
-        <w:rPr>
-          <w:sz w:val="24"/>
-          <w:szCs w:val="24"/>
-        </w:rPr>
-        <w:t xml:space="preserve"> Connecting hydrogen peroxide damage and nutrient limitation controls on marine cyanobacterial growth. 4</w:t>
-      </w:r>
-      <w:r>
-        <w:rPr>
-          <w:sz w:val="24"/>
-          <w:szCs w:val="24"/>
-          <w:vertAlign w:val="superscript"/>
-        </w:rPr>
-        <w:t xml:space="preserve">th</w:t>
-      </w:r>
-      <w:r>
-        <w:rPr>
-          <w:sz w:val="24"/>
-          <w:szCs w:val="24"/>
-        </w:rPr>
-        <w:t xml:space="preserve"> workshop on trait-based approaches to ocean life, Buckinghamshire, UK, August 19</w:t>
-      </w:r>
-      <w:r>
-        <w:rPr>
-          <w:sz w:val="24"/>
-          <w:szCs w:val="24"/>
-          <w:vertAlign w:val="superscript"/>
-        </w:rPr>
-        <w:t xml:space="preserve">th</w:t>
-      </w:r>
-      <w:r>
-        <w:rPr>
-          <w:sz w:val="24"/>
-          <w:szCs w:val="24"/>
-        </w:rPr>
-        <w:t xml:space="preserve">, 2019.</w:t>
-      </w:r>
-    </w:p>
-    <w:p>
-      <w:pPr>
-        <w:rPr>
-          <w:sz w:val="24"/>
-          <w:szCs w:val="24"/>
-        </w:rPr>
-      </w:pPr>
-    </w:p>
-    <w:p>
-      <w:pPr>
-        <w:rPr>
-          <w:sz w:val="24"/>
-          <w:szCs w:val="24"/>
-        </w:rPr>
-      </w:pPr>
-      <w:r>
-        <w:rPr>
-          <w:b/>
-          <w:bCs/>
-          <w:sz w:val="24"/>
-          <w:szCs w:val="24"/>
-        </w:rPr>
-        <w:t xml:space="preserve">Papoulis, S.E.</w:t>
-      </w:r>
-      <w:r>
-        <w:rPr>
-          <w:sz w:val="24"/>
-          <w:szCs w:val="24"/>
-        </w:rPr>
-        <w:t xml:space="preserve">, Wilhelm, S.W., </w:t>
-      </w:r>
-      <w:r>
-        <w:rPr>
-          <w:b/>
-          <w:bCs/>
-          <w:sz w:val="24"/>
-          <w:szCs w:val="24"/>
-        </w:rPr>
-        <w:t xml:space="preserve">Talmy, D.</w:t>
-      </w:r>
-      <w:r>
-        <w:rPr>
-          <w:sz w:val="24"/>
-          <w:szCs w:val="24"/>
-        </w:rPr>
-        <w:t xml:space="preserve">, Zinser, E.R. Environmental nutrients explain the distribution of restriction modification systems in prokaryotic genomes. 4</w:t>
-      </w:r>
-      <w:r>
-        <w:rPr>
-          <w:sz w:val="24"/>
-          <w:szCs w:val="24"/>
-          <w:vertAlign w:val="superscript"/>
-        </w:rPr>
-        <w:t xml:space="preserve">th</w:t>
-      </w:r>
-      <w:r>
-        <w:rPr>
-          <w:sz w:val="24"/>
-          <w:szCs w:val="24"/>
-        </w:rPr>
-        <w:t xml:space="preserve"> workshop on trait-based approaches to ocean life, Buckinghamshire, UK, August 20</w:t>
-      </w:r>
-      <w:r>
-        <w:rPr>
-          <w:sz w:val="24"/>
-          <w:szCs w:val="24"/>
-          <w:vertAlign w:val="superscript"/>
-        </w:rPr>
-        <w:t xml:space="preserve">th</w:t>
-      </w:r>
-      <w:r>
-        <w:rPr>
-          <w:sz w:val="24"/>
-          <w:szCs w:val="24"/>
-        </w:rPr>
-        <w:t xml:space="preserve">, 2019.</w:t>
-      </w:r>
-    </w:p>
-    <w:p>
-      <w:pPr>
-        <w:rPr>
-          <w:b/>
-          <w:sz w:val="24"/>
-          <w:szCs w:val="24"/>
-        </w:rPr>
-      </w:pPr>
-    </w:p>
-    <w:p>
-      <w:pPr>
-        <w:rPr>
-          <w:sz w:val="24"/>
-          <w:szCs w:val="24"/>
-        </w:rPr>
-      </w:pPr>
-      <w:r>
-        <w:rPr>
-          <w:sz w:val="24"/>
-          <w:szCs w:val="24"/>
-        </w:rPr>
-        <w:t>Talmy, D., Follett, C.L., Follows, M.J. Viral regulation of dissolved organic matter elemental composition. Viruses of Microbes Meeting, Liverpool, UK, July 19</w:t>
-      </w:r>
-      <w:r>
-        <w:rPr>
-          <w:sz w:val="24"/>
-          <w:szCs w:val="24"/>
-          <w:vertAlign w:val="superscript"/>
-        </w:rPr>
-        <w:t>th</w:t>
-      </w:r>
-      <w:r>
-        <w:rPr>
-          <w:sz w:val="24"/>
-          <w:szCs w:val="24"/>
-        </w:rPr>
-        <w:t>, 2016.</w:t>
+        <w:t xml:space="preserve">, 2016.</w:t>
       </w:r>
     </w:p>
     <w:p>

</xml_diff>